<commit_message>
fix: corrigir pós-processamento de assinatura e validação do template
Evita mistura de nome com cargo/CREA no XML final e corrige a preparação do template para não corromper células/tabelas. Também melhora a verificação do template para detectar ausência de arquivo e validar marcadores usados no pós-processamento.

Made-with: Cursor
</commit_message>
<xml_diff>
--- a/template/template.docx
+++ b/template/template.docx
@@ -1,311 +1,6 @@
 
-<file path=word/document.xml><?xml version="1.0" encoding="utf-8"?>
-<w:document xmlns:wpc="http://schemas.microsoft.com/office/word/2010/wordprocessingCanvas" xmlns:cx="http://schemas.microsoft.com/office/drawing/2014/chartex" xmlns:cx1="http://schemas.microsoft.com/office/drawing/2015/9/8/chartex" xmlns:cx2="http://schemas.microsoft.com/office/drawing/2015/10/21/chartex" xmlns:cx3="http://schemas.microsoft.com/office/drawing/2016/5/9/chartex" xmlns:cx4="http://schemas.microsoft.com/office/drawing/2016/5/10/chartex" xmlns:cx5="http://schemas.microsoft.com/office/drawing/2016/5/11/chartex" xmlns:cx6="http://schemas.microsoft.com/office/drawing/2016/5/12/chartex" xmlns:cx7="http://schemas.microsoft.com/office/drawing/2016/5/13/chartex" xmlns:cx8="http://schemas.microsoft.com/office/drawing/2016/5/14/chartex" xmlns:mc="http://schemas.openxmlformats.org/markup-compatibility/2006" xmlns:aink="http://schemas.microsoft.com/office/drawing/2016/ink" xmlns:am3d="http://schemas.microsoft.com/office/drawing/2017/model3d" xmlns:o="urn:schemas-microsoft-com:office:office" xmlns:oel="http://schemas.microsoft.com/office/2019/extlst" xmlns:r="http://schemas.openxmlformats.org/officeDocument/2006/relationships" xmlns:m="http://schemas.openxmlformats.org/officeDocument/2006/math" xmlns:v="urn:schemas-microsoft-com:vml" xmlns:wp14="http://schemas.microsoft.com/office/word/2010/wordprocessingDrawing" xmlns:wp="http://schemas.openxmlformats.org/drawingml/2006/wordprocessingDrawing" xmlns:w10="urn:schemas-microsoft-com:office:word" xmlns:w="http://schemas.openxmlformats.org/wordprocessingml/2006/main" xmlns:w14="http://schemas.microsoft.com/office/word/2010/wordml" xmlns:w15="http://schemas.microsoft.com/office/word/2012/wordml" xmlns:w16cex="http://schemas.microsoft.com/office/word/2018/wordml/cex" xmlns:w16cid="http://schemas.microsoft.com/office/word/2016/wordml/cid" xmlns:w16="http://schemas.microsoft.com/office/word/2018/wordml" xmlns:w16du="http://schemas.microsoft.com/office/word/2023/wordml/word16du" xmlns:w16sdtdh="http://schemas.microsoft.com/office/word/2020/wordml/sdtdatahash" xmlns:w16sdtfl="http://schemas.microsoft.com/office/word/2024/wordml/sdtformatlock" xmlns:w16se="http://schemas.microsoft.com/office/word/2015/wordml/symex" xmlns:wpg="http://schemas.microsoft.com/office/word/2010/wordprocessingGroup" xmlns:wpi="http://schemas.microsoft.com/office/word/2010/wordprocessingInk" xmlns:wne="http://schemas.microsoft.com/office/word/2006/wordml" xmlns:wps="http://schemas.microsoft.com/office/word/2010/wordprocessingShape" mc:Ignorable="w14 w15 w16se w16cid w16 w16cex w16sdtdh w16sdtfl w16du wp14">
-  <w:body>
-    <w:p/>
-    <w:p/>
-    <w:p/>
-    <w:p/>
-    <w:p>
-      <w:pPr>
-        <w:spacing w:after="20"/>
-        <w:ind w:right="6"/>
-        <w:rPr>
-          <w:rFonts w:ascii="Arial" w:hAnsi="Arial" w:cs="Arial"/>
-        </w:rPr>
-      </w:pPr>
-    </w:p>
-    <w:p>
-      <w:pPr>
-        <w:spacing w:after="20"/>
-        <w:ind w:right="6"/>
-        <w:rPr>
-          <w:rFonts w:ascii="Arial" w:hAnsi="Arial" w:cs="Arial"/>
-        </w:rPr>
-      </w:pPr>
-    </w:p>
-    <w:p>
-      <w:pPr>
-        <w:spacing w:after="20"/>
-        <w:ind w:left="60" w:right="6"/>
-        <w:rPr>
-          <w:rFonts w:ascii="Arial" w:hAnsi="Arial" w:cs="Arial"/>
-        </w:rPr>
-      </w:pPr>
-    </w:p>
-    <w:p>
-      <w:pPr>
-        <w:spacing w:after="20"/>
-        <w:ind w:left="60" w:right="6"/>
-        <w:rPr>
-          <w:rFonts w:ascii="Arial" w:hAnsi="Arial" w:cs="Arial"/>
-        </w:rPr>
-      </w:pPr>
-      <w:r>
-        <w:rPr>
-          <w:rFonts w:ascii="Arial" w:hAnsi="Arial" w:cs="Arial"/>
-        </w:rPr>
-        <w:t xml:space="preserve">  </w:t>
-      </w:r>
-      <w:r>
-        <w:rPr>
-          <w:rFonts w:ascii="Arial" w:hAnsi="Arial" w:cs="Arial"/>
-        </w:rPr>
-        <w:t xml:space="preserve">  </w:t>
-      </w:r>
-      <w:r>
-        <w:rPr>
-          <w:rFonts w:ascii="Arial" w:hAnsi="Arial" w:cs="Arial"/>
-        </w:rPr>
-        <w:t xml:space="preserve">Responsável pela Inspeção                       </w:t>
-      </w:r>
-      <w:r>
-        <w:rPr>
-          <w:rFonts w:ascii="Arial" w:hAnsi="Arial" w:cs="Arial"/>
-        </w:rPr>
-        <w:t xml:space="preserve">                 Engenheiro</w:t>
-      </w:r>
-      <w:r>
-        <w:rPr>
-          <w:rFonts w:ascii="Arial" w:hAnsi="Arial" w:cs="Arial"/>
-        </w:rPr>
-        <w:t xml:space="preserve"> </w:t>
-      </w:r>
-      <w:r>
-        <w:rPr>
-          <w:rFonts w:ascii="Arial" w:hAnsi="Arial" w:cs="Arial"/>
-        </w:rPr>
-        <w:t>Responsá</w:t>
-      </w:r>
-      <w:r>
-        <w:rPr>
-          <w:rFonts w:ascii="Arial" w:hAnsi="Arial" w:cs="Arial"/>
-        </w:rPr>
-        <w:t>vel</w:t>
-      </w:r>
-    </w:p>
-    <w:p>
-      <w:pPr>
-        <w:spacing w:after="0"/>
-        <w:rPr>
-          <w:rFonts w:ascii="Arial" w:hAnsi="Arial" w:cs="Arial"/>
-        </w:rPr>
-      </w:pPr>
-      <w:r>
-        <w:rPr>
-          <w:rFonts w:ascii="Arial" w:hAnsi="Arial" w:cs="Arial"/>
-        </w:rPr>
-        <w:t xml:space="preserve">      </w:t>
-      </w:r>
-      <w:r>
-        <w:rPr>
-          <w:rFonts w:ascii="Arial" w:hAnsi="Arial" w:cs="Arial"/>
-        </w:rPr>
-        <w:t xml:space="preserve">          Elton Vie</w:t>
-      </w:r>
-      <w:r>
-        <w:rPr>
-          <w:rFonts w:ascii="Arial" w:hAnsi="Arial" w:cs="Arial"/>
-        </w:rPr>
-        <w:t>i</w:t>
-      </w:r>
-      <w:r>
-        <w:rPr>
-          <w:rFonts w:ascii="Arial" w:hAnsi="Arial" w:cs="Arial"/>
-        </w:rPr>
-        <w:t>ra</w:t>
-      </w:r>
-      <w:r>
-        <w:rPr>
-          <w:rFonts w:ascii="Arial" w:hAnsi="Arial" w:cs="Arial"/>
-        </w:rPr>
-        <w:t xml:space="preserve">                                              </w:t>
-      </w:r>
-      <w:r>
-        <w:rPr>
-          <w:rFonts w:ascii="Arial" w:hAnsi="Arial" w:cs="Arial"/>
-        </w:rPr>
-        <w:t xml:space="preserve">        </w:t>
-      </w:r>
-      <w:r>
-        <w:rPr>
-          <w:rFonts w:ascii="Arial" w:hAnsi="Arial" w:cs="Arial"/>
-        </w:rPr>
-        <w:t xml:space="preserve"> Diego Aparecido de Lima </w:t>
-      </w:r>
-    </w:p>
-    <w:p>
-      <w:pPr>
-        <w:rPr>
-          <w:rFonts w:ascii="Arial" w:hAnsi="Arial" w:cs="Arial"/>
-          <w:b/>
-          <w:bCs/>
-        </w:rPr>
-      </w:pPr>
-      <w:r>
-        <w:rPr>
-          <w:rFonts w:ascii="Arial" w:hAnsi="Arial" w:cs="Arial"/>
-        </w:rPr>
-        <w:t xml:space="preserve"> </w:t>
-      </w:r>
-      <w:r>
-        <w:rPr>
-          <w:rFonts w:ascii="Arial" w:hAnsi="Arial" w:cs="Arial"/>
-        </w:rPr>
-        <w:t xml:space="preserve">  </w:t>
-      </w:r>
-      <w:r>
-        <w:rPr>
-          <w:rFonts w:ascii="Arial" w:hAnsi="Arial" w:cs="Arial"/>
-        </w:rPr>
-        <w:t xml:space="preserve"> </w:t>
-      </w:r>
-      <w:r>
-        <w:rPr>
-          <w:rFonts w:ascii="Arial" w:hAnsi="Arial" w:cs="Arial"/>
-        </w:rPr>
-        <w:t>Encarregado Operacional</w:t>
-      </w:r>
-      <w:r>
-        <w:rPr>
-          <w:rFonts w:ascii="Arial" w:hAnsi="Arial" w:cs="Arial"/>
-        </w:rPr>
-        <w:t xml:space="preserve">          </w:t>
-      </w:r>
-      <w:r>
-        <w:rPr>
-          <w:rFonts w:ascii="Arial" w:hAnsi="Arial" w:cs="Arial"/>
-        </w:rPr>
-        <w:t xml:space="preserve">       </w:t>
-      </w:r>
-      <w:r>
-        <w:rPr>
-          <w:rFonts w:ascii="Arial" w:hAnsi="Arial" w:cs="Arial"/>
-        </w:rPr>
-        <w:t xml:space="preserve">      </w:t>
-      </w:r>
-      <w:r>
-        <w:rPr>
-          <w:rFonts w:ascii="Arial" w:hAnsi="Arial" w:cs="Arial"/>
-        </w:rPr>
-        <w:t xml:space="preserve"> </w:t>
-      </w:r>
-      <w:r>
-        <w:rPr>
-          <w:rFonts w:ascii="Arial" w:hAnsi="Arial" w:cs="Arial"/>
-        </w:rPr>
-        <w:t xml:space="preserve">  </w:t>
-      </w:r>
-      <w:r>
-        <w:rPr>
-          <w:rFonts w:ascii="Arial" w:hAnsi="Arial" w:cs="Arial"/>
-        </w:rPr>
-        <w:t xml:space="preserve"> </w:t>
-      </w:r>
-      <w:r>
-        <w:rPr>
-          <w:rFonts w:ascii="Arial" w:hAnsi="Arial" w:cs="Arial"/>
-        </w:rPr>
-        <w:t>Engenheiro Mecânico</w:t>
-      </w:r>
-      <w:r>
-        <w:rPr>
-          <w:rFonts w:ascii="Arial" w:hAnsi="Arial" w:cs="Arial"/>
-        </w:rPr>
-        <w:t xml:space="preserve"> – </w:t>
-      </w:r>
-      <w:r>
-        <w:rPr>
-          <w:rFonts w:ascii="Arial" w:hAnsi="Arial" w:cs="Arial"/>
-          <w:b/>
-          <w:bCs/>
-        </w:rPr>
-        <w:t>CREA:506.927.6941-S</w:t>
-      </w:r>
-    </w:p>
-    <w:p>
-      <w:pPr>
-        <w:rPr>
-          <w:rFonts w:ascii="Arial" w:hAnsi="Arial" w:cs="Arial"/>
-        </w:rPr>
-      </w:pPr>
-    </w:p>
-    <w:p>
-      <w:pPr>
-        <w:ind w:right="-111"/>
-        <w:rPr>
-          <w:rFonts w:ascii="Times New Roman" w:hAnsi="Times New Roman" w:cs="Times New Roman"/>
-        </w:rPr>
-      </w:pPr>
-      <w:r>
-        <w:rPr>
-          <w:rFonts w:ascii="Times New Roman" w:hAnsi="Times New Roman" w:cs="Times New Roman"/>
-        </w:rPr>
-        <w:t xml:space="preserve">                                                  </w:t>
-      </w:r>
-      <w:r>
-        <w:rPr>
-          <w:rFonts w:ascii="Times New Roman" w:hAnsi="Times New Roman" w:cs="Times New Roman"/>
-        </w:rPr>
-        <w:t xml:space="preserve">Cubatão, </w:t>
-      </w:r>
-      <w:r>
-        <w:rPr>
-          <w:rFonts w:ascii="Times New Roman" w:hAnsi="Times New Roman" w:cs="Times New Roman"/>
-        </w:rPr>
-        <w:t>1</w:t>
-      </w:r>
-      <w:r>
-        <w:rPr>
-          <w:rFonts w:ascii="Times New Roman" w:hAnsi="Times New Roman" w:cs="Times New Roman"/>
-        </w:rPr>
-        <w:t>7</w:t>
-      </w:r>
-      <w:r>
-        <w:rPr>
-          <w:rFonts w:ascii="Times New Roman" w:hAnsi="Times New Roman" w:cs="Times New Roman"/>
-        </w:rPr>
-        <w:t xml:space="preserve"> de </w:t>
-      </w:r>
-      <w:r>
-        <w:rPr>
-          <w:rFonts w:ascii="Times New Roman" w:hAnsi="Times New Roman" w:cs="Times New Roman"/>
-        </w:rPr>
-        <w:t>Março</w:t>
-      </w:r>
-      <w:r>
-        <w:rPr>
-          <w:rFonts w:ascii="Times New Roman" w:hAnsi="Times New Roman" w:cs="Times New Roman"/>
-        </w:rPr>
-        <w:t xml:space="preserve"> </w:t>
-      </w:r>
-      <w:r>
-        <w:rPr>
-          <w:rFonts w:ascii="Times New Roman" w:hAnsi="Times New Roman" w:cs="Times New Roman"/>
-        </w:rPr>
-        <w:t>de 202</w:t>
-      </w:r>
-      <w:bookmarkEnd w:id="2"/>
-      <w:r>
-        <w:rPr>
-          <w:rFonts w:ascii="Times New Roman" w:hAnsi="Times New Roman" w:cs="Times New Roman"/>
-        </w:rPr>
-        <w:t>6</w:t>
-      </w:r>
-    </w:p>
-    <w:sectPr>
-      <w:headerReference w:type="default" r:id="rId25"/>
-      <w:footerReference w:type="default" r:id="rId26"/>
-      <w:headerReference w:type="first" r:id="rId27"/>
-      <w:pgSz w:w="11906" w:h="16838"/>
-      <w:pgMar w:top="156" w:right="1133" w:bottom="1134" w:left="1701" w:header="397" w:footer="283" w:gutter="0"/>
-      <w:pgNumType w:start="0"/>
-      <w:cols w:space="708"/>
-      <w:titlePg/>
-      <w:docGrid w:linePitch="360"/>
-    </w:sectPr>
-  </w:body>
-</w:document>
+<file path=word/document.xml><?xml version="1.0" encoding="UTF-8" standalone="yes"?>
+<w:document xmlns:wpc="http://schemas.microsoft.com/office/word/2010/wordprocessingCanvas" xmlns:cx="http://schemas.microsoft.com/office/drawing/2014/chartex" xmlns:cx1="http://schemas.microsoft.com/office/drawing/2015/9/8/chartex" xmlns:cx2="http://schemas.microsoft.com/office/drawing/2015/10/21/chartex" xmlns:cx3="http://schemas.microsoft.com/office/drawing/2016/5/9/chartex" xmlns:cx4="http://schemas.microsoft.com/office/drawing/2016/5/10/chartex" xmlns:cx5="http://schemas.microsoft.com/office/drawing/2016/5/11/chartex" xmlns:cx6="http://schemas.microsoft.com/office/drawing/2016/5/12/chartex" xmlns:cx7="http://schemas.microsoft.com/office/drawing/2016/5/13/chartex" xmlns:cx8="http://schemas.microsoft.com/office/drawing/2016/5/14/chartex" xmlns:mc="http://schemas.openxmlformats.org/markup-compatibility/2006" xmlns:aink="http://schemas.microsoft.com/office/drawing/2016/ink" xmlns:am3d="http://schemas.microsoft.com/office/drawing/2017/model3d" xmlns:o="urn:schemas-microsoft-com:office:office" xmlns:oel="http://schemas.microsoft.com/office/2019/extlst" xmlns:r="http://schemas.openxmlformats.org/officeDocument/2006/relationships" xmlns:m="http://schemas.openxmlformats.org/officeDocument/2006/math" xmlns:v="urn:schemas-microsoft-com:vml" xmlns:wp14="http://schemas.microsoft.com/office/word/2010/wordprocessingDrawing" xmlns:wp="http://schemas.openxmlformats.org/drawingml/2006/wordprocessingDrawing" xmlns:w10="urn:schemas-microsoft-com:office:word" xmlns:w="http://schemas.openxmlformats.org/wordprocessingml/2006/main" xmlns:w14="http://schemas.microsoft.com/office/word/2010/wordml" xmlns:w15="http://schemas.microsoft.com/office/word/2012/wordml" xmlns:w16cex="http://schemas.microsoft.com/office/word/2018/wordml/cex" xmlns:w16cid="http://schemas.microsoft.com/office/word/2016/wordml/cid" xmlns:w16="http://schemas.microsoft.com/office/word/2018/wordml" xmlns:w16du="http://schemas.microsoft.com/office/word/2023/wordml/word16du" xmlns:w16sdtdh="http://schemas.microsoft.com/office/word/2020/wordml/sdtdatahash" xmlns:w16sdtfl="http://schemas.microsoft.com/office/word/2024/wordml/sdtformatlock" xmlns:w16se="http://schemas.microsoft.com/office/word/2015/wordml/symex" xmlns:wpg="http://schemas.microsoft.com/office/word/2010/wordprocessingGroup" xmlns:wpi="http://schemas.microsoft.com/office/word/2010/wordprocessingInk" xmlns:wne="http://schemas.microsoft.com/office/word/2006/wordml" xmlns:wps="http://schemas.microsoft.com/office/word/2010/wordprocessingShape" mc:Ignorable="w14 w15 w16se w16cid w16 w16cex w16sdtdh w16sdtfl w16du wp14"><w:body><w:p/><w:p/><w:p/><w:p><w:r><w:rPr><w:noProof/><w:lang w:eastAsia="pt-BR"/></w:rPr><mc:AlternateContent><mc:Choice Requires="wps"><w:drawing><wp:anchor distT="0" distB="0" distL="114300" distR="114300" simplePos="0" relativeHeight="251658240" behindDoc="0" locked="0" layoutInCell="1" allowOverlap="1" wp14:anchorId="661175B5" wp14:editId="7BD78647"><wp:simplePos x="0" y="0"/><wp:positionH relativeFrom="page"><wp:posOffset>542925</wp:posOffset></wp:positionH><wp:positionV relativeFrom="paragraph"><wp:posOffset>124460</wp:posOffset></wp:positionV><wp:extent cx="6459220" cy="800100"/><wp:effectExtent l="0" t="0" r="0" b="0"/><wp:wrapNone/><wp:docPr id="46" name="Caixa de Texto 46"/><wp:cNvGraphicFramePr><a:graphicFrameLocks xmlns:a="http://schemas.openxmlformats.org/drawingml/2006/main"/></wp:cNvGraphicFramePr><a:graphic xmlns:a="http://schemas.openxmlformats.org/drawingml/2006/main"><a:graphicData uri="http://schemas.microsoft.com/office/word/2010/wordprocessingShape"><wps:wsp><wps:cNvSpPr txBox="1"><a:spLocks noChangeArrowheads="1"/></wps:cNvSpPr><wps:spPr bwMode="auto"><a:xfrm><a:off x="0" y="0"/><a:ext cx="6459220" cy="800100"/></a:xfrm><a:prstGeom prst="rect"><a:avLst/></a:prstGeom><a:noFill/><a:ln><a:noFill/></a:ln><a:extLst><a:ext uri="{909E8E84-426E-40dd-AFC4-6F175D3DCCD1}"><a14:hiddenFill xmlns:o="urn:schemas-microsoft-com:office:office" xmlns:v="urn:schemas-microsoft-com:vml" xmlns:w10="urn:schemas-microsoft-com:office:word" xmlns:w="http://schemas.openxmlformats.org/wordprocessingml/2006/main" xmlns:a14="http://schemas.microsoft.com/office/drawing/2010/main" xmlns=""><a:solidFill><a:srgbClr val="FFFFFF"/></a:solidFill></a14:hiddenFill></a:ext><a:ext uri="{91240B29-F687-4f45-9708-019B960494DF}"><a14:hiddenLine xmlns:o="urn:schemas-microsoft-com:office:office" xmlns:v="urn:schemas-microsoft-com:vml" xmlns:w10="urn:schemas-microsoft-com:office:word" xmlns:w="http://schemas.openxmlformats.org/wordprocessingml/2006/main" xmlns:a14="http://schemas.microsoft.com/office/drawing/2010/main" xmlns="" w="9525"><a:solidFill><a:srgbClr val="000000"/></a:solidFill><a:miter lim="800000"/><a:headEnd/><a:tailEnd/></a14:hiddenLine></a:ext></a:extLst></wps:spPr><wps:txbx><w:txbxContent><w:p><w:pPr><w:jc w:val="center"/><w:rPr><w:rFonts w:ascii="Times New Roman" w:hAnsi="Times New Roman" w:cs="Times New Roman"/><w:b/><w:bCs/><w:sz w:val="44"/><w:szCs w:val="44"/></w:rPr></w:pPr><w:r><w:rPr><w:rFonts w:ascii="Times New Roman" w:hAnsi="Times New Roman" w:cs="Times New Roman"/><w:b/><w:bCs/><w:sz w:val="44"/><w:szCs w:val="44"/></w:rPr><w:t xml:space="preserve">RELATÓRIO DE </w:t></w:r><w:r><w:rPr><w:rFonts w:ascii="Times New Roman" w:hAnsi="Times New Roman" w:cs="Times New Roman"/><w:b/><w:bCs/><w:sz w:val="44"/><w:szCs w:val="44"/></w:rPr><w:t>INSPEÇÃO VISUAL</w:t></w:r></w:p></w:txbxContent></wps:txbx><wps:bodyPr rot="0" vert="horz" wrap="square" lIns="91440" tIns="45720" rIns="91440" bIns="45720" anchor="t" anchorCtr="0" upright="1"><a:noAutofit/></wps:bodyPr></wps:wsp></a:graphicData></a:graphic><wp14:sizeRelH relativeFrom="page"><wp14:pctWidth>0</wp14:pctWidth></wp14:sizeRelH><wp14:sizeRelV relativeFrom="page"><wp14:pctHeight>0</wp14:pctHeight></wp14:sizeRelV></wp:anchor></w:drawing></mc:Choice><mc:Fallback><w:pict><v:shapetype w14:anchorId="661175B5" id="_x0000_t202" coordsize="21600,21600" o:spt="202" path="m,l,21600r21600,l21600,xe"><v:stroke joinstyle="miter"/><v:path gradientshapeok="t" o:connecttype="rect"/></v:shapetype><v:shape id="Caixa de Texto 46" o:spid="_x0000_s1026" type="#_x0000_t202" style="position:absolute;margin-left:42.75pt;margin-top:9.8pt;width:508.6pt;height:63pt;z-index:251658240;visibility:visible;mso-wrap-style:square;mso-width-percent:0;mso-height-percent:0;mso-wrap-distance-left:9pt;mso-wrap-distance-top:0;mso-wrap-distance-right:9pt;mso-wrap-distance-bottom:0;mso-position-horizontal:absolute;mso-position-horizontal-relative:page;mso-position-vertical:absolute;mso-position-vertical-relative:text;mso-width-percent:0;mso-height-percent:0;mso-width-relative:page;mso-height-relative:page;v-text-anchor:top" o:gfxdata="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" filled="f" stroked="f"><v:textbox><w:txbxContent><w:p><w:pPr><w:jc w:val="center"/><w:rPr><w:rFonts w:ascii="Times New Roman" w:hAnsi="Times New Roman" w:cs="Times New Roman"/><w:b/><w:bCs/><w:sz w:val="44"/><w:szCs w:val="44"/></w:rPr></w:pPr><w:r><w:rPr><w:rFonts w:ascii="Times New Roman" w:hAnsi="Times New Roman" w:cs="Times New Roman"/><w:b/><w:bCs/><w:sz w:val="44"/><w:szCs w:val="44"/></w:rPr><w:t xml:space="preserve">RELATÓRIO DE </w:t></w:r><w:r><w:rPr><w:rFonts w:ascii="Times New Roman" w:hAnsi="Times New Roman" w:cs="Times New Roman"/><w:b/><w:bCs/><w:sz w:val="44"/><w:szCs w:val="44"/></w:rPr><w:t>INSPEÇÃO VISUAL</w:t></w:r></w:p></w:txbxContent></v:textbox><w10:wrap anchorx="page"/></v:shape></w:pict></mc:Fallback></mc:AlternateContent></w:r></w:p><w:p/><w:p/><w:p/><w:p/><w:p/><w:p><w:r><w:rPr><w:noProof/></w:rPr><mc:AlternateContent><mc:Choice Requires="wps"><w:drawing><wp:anchor distT="0" distB="0" distL="114300" distR="114300" simplePos="0" relativeHeight="251658241" behindDoc="0" locked="0" layoutInCell="1" allowOverlap="1" wp14:anchorId="300790B6" wp14:editId="71BD1886"><wp:simplePos x="0" y="0"/><wp:positionH relativeFrom="column"><wp:posOffset>-693928</wp:posOffset></wp:positionH><wp:positionV relativeFrom="paragraph"><wp:posOffset>304648</wp:posOffset></wp:positionV><wp:extent cx="494538" cy="3774262"/><wp:effectExtent l="0" t="0" r="20320" b="17145"/><wp:wrapNone/><wp:docPr id="2" name="Retângulo 2"/><wp:cNvGraphicFramePr/><a:graphic xmlns:a="http://schemas.openxmlformats.org/drawingml/2006/main"><a:graphicData uri="http://schemas.microsoft.com/office/word/2010/wordprocessingShape"><wps:wsp><wps:cNvSpPr/><wps:spPr><a:xfrm><a:off x="0" y="0"/><a:ext cx="494538" cy="3774262"/></a:xfrm><a:prstGeom prst="rect"><a:avLst/></a:prstGeom><a:solidFill><a:srgbClr val="1B407E"/></a:solidFill><a:ln><a:solidFill><a:srgbClr val="1B407E"/></a:solidFill></a:ln></wps:spPr><wps:style><a:lnRef idx="2"><a:schemeClr val="accent1"><a:shade val="50000"/></a:schemeClr></a:lnRef><a:fillRef idx="1"><a:schemeClr val="accent1"/></a:fillRef><a:effectRef idx="0"><a:schemeClr val="accent1"/></a:effectRef><a:fontRef idx="minor"><a:schemeClr val="lt1"/></a:fontRef></wps:style><wps:bodyPr rot="0" spcFirstLastPara="0" vertOverflow="overflow" horzOverflow="overflow" vert="horz" wrap="square" lIns="91440" tIns="45720" rIns="91440" bIns="45720" numCol="1" spcCol="0" rtlCol="0" fromWordArt="0" anchor="ctr" anchorCtr="0" forceAA="0" compatLnSpc="1"><a:prstTxWarp prst="textNoShape"><a:avLst/></a:prstTxWarp><a:noAutofit/></wps:bodyPr></wps:wsp></a:graphicData></a:graphic><wp14:sizeRelH relativeFrom="margin"><wp14:pctWidth>0</wp14:pctWidth></wp14:sizeRelH><wp14:sizeRelV relativeFrom="margin"><wp14:pctHeight>0</wp14:pctHeight></wp14:sizeRelV></wp:anchor></w:drawing></mc:Choice><mc:Fallback><w:pict><v:rect w14:anchorId="3F00F125" id="Retângulo 2" o:spid="_x0000_s1026" style="position:absolute;margin-left:-54.65pt;margin-top:24pt;width:38.95pt;height:297.2pt;z-index:251658241;visibility:visible;mso-wrap-style:square;mso-width-percent:0;mso-height-percent:0;mso-wrap-distance-left:9pt;mso-wrap-distance-top:0;mso-wrap-distance-right:9pt;mso-wrap-distance-bottom:0;mso-position-horizontal:absolute;mso-position-horizontal-relative:text;mso-position-vertical:absolute;mso-position-vertical-relative:text;mso-width-percent:0;mso-height-percent:0;mso-width-relative:margin;mso-height-relative:margin;v-text-anchor:middle" o:gfxdata="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" fillcolor="#1b407e" strokecolor="#1b407e" strokeweight="2pt"/></w:pict></mc:Fallback></mc:AlternateContent></w:r></w:p><w:p/><w:tbl><w:tblPr><w:tblStyle w:val="Tabelacomgrade"/><w:tblW w:w="9639" w:type="dxa"/><w:tblBorders><w:top w:val="none" w:sz="0" w:space="0" w:color="auto"/><w:left w:val="none" w:sz="0" w:space="0" w:color="auto"/><w:bottom w:val="none" w:sz="0" w:space="0" w:color="auto"/><w:right w:val="none" w:sz="0" w:space="0" w:color="auto"/><w:insideH w:val="none" w:sz="0" w:space="0" w:color="auto"/><w:insideV w:val="none" w:sz="0" w:space="0" w:color="auto"/></w:tblBorders><w:tblLook w:val="04A0" w:firstRow="1" w:lastRow="0" w:firstColumn="1" w:lastColumn="0" w:noHBand="0" w:noVBand="1"/></w:tblPr><w:tblGrid><w:gridCol w:w="2848"/><w:gridCol w:w="312"/><w:gridCol w:w="6479"/></w:tblGrid><w:tr><w:trPr><w:trHeight w:val="614"/></w:trPr><w:tc><w:tcPr><w:tcW w:w="2529" w:type="dxa"/><w:vAlign w:val="center"/></w:tcPr><w:p><w:pPr><w:pStyle w:val="SemEspaamento"/><w:rPr><w:rFonts w:ascii="Times New Roman" w:hAnsi="Times New Roman" w:cs="Times New Roman"/><w:b/><w:bCs/><w:sz w:val="32"/><w:szCs w:val="32"/></w:rPr></w:pPr><w:r><w:rPr><w:rFonts w:ascii="Times New Roman" w:hAnsi="Times New Roman" w:cs="Times New Roman"/><w:b/><w:bCs/><w:sz w:val="32"/><w:szCs w:val="32"/></w:rPr><w:t>IDENTIFICAÇÃO</w:t></w:r></w:p></w:tc><w:tc><w:tcPr><w:tcW w:w="313" w:type="dxa"/><w:vAlign w:val="center"/></w:tcPr><w:p><w:pPr><w:pStyle w:val="SemEspaamento"/><w:rPr><w:rFonts w:ascii="Times New Roman" w:hAnsi="Times New Roman" w:cs="Times New Roman"/><w:sz w:val="32"/><w:szCs w:val="32"/></w:rPr></w:pPr><w:r><w:rPr><w:rFonts w:ascii="Times New Roman" w:hAnsi="Times New Roman" w:cs="Times New Roman"/><w:sz w:val="32"/><w:szCs w:val="32"/></w:rPr><w:t>:</w:t></w:r></w:p></w:tc><w:tc><w:tcPr><w:tcW w:w="6797" w:type="dxa"/><w:vAlign w:val="center"/></w:tcPr><w:p><w:pPr><w:pStyle w:val="SemEspaamento"/><w:rPr><w:rFonts w:ascii="Times New Roman" w:hAnsi="Times New Roman" w:cs="Times New Roman"/><w:bCs/><w:iCs/><w:sz w:val="32"/><w:szCs w:val="32"/></w:rPr></w:pPr><w:r><w:rPr><w:rFonts w:ascii="Times New Roman" w:hAnsi="Times New Roman" w:cs="Times New Roman"/><w:bCs/><w:iCs/><w:sz w:val="32"/><w:szCs w:val="32"/></w:rPr><w:t>{numero_identificacao}</w:t></w:r></w:p></w:tc>/w:tr><w:tr><w:trPr><w:trHeight w:val="1114"/></w:trPr><w:tc><w:tcPr><w:tcW w:w="2529" w:type="dxa"/><w:vAlign w:val="center"/></w:tcPr><w:p><w:pPr><w:pStyle w:val="SemEspaamento"/><w:rPr><w:rFonts w:ascii="Times New Roman" w:hAnsi="Times New Roman" w:cs="Times New Roman"/><w:b/><w:bCs/><w:sz w:val="32"/><w:szCs w:val="32"/></w:rPr></w:pPr><w:r><w:rPr><w:rFonts w:ascii="Times New Roman" w:hAnsi="Times New Roman" w:cs="Times New Roman"/><w:b/><w:bCs/><w:sz w:val="32"/><w:szCs w:val="32"/></w:rPr><w:t>CLIENTE</w:t></w:r></w:p></w:tc><w:tc><w:tcPr><w:tcW w:w="313" w:type="dxa"/><w:vAlign w:val="center"/></w:tcPr><w:p><w:pPr><w:pStyle w:val="SemEspaamento"/><w:rPr><w:rFonts w:ascii="Times New Roman" w:hAnsi="Times New Roman" w:cs="Times New Roman"/><w:sz w:val="32"/><w:szCs w:val="32"/></w:rPr></w:pPr><w:r><w:rPr><w:rFonts w:ascii="Times New Roman" w:hAnsi="Times New Roman" w:cs="Times New Roman"/><w:sz w:val="32"/><w:szCs w:val="32"/></w:rPr><w:t>:</w:t></w:r></w:p></w:tc><w:tc><w:tcPr><w:tcW w:w="6797" w:type="dxa"/><w:vAlign w:val="center"/></w:tcPr><w:p><w:pPr><w:pStyle w:val="SemEspaamento"/><w:rPr><w:rFonts w:ascii="Times New Roman" w:hAnsi="Times New Roman" w:cs="Times New Roman"/><w:bCs/><w:iCs/><w:sz w:val="32"/><w:szCs w:val="32"/></w:rPr></w:pPr><w:r><w:rPr><w:rFonts w:ascii="Times New Roman" w:hAnsi="Times New Roman" w:cs="Times New Roman"/><w:bCs/><w:iCs/><w:sz w:val="32"/><w:szCs w:val="32"/></w:rPr><w:t>{cliente}</w:t></w:r></w:p></w:tc>/w:tr><w:tr><w:trPr><w:trHeight w:val="1311"/></w:trPr><w:tc><w:tcPr><w:tcW w:w="2529" w:type="dxa"/><w:vAlign w:val="center"/></w:tcPr><w:p><w:pPr><w:pStyle w:val="SemEspaamento"/><w:rPr><w:rFonts w:ascii="Times New Roman" w:hAnsi="Times New Roman" w:cs="Times New Roman"/><w:b/><w:bCs/><w:sz w:val="32"/><w:szCs w:val="32"/></w:rPr></w:pPr><w:r><w:rPr><w:rFonts w:ascii="Times New Roman" w:hAnsi="Times New Roman" w:cs="Times New Roman"/><w:b/><w:bCs/><w:sz w:val="32"/><w:szCs w:val="32"/></w:rPr><w:t>ENDEREÇO</w:t></w:r></w:p></w:tc><w:tc><w:tcPr><w:tcW w:w="313" w:type="dxa"/><w:vAlign w:val="center"/></w:tcPr><w:p><w:pPr><w:pStyle w:val="SemEspaamento"/><w:rPr><w:rFonts w:ascii="Times New Roman" w:hAnsi="Times New Roman" w:cs="Times New Roman"/><w:sz w:val="32"/><w:szCs w:val="32"/></w:rPr></w:pPr><w:r><w:rPr><w:rFonts w:ascii="Times New Roman" w:hAnsi="Times New Roman" w:cs="Times New Roman"/><w:sz w:val="32"/><w:szCs w:val="32"/></w:rPr><w:t>:</w:t></w:r></w:p></w:tc><w:tc><w:tcPr><w:tcW w:w="6797" w:type="dxa"/><w:vAlign w:val="center"/></w:tcPr><w:p><w:pPr><w:pStyle w:val="SemEspaamento"/><w:rPr><w:rFonts w:ascii="Times New Roman" w:hAnsi="Times New Roman" w:cs="Times New Roman"/><w:bCs/><w:iCs/><w:sz w:val="32"/><w:szCs w:val="32"/></w:rPr></w:pPr><w:r><w:rPr><w:rFonts w:ascii="Times New Roman" w:hAnsi="Times New Roman" w:cs="Times New Roman"/><w:bCs/><w:iCs/><w:sz w:val="32"/><w:szCs w:val="32"/></w:rPr><w:t>{endereco}</w:t></w:r></w:p></w:tc>/w:tr><w:tr><w:trPr><w:trHeight w:val="1841"/></w:trPr><w:tc><w:tcPr><w:tcW w:w="2529" w:type="dxa"/><w:vAlign w:val="center"/></w:tcPr><w:p><w:pPr><w:pStyle w:val="SemEspaamento"/><w:rPr><w:rFonts w:ascii="Times New Roman" w:hAnsi="Times New Roman" w:cs="Times New Roman"/><w:b/><w:bCs/><w:sz w:val="32"/><w:szCs w:val="32"/></w:rPr></w:pPr><w:r><w:rPr><w:rFonts w:ascii="Times New Roman" w:hAnsi="Times New Roman" w:cs="Times New Roman"/><w:b/><w:bCs/><w:sz w:val="32"/><w:szCs w:val="32"/></w:rPr><w:t>EQUIPAMENTO</w:t></w:r></w:p></w:tc><w:tc><w:tcPr><w:tcW w:w="313" w:type="dxa"/><w:vAlign w:val="center"/></w:tcPr><w:p><w:pPr><w:pStyle w:val="SemEspaamento"/><w:jc w:val="center"/><w:rPr><w:rFonts w:ascii="Times New Roman" w:hAnsi="Times New Roman" w:cs="Times New Roman"/><w:sz w:val="32"/><w:szCs w:val="32"/></w:rPr></w:pPr><w:r><w:rPr><w:rFonts w:ascii="Times New Roman" w:hAnsi="Times New Roman" w:cs="Times New Roman"/><w:sz w:val="32"/><w:szCs w:val="32"/></w:rPr><w:t>:</w:t></w:r></w:p></w:tc><w:tc><w:tcPr><w:tcW w:w="6797" w:type="dxa"/><w:vAlign w:val="center"/></w:tcPr><w:p><w:pPr><w:pStyle w:val="SemEspaamento"/><w:rPr><w:rFonts w:ascii="Times New Roman" w:hAnsi="Times New Roman" w:cs="Times New Roman"/><w:bCs/><w:iCs/><w:sz w:val="32"/><w:szCs w:val="32"/></w:rPr></w:pPr><w:r><w:rPr><w:rFonts w:ascii="Times New Roman" w:hAnsi="Times New Roman" w:cs="Times New Roman"/><w:bCs/><w:iCs/><w:sz w:val="32"/><w:szCs w:val="32"/></w:rPr><w:t>ISOTANK</w:t></w:r></w:p></w:tc></w:tr></w:tbl><w:p><w:pPr><w:spacing w:after="0"/><w:ind w:left="-567"/><w:rPr><w:rFonts w:ascii="Arial" w:hAnsi="Arial" w:cs="Arial"/><w:sz w:val="20"/><w:szCs w:val="20"/></w:rPr></w:pPr></w:p><w:p><w:pPr><w:spacing w:after="0"/><w:ind w:left="-567"/><w:rPr><w:rFonts w:ascii="Arial" w:hAnsi="Arial" w:cs="Arial"/><w:b/><w:sz w:val="20"/><w:szCs w:val="20"/></w:rPr></w:pPr></w:p><w:p><w:pPr><w:spacing w:after="0"/><w:ind w:left="-567"/><w:rPr><w:rFonts w:ascii="Arial" w:hAnsi="Arial" w:cs="Arial"/><w:b/><w:sz w:val="20"/><w:szCs w:val="20"/></w:rPr></w:pPr></w:p><w:p><w:pPr><w:spacing w:after="0"/><w:ind w:left="-567"/><w:rPr><w:rFonts w:ascii="Arial" w:hAnsi="Arial" w:cs="Arial"/><w:b/><w:sz w:val="20"/><w:szCs w:val="20"/></w:rPr></w:pPr></w:p><w:p><w:pPr><w:spacing w:after="0"/><w:ind w:left="-567"/><w:rPr><w:rFonts w:ascii="Arial" w:hAnsi="Arial" w:cs="Arial"/><w:b/><w:sz w:val="20"/><w:szCs w:val="20"/></w:rPr></w:pPr></w:p><w:p><w:pPr><w:spacing w:after="0"/><w:ind w:left="-567"/><w:rPr><w:rFonts w:ascii="Arial" w:hAnsi="Arial" w:cs="Arial"/><w:b/><w:sz w:val="20"/><w:szCs w:val="20"/></w:rPr></w:pPr></w:p><w:p><w:pPr><w:spacing w:after="0"/><w:ind w:left="-567"/><w:rPr><w:rFonts w:ascii="Arial" w:hAnsi="Arial" w:cs="Arial"/><w:b/><w:sz w:val="20"/><w:szCs w:val="20"/></w:rPr></w:pPr></w:p><w:p><w:pPr><w:spacing w:after="0"/><w:ind w:left="-567"/><w:rPr><w:rFonts w:ascii="Arial" w:hAnsi="Arial" w:cs="Arial"/><w:b/><w:sz w:val="20"/><w:szCs w:val="20"/></w:rPr></w:pPr></w:p><w:p><w:pPr><w:spacing w:after="0"/><w:ind w:left="-567"/><w:rPr><w:rFonts w:ascii="Arial" w:hAnsi="Arial" w:cs="Arial"/><w:b/><w:sz w:val="20"/><w:szCs w:val="20"/></w:rPr></w:pPr></w:p><w:p><w:pPr><w:spacing w:after="0"/><w:rPr><w:rFonts w:ascii="Arial" w:hAnsi="Arial" w:cs="Arial"/><w:b/><w:sz w:val="20"/><w:szCs w:val="20"/></w:rPr></w:pPr></w:p><w:p><w:pPr><w:spacing w:after="0"/><w:rPr><w:rFonts w:ascii="Arial" w:hAnsi="Arial" w:cs="Arial"/><w:b/><w:sz w:val="20"/><w:szCs w:val="20"/></w:rPr></w:pPr></w:p><w:p><w:pPr><w:spacing w:after="0"/><w:rPr><w:rFonts w:ascii="Arial" w:hAnsi="Arial" w:cs="Arial"/><w:b/><w:sz w:val="20"/><w:szCs w:val="20"/></w:rPr></w:pPr></w:p><w:p><w:pPr><w:spacing w:after="0"/><w:rPr><w:rFonts w:ascii="Arial" w:hAnsi="Arial" w:cs="Arial"/><w:b/><w:sz w:val="20"/><w:szCs w:val="20"/></w:rPr></w:pPr></w:p><w:tbl><w:tblPr><w:tblStyle w:val="Tabelacomgrade"/><w:tblW w:w="9810" w:type="dxa"/><w:tblInd w:w="-459" w:type="dxa"/><w:tblBorders><w:insideH w:val="single" w:sz="6" w:space="0" w:color="auto"/><w:insideV w:val="single" w:sz="6" w:space="0" w:color="auto"/></w:tblBorders><w:shd w:val="clear" w:color="auto" w:fill="FFFF00"/><w:tblLook w:val="04A0" w:firstRow="1" w:lastRow="0" w:firstColumn="1" w:lastColumn="0" w:noHBand="0" w:noVBand="1"/></w:tblPr><w:tblGrid><w:gridCol w:w="9810"/></w:tblGrid><w:tr><w:trPr><w:trHeight w:val="403"/></w:trPr><w:tc><w:tcPr><w:tcW w:w="9810" w:type="dxa"/><w:tcBorders><w:top w:val="single" w:sz="4" w:space="0" w:color="1B407E"/><w:left w:val="single" w:sz="4" w:space="0" w:color="1B407E"/><w:bottom w:val="single" w:sz="4" w:space="0" w:color="1B407E"/><w:right w:val="single" w:sz="4" w:space="0" w:color="1B407E"/></w:tcBorders><w:shd w:val="clear" w:color="auto" w:fill="1B407E"/><w:vAlign w:val="center"/></w:tcPr><w:p><w:pPr><w:rPr><w:rFonts w:ascii="Times New Roman" w:hAnsi="Times New Roman" w:cs="Times New Roman"/><w:b/><w:sz w:val="28"/><w:szCs w:val="28"/></w:rPr></w:pPr><w:r><w:rPr><w:rFonts w:ascii="Times New Roman" w:hAnsi="Times New Roman" w:cs="Times New Roman"/><w:b/><w:color w:val="FFFFFF" w:themeColor="background1"/><w:sz w:val="28"/><w:szCs w:val="28"/></w:rPr><w:lastRenderedPageBreak/><w:t>DADOS DA EMPRESA</w:t></w:r><w:r><w:rPr><w:rFonts w:ascii="Times New Roman" w:hAnsi="Times New Roman" w:cs="Times New Roman"/><w:b/><w:color w:val="FFFFFF" w:themeColor="background1"/><w:sz w:val="28"/><w:szCs w:val="28"/></w:rPr><w:t xml:space="preserve"> </w:t></w:r><w:r><w:rPr><w:rFonts w:ascii="Times New Roman" w:hAnsi="Times New Roman" w:cs="Times New Roman"/><w:b/><w:color w:val="FFFFFF" w:themeColor="background1"/><w:sz w:val="28"/><w:szCs w:val="28"/></w:rPr><w:t>CONTRATADA</w:t></w:r></w:p></w:tc></w:tr></w:tbl><w:p><w:pPr><w:spacing w:before="120" w:after="0"/><w:ind w:left="-567"/><w:rPr><w:rFonts w:ascii="Times New Roman" w:hAnsi="Times New Roman" w:cs="Times New Roman"/><w:bCs/></w:rPr></w:pPr><w:r><w:rPr><w:rFonts w:ascii="Arial" w:hAnsi="Arial" w:cs="Arial"/><w:b/><w:sz w:val="20"/><w:szCs w:val="20"/></w:rPr><w:t xml:space="preserve"> </w:t></w:r><w:r><w:rPr><w:rFonts w:ascii="Arial" w:hAnsi="Arial" w:cs="Arial"/><w:bCs/><w:sz w:val="20"/><w:szCs w:val="20"/></w:rPr><w:t xml:space="preserve"> </w:t></w:r><w:r><w:rPr><w:rFonts w:ascii="Times New Roman" w:hAnsi="Times New Roman" w:cs="Times New Roman"/><w:b/></w:rPr><w:t>Empresa:</w:t></w:r><w:r><w:rPr><w:rFonts w:ascii="Times New Roman" w:hAnsi="Times New Roman" w:cs="Times New Roman"/><w:bCs/></w:rPr><w:t xml:space="preserve"> Ceinspec Inspeções Veiculares e Industriais Ltda</w:t></w:r></w:p><w:p><w:pPr><w:spacing w:after="0"/><w:ind w:left="-567"/><w:rPr><w:rFonts w:ascii="Times New Roman" w:hAnsi="Times New Roman" w:cs="Times New Roman"/><w:bCs/></w:rPr></w:pPr><w:r><w:rPr><w:rFonts w:ascii="Times New Roman" w:hAnsi="Times New Roman" w:cs="Times New Roman"/><w:bCs/></w:rPr><w:t xml:space="preserve">  </w:t></w:r><w:r><w:rPr><w:rFonts w:ascii="Times New Roman" w:hAnsi="Times New Roman" w:cs="Times New Roman"/><w:b/></w:rPr><w:t>Endereço:</w:t></w:r><w:r><w:rPr><w:rFonts w:ascii="Times New Roman" w:hAnsi="Times New Roman" w:cs="Times New Roman"/><w:bCs/></w:rPr><w:t xml:space="preserve"> Rua Claudino Domingues Graça, n</w:t></w:r><w:r><w:rPr><w:rFonts w:ascii="Times New Roman" w:hAnsi="Times New Roman" w:cs="Times New Roman"/><w:bCs/></w:rPr><w:sym w:font="Symbol" w:char="F0B0"/></w:r><w:r><w:rPr><w:rFonts w:ascii="Times New Roman" w:hAnsi="Times New Roman" w:cs="Times New Roman"/><w:bCs/></w:rPr><w:t xml:space="preserve"> 831, Zona Industrial – Cubatão / SP </w:t></w:r><w:r><w:rPr><w:rFonts w:ascii="Times New Roman" w:hAnsi="Times New Roman" w:cs="Times New Roman"/><w:bCs/></w:rPr><w:t>– CEP 11570-100</w:t></w:r></w:p><w:p><w:pPr><w:spacing w:after="0"/><w:ind w:left="-567"/><w:rPr><w:rFonts w:ascii="Times New Roman" w:hAnsi="Times New Roman" w:cs="Times New Roman"/><w:bCs/></w:rPr></w:pPr><w:r><w:rPr><w:rFonts w:ascii="Times New Roman" w:hAnsi="Times New Roman" w:cs="Times New Roman"/><w:bCs/></w:rPr><w:t xml:space="preserve">  </w:t></w:r><w:r><w:rPr><w:rFonts w:ascii="Times New Roman" w:hAnsi="Times New Roman" w:cs="Times New Roman"/><w:b/></w:rPr><w:t>CNPJ:</w:t></w:r><w:r><w:rPr><w:rFonts w:ascii="Times New Roman" w:hAnsi="Times New Roman" w:cs="Times New Roman"/><w:bCs/></w:rPr><w:t xml:space="preserve"> 48.758.755/0004-29</w:t></w:r></w:p><w:p><w:pPr><w:spacing w:after="0"/><w:ind w:left="-426"/><w:rPr><w:rFonts w:ascii="Times New Roman" w:hAnsi="Times New Roman" w:cs="Times New Roman"/><w:bCs/></w:rPr></w:pPr><w:r><w:rPr><w:rFonts w:ascii="Times New Roman" w:hAnsi="Times New Roman" w:cs="Times New Roman"/><w:b/></w:rPr><w:t xml:space="preserve">OIA/PP </w:t></w:r><w:r><w:rPr><w:rFonts w:ascii="Times New Roman" w:hAnsi="Times New Roman" w:cs="Times New Roman"/><w:b/></w:rPr><w:t>n</w:t></w:r><w:r><w:rPr><w:rFonts w:ascii="Times New Roman" w:hAnsi="Times New Roman" w:cs="Times New Roman"/><w:b/></w:rPr><w:sym w:font="Symbol" w:char="F0B0"/></w:r><w:r><w:rPr><w:rFonts w:ascii="Times New Roman" w:hAnsi="Times New Roman" w:cs="Times New Roman"/><w:b/></w:rPr><w:t>:</w:t></w:r><w:r><w:rPr><w:rFonts w:ascii="Times New Roman" w:hAnsi="Times New Roman" w:cs="Times New Roman"/><w:bCs/></w:rPr><w:t xml:space="preserve"> 1064 – TIPO C</w:t></w:r></w:p><w:p><w:pPr><w:spacing w:after="120"/><w:ind w:left="-426"/><w:rPr><w:rFonts w:ascii="Times New Roman" w:hAnsi="Times New Roman" w:cs="Times New Roman"/><w:bCs/></w:rPr></w:pPr><w:r><w:rPr><w:rFonts w:ascii="Times New Roman" w:hAnsi="Times New Roman" w:cs="Times New Roman"/><w:b/></w:rPr><w:t>CREA-SP n</w:t></w:r><w:r><w:rPr><w:rFonts w:ascii="Times New Roman" w:hAnsi="Times New Roman" w:cs="Times New Roman"/><w:b/></w:rPr><w:sym w:font="Symbol" w:char="F0B0"/></w:r><w:r><w:rPr><w:rFonts w:ascii="Times New Roman" w:hAnsi="Times New Roman" w:cs="Times New Roman"/><w:b/></w:rPr><w:t xml:space="preserve">: </w:t></w:r><w:r><w:rPr><w:rFonts w:ascii="Times New Roman" w:hAnsi="Times New Roman" w:cs="Times New Roman"/><w:bCs/></w:rPr><w:t>2430958</w:t></w:r></w:p><w:p><w:pPr><w:spacing w:before="120" w:after="0"/><w:ind w:left="-426" w:hanging="141"/><w:rPr><w:rFonts w:ascii="Times New Roman" w:hAnsi="Times New Roman" w:cs="Times New Roman"/><w:bCs/></w:rPr></w:pPr><w:r><w:rPr><w:rFonts w:ascii="Times New Roman" w:hAnsi="Times New Roman" w:cs="Times New Roman"/><w:bCs/></w:rPr><w:t xml:space="preserve">   </w:t></w:r><w:r><w:rPr><w:rFonts w:ascii="Times New Roman" w:hAnsi="Times New Roman" w:cs="Times New Roman"/><w:bCs/></w:rPr><w:t>A Ceinspec Inspeções Veiculares e Industriais Ltda é uma empresa devidamente acreditada pelo Instituto Nacional de Metrologia, Qualidade e Tecnologia (INMETRO) como Organismo de Inspeção Acreditado / Pessoa Jurídica Prestadora (OIA/PP), na modalidade Tipo C, para a execução de atividades de inspeção técnica industrial, atendendo integralmente aos requisitos normativos vigentes</w:t></w:r><w:r><w:rPr><w:rFonts w:ascii="Times New Roman" w:hAnsi="Times New Roman" w:cs="Times New Roman"/><w:bCs/></w:rPr><w:t>.</w:t></w:r></w:p><w:p><w:pPr><w:spacing w:after="0"/><w:ind w:left="-567"/><w:rPr><w:rFonts w:ascii="Arial" w:hAnsi="Arial" w:cs="Arial"/><w:bCs/><w:sz w:val="20"/><w:szCs w:val="20"/></w:rPr></w:pPr></w:p><w:tbl><w:tblPr><w:tblStyle w:val="Tabelacomgrade"/><w:tblW w:w="9764" w:type="dxa"/><w:tblInd w:w="-459" w:type="dxa"/><w:shd w:val="clear" w:color="auto" w:fill="FFFF00"/><w:tblLook w:val="04A0" w:firstRow="1" w:lastRow="0" w:firstColumn="1" w:lastColumn="0" w:noHBand="0" w:noVBand="1"/></w:tblPr><w:tblGrid><w:gridCol w:w="9764"/></w:tblGrid><w:tr><w:trPr><w:trHeight w:val="403"/></w:trPr><w:tc><w:tcPr><w:tcW w:w="9764" w:type="dxa"/><w:tcBorders><w:top w:val="single" w:sz="4" w:space="0" w:color="1B407E"/><w:left w:val="single" w:sz="4" w:space="0" w:color="1B407E"/><w:bottom w:val="single" w:sz="4" w:space="0" w:color="1B407E"/><w:right w:val="single" w:sz="4" w:space="0" w:color="1B407E"/></w:tcBorders><w:shd w:val="clear" w:color="auto" w:fill="1B407E"/><w:vAlign w:val="center"/></w:tcPr><w:p><w:pPr><w:rPr><w:rFonts w:ascii="Times New Roman" w:hAnsi="Times New Roman" w:cs="Times New Roman"/><w:b/><w:sz w:val="24"/><w:szCs w:val="24"/></w:rPr></w:pPr><w:r><w:rPr><w:rFonts w:ascii="Arial" w:hAnsi="Arial" w:cs="Arial"/><w:bCs/><w:sz w:val="20"/><w:szCs w:val="20"/></w:rPr><w:t xml:space="preserve"> </w:t></w:r><w:r><w:rPr><w:rFonts w:ascii="Times New Roman" w:hAnsi="Times New Roman" w:cs="Times New Roman"/><w:b/><w:color w:val="FFFFFF" w:themeColor="background1"/><w:sz w:val="24"/><w:szCs w:val="24"/><w:bdr w:val="single" w:sz="4" w:space="0" w:color="1B407E"/><w:shd w:val="clear" w:color="auto" w:fill="1B407E"/></w:rPr><w:t>EXAMES E ENSAIOS REALIZADOS</w:t></w:r></w:p></w:tc></w:tr></w:tbl><w:p><w:pPr><w:spacing w:after="0"/><w:rPr><w:rFonts w:ascii="Arial" w:hAnsi="Arial" w:cs="Arial"/><w:b/><w:sz w:val="20"/><w:szCs w:val="20"/></w:rPr></w:pPr></w:p><w:tbl><w:tblPr><w:tblStyle w:val="Tabelacomgrade"/><w:tblW w:w="9668" w:type="dxa"/><w:tblInd w:w="-459" w:type="dxa"/><w:tblLayout w:type="fixed"/><w:tblLook w:val="04A0" w:firstRow="1" w:lastRow="0" w:firstColumn="1" w:lastColumn="0" w:noHBand="0" w:noVBand="1"/></w:tblPr><w:tblGrid><w:gridCol w:w="2581"/><w:gridCol w:w="425"/><w:gridCol w:w="425"/><w:gridCol w:w="425"/><w:gridCol w:w="5812"/></w:tblGrid><w:tr><w:trPr><w:trHeight w:val="238"/></w:trPr><w:tc><w:tcPr><w:tcW w:w="2581" w:type="dxa"/><w:vAlign w:val="center"/></w:tcPr><w:p><w:pPr><w:ind w:right="-111"/><w:jc w:val="both"/><w:rPr><w:rFonts w:ascii="Times New Roman" w:hAnsi="Times New Roman" w:cs="Times New Roman"/><w:sz w:val="20"/><w:szCs w:val="20"/></w:rPr></w:pPr></w:p></w:tc><w:tc><w:tcPr><w:tcW w:w="425" w:type="dxa"/><w:vAlign w:val="center"/></w:tcPr><w:p><w:pPr><w:ind w:left="-108" w:right="-111"/><w:jc w:val="center"/><w:rPr><w:rFonts w:ascii="Times New Roman" w:hAnsi="Times New Roman" w:cs="Times New Roman"/><w:b/><w:sz w:val="20"/><w:szCs w:val="20"/></w:rPr></w:pPr><w:r><w:rPr><w:rFonts w:ascii="Times New Roman" w:hAnsi="Times New Roman" w:cs="Times New Roman"/><w:b/><w:sz w:val="20"/><w:szCs w:val="20"/></w:rPr><w:t>A</w:t></w:r></w:p></w:tc><w:tc><w:tcPr><w:tcW w:w="425" w:type="dxa"/><w:vAlign w:val="center"/></w:tcPr><w:p><w:pPr><w:ind w:left="-108" w:right="-111"/><w:jc w:val="center"/><w:rPr><w:rFonts w:ascii="Times New Roman" w:hAnsi="Times New Roman" w:cs="Times New Roman"/><w:b/><w:sz w:val="20"/><w:szCs w:val="20"/></w:rPr></w:pPr><w:r><w:rPr><w:rFonts w:ascii="Times New Roman" w:hAnsi="Times New Roman" w:cs="Times New Roman"/><w:b/><w:sz w:val="20"/><w:szCs w:val="20"/></w:rPr><w:t>R</w:t></w:r></w:p></w:tc><w:tc><w:tcPr><w:tcW w:w="425" w:type="dxa"/><w:vAlign w:val="center"/></w:tcPr><w:p><w:pPr><w:ind w:left="-108" w:right="-111"/><w:jc w:val="center"/><w:rPr><w:rFonts w:ascii="Times New Roman" w:hAnsi="Times New Roman" w:cs="Times New Roman"/><w:b/><w:sz w:val="20"/><w:szCs w:val="20"/></w:rPr></w:pPr><w:r><w:rPr><w:rFonts w:ascii="Times New Roman" w:hAnsi="Times New Roman" w:cs="Times New Roman"/><w:b/><w:sz w:val="20"/><w:szCs w:val="20"/></w:rPr><w:t>NA</w:t></w:r></w:p></w:tc><w:tc><w:tcPr><w:tcW w:w="5812" w:type="dxa"/><w:vAlign w:val="center"/></w:tcPr><w:p><w:pPr><w:ind w:left="-108" w:right="-111"/><w:jc w:val="center"/><w:rPr><w:rFonts w:ascii="Times New Roman" w:hAnsi="Times New Roman" w:cs="Times New Roman"/><w:b/><w:sz w:val="20"/><w:szCs w:val="20"/></w:rPr></w:pPr><w:r><w:rPr><w:rFonts w:ascii="Times New Roman" w:hAnsi="Times New Roman" w:cs="Times New Roman"/><w:b/><w:sz w:val="20"/><w:szCs w:val="20"/></w:rPr><w:t>OBS</w:t></w:r></w:p></w:tc></w:tr><w:tr><w:trPr><w:trHeight w:val="282"/></w:trPr><w:tc><w:tcPr><w:tcW w:w="2581" w:type="dxa"/></w:tcPr><w:p><w:pPr><w:ind w:right="-111"/><w:jc w:val="both"/><w:rPr><w:rFonts w:ascii="Times New Roman" w:hAnsi="Times New Roman" w:cs="Times New Roman"/><w:sz w:val="20"/><w:szCs w:val="20"/></w:rPr></w:pPr><w:r><w:rPr><w:rFonts w:ascii="Times New Roman" w:hAnsi="Times New Roman" w:cs="Times New Roman"/><w:sz w:val="20"/><w:szCs w:val="20"/></w:rPr><w:t xml:space="preserve">Exame </w:t></w:r><w:r><w:rPr><w:rFonts w:ascii="Times New Roman" w:hAnsi="Times New Roman" w:cs="Times New Roman"/><w:sz w:val="20"/><w:szCs w:val="20"/></w:rPr><w:t>V</w:t></w:r><w:r><w:rPr><w:rFonts w:ascii="Times New Roman" w:hAnsi="Times New Roman" w:cs="Times New Roman"/><w:sz w:val="20"/><w:szCs w:val="20"/></w:rPr><w:t xml:space="preserve">isual </w:t></w:r><w:r><w:rPr><w:rFonts w:ascii="Times New Roman" w:hAnsi="Times New Roman" w:cs="Times New Roman"/><w:sz w:val="20"/><w:szCs w:val="20"/></w:rPr><w:t>E</w:t></w:r><w:r><w:rPr><w:rFonts w:ascii="Times New Roman" w:hAnsi="Times New Roman" w:cs="Times New Roman"/><w:sz w:val="20"/><w:szCs w:val="20"/></w:rPr><w:t xml:space="preserve">xterno </w:t></w:r></w:p></w:tc><w:tc><w:tcPr><w:tcW w:w="425" w:type="dxa"/></w:tcPr><w:p><w:pPr><w:ind w:left="-108" w:right="-111"/><w:jc w:val="center"/><w:rPr><w:rFonts w:ascii="Times New Roman" w:hAnsi="Times New Roman" w:cs="Times New Roman"/><w:sz w:val="20"/><w:szCs w:val="20"/></w:rPr></w:pPr><w:r><w:rPr><w:rFonts w:ascii="Times New Roman" w:hAnsi="Times New Roman" w:cs="Times New Roman"/><w:sz w:val="20"/><w:szCs w:val="20"/></w:rPr><w:t>A</w:t></w:r></w:p></w:tc><w:tc><w:tcPr><w:tcW w:w="425" w:type="dxa"/></w:tcPr><w:p><w:pPr><w:ind w:left="-108" w:right="-111"/><w:jc w:val="center"/><w:rPr><w:rFonts w:ascii="Times New Roman" w:hAnsi="Times New Roman" w:cs="Times New Roman"/><w:sz w:val="20"/><w:szCs w:val="20"/></w:rPr></w:pPr></w:p></w:tc><w:tc><w:tcPr><w:tcW w:w="425" w:type="dxa"/></w:tcPr><w:p><w:pPr><w:ind w:left="-108" w:right="-111"/><w:jc w:val="center"/><w:rPr><w:rFonts w:ascii="Times New Roman" w:hAnsi="Times New Roman" w:cs="Times New Roman"/><w:sz w:val="20"/><w:szCs w:val="20"/></w:rPr></w:pPr></w:p></w:tc><w:tc><w:tcPr><w:tcW w:w="5812" w:type="dxa"/></w:tcPr><w:p><w:pPr><w:ind w:left="-108" w:right="-111"/><w:rPr><w:rFonts w:ascii="Times New Roman" w:hAnsi="Times New Roman" w:cs="Times New Roman"/><w:sz w:val="20"/><w:szCs w:val="20"/></w:rPr></w:pPr><w:r><w:rPr><w:rFonts w:ascii="Times New Roman" w:hAnsi="Times New Roman" w:cs="Times New Roman"/><w:sz w:val="20"/><w:szCs w:val="20"/></w:rPr><w:t xml:space="preserve"> </w:t></w:r></w:p></w:tc></w:tr><w:tr><w:trPr><w:trHeight w:val="282"/></w:trPr><w:tc><w:tcPr><w:tcW w:w="2581" w:type="dxa"/></w:tcPr><w:p><w:pPr><w:ind w:right="-111"/><w:jc w:val="both"/><w:rPr><w:rFonts w:ascii="Times New Roman" w:hAnsi="Times New Roman" w:cs="Times New Roman"/><w:sz w:val="20"/><w:szCs w:val="20"/></w:rPr></w:pPr><w:r><w:rPr><w:rFonts w:ascii="Times New Roman" w:hAnsi="Times New Roman" w:cs="Times New Roman"/><w:sz w:val="20"/><w:szCs w:val="20"/></w:rPr><w:t xml:space="preserve">Exame </w:t></w:r><w:r><w:rPr><w:rFonts w:ascii="Times New Roman" w:hAnsi="Times New Roman" w:cs="Times New Roman"/><w:sz w:val="20"/><w:szCs w:val="20"/></w:rPr><w:t>V</w:t></w:r><w:r><w:rPr><w:rFonts w:ascii="Times New Roman" w:hAnsi="Times New Roman" w:cs="Times New Roman"/><w:sz w:val="20"/><w:szCs w:val="20"/></w:rPr><w:t xml:space="preserve">isual </w:t></w:r><w:r><w:rPr><w:rFonts w:ascii="Times New Roman" w:hAnsi="Times New Roman" w:cs="Times New Roman"/><w:sz w:val="20"/><w:szCs w:val="20"/></w:rPr><w:t>I</w:t></w:r><w:r><w:rPr><w:rFonts w:ascii="Times New Roman" w:hAnsi="Times New Roman" w:cs="Times New Roman"/><w:sz w:val="20"/><w:szCs w:val="20"/></w:rPr><w:t>nterno</w:t></w:r></w:p></w:tc><w:tc><w:tcPr><w:tcW w:w="425" w:type="dxa"/></w:tcPr><w:p><w:pPr><w:ind w:left="-108" w:right="-111"/><w:jc w:val="center"/><w:rPr><w:rFonts w:ascii="Times New Roman" w:hAnsi="Times New Roman" w:cs="Times New Roman"/><w:sz w:val="20"/><w:szCs w:val="20"/></w:rPr></w:pPr></w:p></w:tc><w:tc><w:tcPr><w:tcW w:w="425" w:type="dxa"/></w:tcPr><w:p><w:pPr><w:ind w:left="-108" w:right="-111"/><w:jc w:val="center"/><w:rPr><w:rFonts w:ascii="Times New Roman" w:hAnsi="Times New Roman" w:cs="Times New Roman"/><w:sz w:val="20"/><w:szCs w:val="20"/></w:rPr></w:pPr></w:p></w:tc><w:tc><w:tcPr><w:tcW w:w="425" w:type="dxa"/></w:tcPr><w:p><w:pPr><w:ind w:left="-108" w:right="-111"/><w:jc w:val="center"/><w:rPr><w:rFonts w:ascii="Times New Roman" w:hAnsi="Times New Roman" w:cs="Times New Roman"/><w:sz w:val="20"/><w:szCs w:val="20"/></w:rPr></w:pPr><w:r><w:rPr><w:rFonts w:ascii="Times New Roman" w:hAnsi="Times New Roman" w:cs="Times New Roman"/><w:sz w:val="20"/><w:szCs w:val="20"/></w:rPr><w:t>NA</w:t></w:r></w:p></w:tc><w:tc><w:tcPr><w:tcW w:w="5812" w:type="dxa"/></w:tcPr><w:p><w:pPr><w:ind w:left="-108" w:right="-111"/><w:jc w:val="center"/><w:rPr><w:rFonts w:ascii="Times New Roman" w:hAnsi="Times New Roman" w:cs="Times New Roman"/><w:sz w:val="20"/><w:szCs w:val="20"/></w:rPr></w:pPr></w:p></w:tc></w:tr><w:tr><w:trPr><w:trHeight w:val="282"/></w:trPr><w:tc><w:tcPr><w:tcW w:w="2581" w:type="dxa"/></w:tcPr><w:p><w:pPr><w:ind w:right="-111"/><w:jc w:val="both"/><w:rPr><w:rFonts w:ascii="Times New Roman" w:hAnsi="Times New Roman" w:cs="Times New Roman"/><w:sz w:val="20"/><w:szCs w:val="20"/></w:rPr></w:pPr><w:r><w:rPr><w:rFonts w:ascii="Times New Roman" w:hAnsi="Times New Roman" w:cs="Times New Roman"/><w:sz w:val="20"/><w:szCs w:val="20"/></w:rPr><w:t>Estanqueidade</w:t></w:r></w:p></w:tc><w:tc><w:tcPr><w:tcW w:w="425" w:type="dxa"/></w:tcPr><w:p><w:pPr><w:ind w:left="-108" w:right="-111"/><w:jc w:val="center"/><w:rPr><w:rFonts w:ascii="Times New Roman" w:hAnsi="Times New Roman" w:cs="Times New Roman"/><w:sz w:val="20"/><w:szCs w:val="20"/></w:rPr></w:pPr></w:p></w:tc><w:tc><w:tcPr><w:tcW w:w="425" w:type="dxa"/></w:tcPr><w:p><w:pPr><w:ind w:left="-108" w:right="-111"/><w:jc w:val="center"/><w:rPr><w:rFonts w:ascii="Times New Roman" w:hAnsi="Times New Roman" w:cs="Times New Roman"/><w:sz w:val="20"/><w:szCs w:val="20"/></w:rPr></w:pPr></w:p></w:tc><w:tc><w:tcPr><w:tcW w:w="425" w:type="dxa"/></w:tcPr><w:p><w:pPr><w:ind w:left="-108" w:right="-111"/><w:jc w:val="center"/><w:rPr><w:rFonts w:ascii="Times New Roman" w:hAnsi="Times New Roman" w:cs="Times New Roman"/><w:sz w:val="20"/><w:szCs w:val="20"/></w:rPr></w:pPr><w:r><w:rPr><w:rFonts w:ascii="Times New Roman" w:hAnsi="Times New Roman" w:cs="Times New Roman"/><w:sz w:val="20"/><w:szCs w:val="20"/></w:rPr><w:t>NA</w:t></w:r></w:p></w:tc><w:tc><w:tcPr><w:tcW w:w="5812" w:type="dxa"/></w:tcPr><w:p><w:pPr><w:ind w:left="-108" w:right="-111"/><w:jc w:val="center"/><w:rPr><w:rFonts w:ascii="Times New Roman" w:hAnsi="Times New Roman" w:cs="Times New Roman"/><w:sz w:val="20"/><w:szCs w:val="20"/></w:rPr></w:pPr></w:p></w:tc></w:tr><w:tr><w:trPr><w:trHeight w:val="305"/></w:trPr><w:tc><w:tcPr><w:tcW w:w="2581" w:type="dxa"/></w:tcPr><w:p><w:pPr><w:ind w:right="-111"/><w:jc w:val="both"/><w:rPr><w:rFonts w:ascii="Times New Roman" w:hAnsi="Times New Roman" w:cs="Times New Roman"/><w:sz w:val="20"/><w:szCs w:val="20"/></w:rPr></w:pPr><w:r><w:rPr><w:rFonts w:ascii="Times New Roman" w:hAnsi="Times New Roman" w:cs="Times New Roman"/><w:sz w:val="20"/><w:szCs w:val="20"/></w:rPr><w:t xml:space="preserve">Sistema de </w:t></w:r><w:r><w:rPr><w:rFonts w:ascii="Times New Roman" w:hAnsi="Times New Roman" w:cs="Times New Roman"/><w:sz w:val="20"/><w:szCs w:val="20"/></w:rPr><w:t>D</w:t></w:r><w:r><w:rPr><w:rFonts w:ascii="Times New Roman" w:hAnsi="Times New Roman" w:cs="Times New Roman"/><w:sz w:val="20"/><w:szCs w:val="20"/></w:rPr><w:t>escarga</w:t></w:r></w:p></w:tc><w:tc><w:tcPr><w:tcW w:w="425" w:type="dxa"/></w:tcPr><w:p><w:pPr><w:ind w:left="-108" w:right="-111"/><w:jc w:val="center"/><w:rPr><w:rFonts w:ascii="Times New Roman" w:hAnsi="Times New Roman" w:cs="Times New Roman"/><w:sz w:val="20"/><w:szCs w:val="20"/></w:rPr></w:pPr></w:p></w:tc><w:tc><w:tcPr><w:tcW w:w="425" w:type="dxa"/></w:tcPr><w:p><w:pPr><w:ind w:left="-108" w:right="-111"/><w:jc w:val="center"/><w:rPr><w:rFonts w:ascii="Times New Roman" w:hAnsi="Times New Roman" w:cs="Times New Roman"/><w:sz w:val="20"/><w:szCs w:val="20"/></w:rPr></w:pPr></w:p></w:tc><w:tc><w:tcPr><w:tcW w:w="425" w:type="dxa"/></w:tcPr><w:p><w:pPr><w:ind w:left="-108" w:right="-111"/><w:jc w:val="center"/><w:rPr><w:rFonts w:ascii="Times New Roman" w:hAnsi="Times New Roman" w:cs="Times New Roman"/><w:sz w:val="20"/><w:szCs w:val="20"/></w:rPr></w:pPr><w:r><w:rPr><w:rFonts w:ascii="Times New Roman" w:hAnsi="Times New Roman" w:cs="Times New Roman"/><w:sz w:val="20"/><w:szCs w:val="20"/></w:rPr><w:t>NA</w:t></w:r></w:p></w:tc><w:tc><w:tcPr><w:tcW w:w="5812" w:type="dxa"/></w:tcPr><w:p><w:pPr><w:ind w:left="-108" w:right="-111"/><w:jc w:val="center"/><w:rPr><w:rFonts w:ascii="Times New Roman" w:hAnsi="Times New Roman" w:cs="Times New Roman"/><w:sz w:val="20"/><w:szCs w:val="20"/></w:rPr></w:pPr></w:p></w:tc></w:tr><w:tr><w:trPr><w:trHeight w:val="282"/></w:trPr><w:tc><w:tcPr><w:tcW w:w="2581" w:type="dxa"/></w:tcPr><w:p><w:pPr><w:ind w:right="-111"/><w:jc w:val="both"/><w:rPr><w:rFonts w:ascii="Times New Roman" w:hAnsi="Times New Roman" w:cs="Times New Roman"/><w:sz w:val="20"/><w:szCs w:val="20"/></w:rPr></w:pPr><w:r><w:rPr><w:rFonts w:ascii="Times New Roman" w:hAnsi="Times New Roman" w:cs="Times New Roman"/><w:sz w:val="20"/><w:szCs w:val="20"/></w:rPr><w:t xml:space="preserve">Válvulas e </w:t></w:r><w:r><w:rPr><w:rFonts w:ascii="Times New Roman" w:hAnsi="Times New Roman" w:cs="Times New Roman"/><w:sz w:val="20"/><w:szCs w:val="20"/></w:rPr><w:t>C</w:t></w:r><w:r><w:rPr><w:rFonts w:ascii="Times New Roman" w:hAnsi="Times New Roman" w:cs="Times New Roman"/><w:sz w:val="20"/><w:szCs w:val="20"/></w:rPr><w:t>onexões</w:t></w:r></w:p></w:tc><w:tc><w:tcPr><w:tcW w:w="425" w:type="dxa"/></w:tcPr><w:p><w:pPr><w:ind w:left="-108" w:right="-111"/><w:jc w:val="center"/><w:rPr><w:rFonts w:ascii="Times New Roman" w:hAnsi="Times New Roman" w:cs="Times New Roman"/><w:sz w:val="20"/><w:szCs w:val="20"/></w:rPr></w:pPr></w:p></w:tc><w:tc><w:tcPr><w:tcW w:w="425" w:type="dxa"/></w:tcPr><w:p><w:pPr><w:ind w:left="-108" w:right="-111"/><w:jc w:val="center"/><w:rPr><w:rFonts w:ascii="Times New Roman" w:hAnsi="Times New Roman" w:cs="Times New Roman"/><w:sz w:val="20"/><w:szCs w:val="20"/></w:rPr></w:pPr></w:p></w:tc><w:tc><w:tcPr><w:tcW w:w="425" w:type="dxa"/></w:tcPr><w:p><w:pPr><w:ind w:left="-108" w:right="-111"/><w:jc w:val="center"/><w:rPr><w:rFonts w:ascii="Times New Roman" w:hAnsi="Times New Roman" w:cs="Times New Roman"/><w:sz w:val="20"/><w:szCs w:val="20"/></w:rPr></w:pPr><w:r><w:rPr><w:rFonts w:ascii="Times New Roman" w:hAnsi="Times New Roman" w:cs="Times New Roman"/><w:sz w:val="20"/><w:szCs w:val="20"/></w:rPr><w:t>NA</w:t></w:r></w:p></w:tc><w:tc><w:tcPr><w:tcW w:w="5812" w:type="dxa"/></w:tcPr><w:p><w:pPr><w:ind w:left="-108" w:right="-111"/><w:jc w:val="center"/><w:rPr><w:rFonts w:ascii="Times New Roman" w:hAnsi="Times New Roman" w:cs="Times New Roman"/><w:sz w:val="20"/><w:szCs w:val="20"/></w:rPr></w:pPr></w:p></w:tc></w:tr></w:tbl><w:p><w:pPr><w:spacing w:after="0"/><w:ind w:left="-567"/><w:rPr><w:rFonts w:ascii="Times New Roman" w:hAnsi="Times New Roman" w:cs="Times New Roman"/><w:b/><w:sz w:val="20"/><w:szCs w:val="20"/></w:rPr></w:pPr></w:p><w:tbl><w:tblPr><w:tblStyle w:val="Tabelacomgrade"/><w:tblW w:w="9764" w:type="dxa"/><w:tblInd w:w="-459" w:type="dxa"/><w:tblBorders><w:left w:val="none" w:sz="0" w:space="0" w:color="auto"/><w:right w:val="none" w:sz="0" w:space="0" w:color="auto"/><w:insideH w:val="none" w:sz="0" w:space="0" w:color="auto"/><w:insideV w:val="none" w:sz="0" w:space="0" w:color="auto"/></w:tblBorders><w:tblLook w:val="04A0" w:firstRow="1" w:lastRow="0" w:firstColumn="1" w:lastColumn="0" w:noHBand="0" w:noVBand="1"/></w:tblPr><w:tblGrid><w:gridCol w:w="9764"/></w:tblGrid><w:tr><w:trPr><w:trHeight w:val="454"/></w:trPr><w:tc><w:tcPr><w:tcW w:w="9764" w:type="dxa"/><w:vAlign w:val="center"/></w:tcPr><w:p><w:pPr><w:jc w:val="center"/><w:rPr><w:rFonts w:ascii="Times New Roman" w:hAnsi="Times New Roman" w:cs="Times New Roman"/><w:sz w:val="20"/><w:szCs w:val="20"/></w:rPr></w:pPr><w:r><w:rPr><w:rFonts w:ascii="Times New Roman" w:hAnsi="Times New Roman" w:cs="Times New Roman"/><w:b/><w:sz w:val="20"/><w:szCs w:val="20"/></w:rPr><w:t>Legenda</w:t></w:r><w:r><w:rPr><w:rFonts w:ascii="Times New Roman" w:hAnsi="Times New Roman" w:cs="Times New Roman"/><w:sz w:val="20"/><w:szCs w:val="20"/></w:rPr><w:t xml:space="preserve">:              </w:t></w:r><w:r><w:rPr><w:rFonts w:ascii="Times New Roman" w:hAnsi="Times New Roman" w:cs="Times New Roman"/><w:b/><w:sz w:val="20"/><w:szCs w:val="20"/></w:rPr><w:t xml:space="preserve">  A </w:t></w:r><w:r><w:rPr><w:rFonts w:ascii="Times New Roman" w:hAnsi="Times New Roman" w:cs="Times New Roman"/><w:sz w:val="20"/><w:szCs w:val="20"/></w:rPr><w:t xml:space="preserve">– Aprovado                 </w:t></w:r><w:r><w:rPr><w:rFonts w:ascii="Times New Roman" w:hAnsi="Times New Roman" w:cs="Times New Roman"/><w:b/><w:sz w:val="20"/><w:szCs w:val="20"/></w:rPr><w:t xml:space="preserve">R </w:t></w:r><w:r><w:rPr><w:rFonts w:ascii="Times New Roman" w:hAnsi="Times New Roman" w:cs="Times New Roman"/><w:sz w:val="20"/><w:szCs w:val="20"/></w:rPr><w:t xml:space="preserve">– Reprovado            </w:t></w:r><w:r><w:rPr><w:rFonts w:ascii="Times New Roman" w:hAnsi="Times New Roman" w:cs="Times New Roman"/><w:b/><w:sz w:val="20"/><w:szCs w:val="20"/></w:rPr><w:t xml:space="preserve"> NA</w:t></w:r><w:r><w:rPr><w:rFonts w:ascii="Times New Roman" w:hAnsi="Times New Roman" w:cs="Times New Roman"/><w:sz w:val="20"/><w:szCs w:val="20"/></w:rPr><w:t xml:space="preserve"> – Não Aplicável</w:t></w:r></w:p></w:tc></w:tr></w:tbl><w:p><w:pPr><w:spacing w:after="0"/><w:ind w:left="-567"/><w:rPr><w:rFonts w:ascii="Arial" w:hAnsi="Arial" w:cs="Arial"/><w:b/><w:sz w:val="20"/><w:szCs w:val="20"/></w:rPr></w:pPr></w:p><w:tbl><w:tblPr><w:tblStyle w:val="Tabelacomgrade"/><w:tblW w:w="9764" w:type="dxa"/><w:tblInd w:w="-459" w:type="dxa"/><w:shd w:val="clear" w:color="auto" w:fill="FFFF00"/><w:tblLook w:val="04A0" w:firstRow="1" w:lastRow="0" w:firstColumn="1" w:lastColumn="0" w:noHBand="0" w:noVBand="1"/></w:tblPr><w:tblGrid><w:gridCol w:w="9764"/></w:tblGrid><w:tr><w:trPr><w:trHeight w:val="403"/></w:trPr><w:tc><w:tcPr><w:tcW w:w="9764" w:type="dxa"/><w:tcBorders><w:top w:val="single" w:sz="4" w:space="0" w:color="1B407E"/><w:left w:val="single" w:sz="4" w:space="0" w:color="1B407E"/><w:bottom w:val="single" w:sz="4" w:space="0" w:color="1B407E"/><w:right w:val="single" w:sz="4" w:space="0" w:color="1B407E"/></w:tcBorders><w:shd w:val="clear" w:color="auto" w:fill="1B407E"/><w:vAlign w:val="center"/></w:tcPr><w:p><w:pPr><w:rPr><w:rFonts w:ascii="Times New Roman" w:hAnsi="Times New Roman" w:cs="Times New Roman"/><w:b/><w:sz w:val="24"/><w:szCs w:val="24"/></w:rPr></w:pPr><w:bookmarkStart w:id="1" w:name="_Hlk224656454"/><w:r><w:rPr><w:rFonts w:ascii="Times New Roman" w:hAnsi="Times New Roman" w:cs="Times New Roman"/><w:b/><w:color w:val="FFFFFF" w:themeColor="background1"/><w:sz w:val="24"/><w:szCs w:val="24"/></w:rPr><w:t>1 - OBJETIVO</w:t></w:r></w:p></w:tc></w:tr></w:tbl><w:bookmarkEnd w:id="1"/><w:p><w:pPr><w:pStyle w:val="PargrafodaLista"/><w:spacing w:before="120" w:after="0"/><w:ind w:left="-284"/><w:contextualSpacing w:val="0"/><w:jc w:val="both"/><w:rPr><w:rFonts w:ascii="Times New Roman" w:hAnsi="Times New Roman" w:cs="Times New Roman"/></w:rPr></w:pPr><w:r><w:rPr><w:rFonts w:ascii="Times New Roman" w:hAnsi="Times New Roman" w:cs="Times New Roman"/></w:rPr><w:t xml:space="preserve">O objetivo da inspeção </w:t></w:r><w:r><w:rPr><w:rFonts w:ascii="Times New Roman" w:hAnsi="Times New Roman" w:cs="Times New Roman"/></w:rPr><w:t xml:space="preserve">visual </w:t></w:r><w:r><w:rPr><w:rFonts w:ascii="Times New Roman" w:hAnsi="Times New Roman" w:cs="Times New Roman"/></w:rPr><w:t>de um isotank (ou tanque isotérmico) é garantir que o equipamento esteja em condições seguras, legais e operacionais para o transporte e armazenamento de produtos — especialmente produtos químicos perigosos, gases liquefeitos ou alimentos líquidos.</w:t></w:r></w:p><w:p><w:pPr><w:pStyle w:val="PargrafodaLista"/><w:spacing w:before="120" w:after="0"/><w:ind w:left="-142"/><w:contextualSpacing w:val="0"/><w:jc w:val="both"/><w:rPr><w:rFonts w:ascii="Times New Roman" w:hAnsi="Times New Roman" w:cs="Times New Roman"/></w:rPr></w:pPr><w:r><w:rPr><w:rFonts w:ascii="Times New Roman" w:hAnsi="Times New Roman" w:cs="Times New Roman"/><w:b/><w:color w:val="FFFFFF" w:themeColor="background1"/><w:sz w:val="24"/><w:szCs w:val="24"/></w:rPr><w:t>BJETIVO</w:t></w:r><w:r><w:rPr><w:rFonts w:ascii="Times New Roman" w:hAnsi="Times New Roman" w:cs="Times New Roman"/><w:b/><w:color w:val="FFFFFF" w:themeColor="background1"/><w:sz w:val="24"/><w:szCs w:val="24"/></w:rPr><w:t xml:space="preserve"> - OB</w:t></w:r></w:p><w:tbl><w:tblPr><w:tblStyle w:val="Tabelacomgrade"/><w:tblW w:w="9764" w:type="dxa"/><w:tblInd w:w="-459" w:type="dxa"/><w:shd w:val="clear" w:color="auto" w:fill="FFFF00"/><w:tblLook w:val="04A0" w:firstRow="1" w:lastRow="0" w:firstColumn="1" w:lastColumn="0" w:noHBand="0" w:noVBand="1"/></w:tblPr><w:tblGrid><w:gridCol w:w="9764"/></w:tblGrid><w:tr><w:trPr><w:trHeight w:val="403"/></w:trPr><w:tc><w:tcPr><w:tcW w:w="9764" w:type="dxa"/><w:tcBorders><w:top w:val="single" w:sz="4" w:space="0" w:color="1B407E"/><w:left w:val="single" w:sz="4" w:space="0" w:color="1B407E"/><w:bottom w:val="single" w:sz="4" w:space="0" w:color="1B407E"/><w:right w:val="single" w:sz="4" w:space="0" w:color="1B407E"/></w:tcBorders><w:shd w:val="clear" w:color="auto" w:fill="1B407E"/><w:vAlign w:val="center"/></w:tcPr><w:p><w:pPr><w:rPr><w:rFonts w:ascii="Times New Roman" w:hAnsi="Times New Roman" w:cs="Times New Roman"/><w:b/><w:sz w:val="24"/><w:szCs w:val="24"/></w:rPr></w:pPr><w:r><w:rPr><w:rFonts w:ascii="Times New Roman" w:hAnsi="Times New Roman" w:cs="Times New Roman"/><w:b/><w:color w:val="FFFFFF" w:themeColor="background1"/><w:sz w:val="24"/><w:szCs w:val="24"/></w:rPr><w:t>2 – DADOS TÉCNICOS</w:t></w:r></w:p></w:tc></w:tr></w:tbl><w:tbl><w:tblPr><w:tblpPr w:leftFromText="141" w:rightFromText="141" w:vertAnchor="text" w:horzAnchor="margin" w:tblpXSpec="center" w:tblpY="274"/><w:tblW w:w="9640" w:type="dxa"/><w:tblCellMar><w:left w:w="70" w:type="dxa"/><w:right w:w="70" w:type="dxa"/></w:tblCellMar><w:tblLook w:val="04A0" w:firstRow="1" w:lastRow="0" w:firstColumn="1" w:lastColumn="0" w:noHBand="0" w:noVBand="1"/></w:tblPr><w:tblGrid><w:gridCol w:w="7240"/><w:gridCol w:w="2400"/></w:tblGrid><w:tr><w:trPr><w:trHeight w:val="315"/></w:trPr><w:tc><w:tcPr><w:tcW w:w="7240" w:type="dxa"/><w:tcBorders><w:top w:val="single" w:sz="4" w:space="0" w:color="auto"/><w:left w:val="single" w:sz="4" w:space="0" w:color="auto"/><w:bottom w:val="single" w:sz="4" w:space="0" w:color="auto"/><w:right w:val="single" w:sz="4" w:space="0" w:color="auto"/></w:tcBorders><w:noWrap/><w:vAlign w:val="bottom"/></w:tcPr><w:p><w:pPr><w:pStyle w:val="Ttulo2"/><w:jc w:val="center"/><w:rPr><w:rFonts w:eastAsia="Times New Roman"/><w:b/><w:bCs/><w:color w:val="auto"/><w:sz w:val="24"/><w:szCs w:val="24"/><w:lang w:eastAsia="pt-BR"/></w:rPr></w:pPr><w:r><w:rPr><w:rFonts w:eastAsia="Times New Roman"/><w:b/><w:bCs/><w:color w:val="auto"/><w:sz w:val="24"/><w:szCs w:val="24"/><w:lang w:eastAsia="pt-BR"/></w:rPr><w:t>Data da Inspeção</w:t></w:r></w:p></w:tc><w:tc><w:tcPr><w:tcW w:w="2400" w:type="dxa"/><w:tcBorders><w:top w:val="single" w:sz="4" w:space="0" w:color="auto"/><w:left w:val="nil"/><w:bottom w:val="single" w:sz="4" w:space="0" w:color="auto"/><w:right w:val="single" w:sz="4" w:space="0" w:color="auto"/></w:tcBorders></w:tcPr><w:p><w:pPr><w:pStyle w:val="Ttulo2"/><w:jc w:val="center"/><w:rPr><w:rFonts w:eastAsia="Times New Roman"/><w:color w:val="1F497D" w:themeColor="text2"/><w:sz w:val="24"/><w:szCs w:val="24"/><w:lang w:eastAsia="pt-BR"/></w:rPr></w:pPr><w:r><w:rPr><w:rFonts w:eastAsia="Times New Roman"/><w:color w:val="1F497D" w:themeColor="text2"/><w:sz w:val="24"/><w:szCs w:val="24"/><w:lang w:eastAsia="pt-BR"/></w:rPr><w:t>1</w:t></w:r><w:r><w:rPr><w:rFonts w:eastAsia="Times New Roman"/><w:color w:val="1F497D" w:themeColor="text2"/><w:sz w:val="24"/><w:szCs w:val="24"/><w:lang w:eastAsia="pt-BR"/></w:rPr><w:t>7</w:t></w:r><w:r><w:rPr><w:rFonts w:eastAsia="Times New Roman"/><w:color w:val="1F497D" w:themeColor="text2"/><w:sz w:val="24"/><w:szCs w:val="24"/><w:lang w:eastAsia="pt-BR"/></w:rPr><w:t>/</w:t></w:r><w:r><w:rPr><w:rFonts w:eastAsia="Times New Roman"/><w:color w:val="1F497D" w:themeColor="text2"/><w:sz w:val="24"/><w:szCs w:val="24"/><w:lang w:eastAsia="pt-BR"/></w:rPr><w:t>03</w:t></w:r><w:r><w:rPr><w:rFonts w:eastAsia="Times New Roman"/><w:color w:val="1F497D" w:themeColor="text2"/><w:sz w:val="24"/><w:szCs w:val="24"/><w:lang w:eastAsia="pt-BR"/></w:rPr><w:t>/202</w:t></w:r><w:r><w:rPr><w:rFonts w:eastAsia="Times New Roman"/><w:color w:val="1F497D" w:themeColor="text2"/><w:sz w:val="24"/><w:szCs w:val="24"/><w:lang w:eastAsia="pt-BR"/></w:rPr><w:t>6</w:t></w:r></w:p></w:tc></w:tr><w:tr><w:trPr><w:trHeight w:val="315"/></w:trPr><w:tc><w:tcPr><w:tcW w:w="7240" w:type="dxa"/><w:tcBorders><w:top w:val="single" w:sz="4" w:space="0" w:color="auto"/><w:left w:val="single" w:sz="4" w:space="0" w:color="auto"/><w:bottom w:val="single" w:sz="4" w:space="0" w:color="auto"/><w:right w:val="single" w:sz="4" w:space="0" w:color="auto"/></w:tcBorders><w:noWrap/><w:vAlign w:val="bottom"/><w:hideMark/></w:tcPr><w:p><w:pPr><w:pStyle w:val="Ttulo2"/><w:jc w:val="center"/><w:rPr><w:rFonts w:eastAsia="Times New Roman"/><w:b/><w:bCs/><w:color w:val="auto"/><w:sz w:val="24"/><w:szCs w:val="24"/><w:lang w:eastAsia="pt-BR"/></w:rPr></w:pPr><w:r><w:rPr><w:rFonts w:eastAsia="Times New Roman"/><w:b/><w:bCs/><w:color w:val="auto"/><w:sz w:val="24"/><w:szCs w:val="24"/><w:lang w:eastAsia="pt-BR"/></w:rPr><w:t>Tipo de Equipamento</w:t></w:r></w:p></w:tc><w:tc><w:tcPr><w:tcW w:w="2400" w:type="dxa"/><w:tcBorders><w:top w:val="single" w:sz="4" w:space="0" w:color="auto"/><w:left w:val="nil"/><w:bottom w:val="single" w:sz="4" w:space="0" w:color="auto"/><w:right w:val="single" w:sz="4" w:space="0" w:color="auto"/></w:tcBorders></w:tcPr><w:p><w:pPr><w:pStyle w:val="Ttulo2"/><w:jc w:val="center"/><w:rPr><w:rFonts w:eastAsia="Times New Roman"/><w:color w:val="1F497D" w:themeColor="text2"/><w:sz w:val="24"/><w:szCs w:val="24"/><w:lang w:eastAsia="pt-BR"/></w:rPr></w:pPr><w:r><w:rPr><w:rFonts w:eastAsia="Times New Roman"/><w:color w:val="1F497D" w:themeColor="text2"/><w:sz w:val="24"/><w:szCs w:val="24"/><w:lang w:eastAsia="pt-BR"/></w:rPr><w:t>ISOTANK</w:t></w:r></w:p></w:tc></w:tr><w:tr><w:trPr><w:trHeight w:val="315"/></w:trPr><w:tc><w:tcPr><w:tcW w:w="7240" w:type="dxa"/><w:tcBorders><w:top w:val="single" w:sz="4" w:space="0" w:color="auto"/><w:left w:val="single" w:sz="4" w:space="0" w:color="auto"/><w:bottom w:val="single" w:sz="4" w:space="0" w:color="auto"/><w:right w:val="single" w:sz="4" w:space="0" w:color="auto"/></w:tcBorders><w:noWrap/><w:vAlign w:val="bottom"/><w:hideMark/></w:tcPr><w:p><w:pPr><w:pStyle w:val="Ttulo2"/><w:jc w:val="center"/><w:rPr><w:rFonts w:eastAsia="Times New Roman"/><w:b/><w:bCs/><w:color w:val="auto"/><w:sz w:val="24"/><w:szCs w:val="24"/><w:lang w:eastAsia="pt-BR"/></w:rPr></w:pPr><w:r><w:rPr><w:rFonts w:eastAsia="Times New Roman"/><w:b/><w:bCs/><w:color w:val="auto"/><w:sz w:val="24"/><w:szCs w:val="24"/><w:lang w:eastAsia="pt-BR"/></w:rPr><w:t>N° de Identificação</w:t></w:r></w:p></w:tc><w:tc><w:tcPr><w:tcW w:w="2400" w:type="dxa"/><w:tcBorders><w:top w:val="single" w:sz="4" w:space="0" w:color="auto"/><w:left w:val="nil"/><w:bottom w:val="single" w:sz="4" w:space="0" w:color="auto"/><w:right w:val="single" w:sz="4" w:space="0" w:color="auto"/></w:tcBorders></w:tcPr><w:p><w:pPr><w:pStyle w:val="Ttulo2"/><w:jc w:val="center"/><w:rPr><w:rFonts w:eastAsia="Times New Roman"/><w:color w:val="1F497D" w:themeColor="text2"/><w:sz w:val="24"/><w:szCs w:val="24"/><w:lang w:eastAsia="pt-BR"/></w:rPr></w:pPr><w:r><w:rPr><w:rFonts w:eastAsia="Times New Roman"/><w:color w:val="1F497D" w:themeColor="text2"/><w:sz w:val="24"/><w:szCs w:val="24"/><w:lang w:eastAsia="pt-BR"/></w:rPr><w:t xml:space="preserve">SUTU </w:t></w:r><w:r><w:rPr><w:rFonts w:eastAsia="Times New Roman"/><w:color w:val="1F497D" w:themeColor="text2"/><w:sz w:val="24"/><w:szCs w:val="24"/><w:lang w:eastAsia="pt-BR"/></w:rPr><w:t>258026-0</w:t></w:r></w:p></w:tc></w:tr><w:tr><w:trPr><w:trHeight w:val="315"/></w:trPr><w:tc><w:tcPr><w:tcW w:w="7240" w:type="dxa"/><w:tcBorders><w:top w:val="single" w:sz="4" w:space="0" w:color="auto"/><w:left w:val="single" w:sz="4" w:space="0" w:color="auto"/><w:bottom w:val="single" w:sz="4" w:space="0" w:color="auto"/><w:right w:val="single" w:sz="4" w:space="0" w:color="auto"/></w:tcBorders><w:noWrap/><w:vAlign w:val="bottom"/><w:hideMark/></w:tcPr><w:p><w:pPr><w:pStyle w:val="Ttulo2"/><w:jc w:val="center"/><w:rPr><w:rFonts w:eastAsia="Times New Roman"/><w:b/><w:bCs/><w:color w:val="auto"/><w:sz w:val="24"/><w:szCs w:val="24"/><w:lang w:eastAsia="pt-BR"/></w:rPr></w:pPr><w:r><w:rPr><w:rFonts w:eastAsia="Times New Roman"/><w:b/><w:bCs/><w:color w:val="auto"/><w:sz w:val="24"/><w:szCs w:val="24"/><w:lang w:eastAsia="pt-BR"/></w:rPr><w:t>Fabricante</w:t></w:r></w:p></w:tc><w:tc><w:tcPr><w:tcW w:w="2400" w:type="dxa"/><w:tcBorders><w:top w:val="single" w:sz="4" w:space="0" w:color="auto"/><w:left w:val="nil"/><w:bottom w:val="single" w:sz="4" w:space="0" w:color="auto"/><w:right w:val="single" w:sz="4" w:space="0" w:color="auto"/></w:tcBorders></w:tcPr><w:p><w:pPr><w:pStyle w:val="Ttulo2"/><w:jc w:val="center"/><w:rPr><w:rFonts w:eastAsia="Times New Roman"/><w:color w:val="17365D" w:themeColor="text2" w:themeShade="BF"/><w:sz w:val="24"/><w:szCs w:val="24"/><w:lang w:eastAsia="pt-BR"/></w:rPr></w:pPr><w:r><w:rPr><w:rFonts w:eastAsia="Times New Roman"/><w:color w:val="1F497D" w:themeColor="text2"/><w:sz w:val="24"/><w:szCs w:val="24"/><w:lang w:eastAsia="pt-BR"/></w:rPr><w:t>C</w:t></w:r><w:r><w:rPr><w:rFonts w:eastAsia="Times New Roman"/><w:color w:val="1F497D" w:themeColor="text2"/><w:sz w:val="24"/><w:szCs w:val="24"/><w:lang w:eastAsia="pt-BR"/></w:rPr><w:t>IMC</w:t></w:r></w:p></w:tc></w:tr><w:tr><w:trPr><w:trHeight w:val="315"/></w:trPr><w:tc><w:tcPr><w:tcW w:w="7240" w:type="dxa"/><w:tcBorders><w:top w:val="single" w:sz="4" w:space="0" w:color="auto"/><w:left w:val="single" w:sz="4" w:space="0" w:color="auto"/><w:bottom w:val="single" w:sz="4" w:space="0" w:color="auto"/><w:right w:val="single" w:sz="4" w:space="0" w:color="auto"/></w:tcBorders><w:noWrap/><w:vAlign w:val="bottom"/><w:hideMark/></w:tcPr><w:p><w:pPr><w:pStyle w:val="Ttulo2"/><w:jc w:val="center"/><w:rPr><w:rFonts w:eastAsia="Times New Roman"/><w:b/><w:bCs/><w:color w:val="auto"/><w:sz w:val="24"/><w:szCs w:val="24"/><w:lang w:eastAsia="pt-BR"/></w:rPr></w:pPr><w:r><w:rPr><w:rFonts w:eastAsia="Times New Roman"/><w:b/><w:bCs/><w:color w:val="auto"/><w:sz w:val="24"/><w:szCs w:val="24"/><w:lang w:eastAsia="pt-BR"/></w:rPr><w:t>N° de Série</w:t></w:r></w:p></w:tc><w:tc><w:tcPr><w:tcW w:w="2400" w:type="dxa"/><w:tcBorders><w:top w:val="single" w:sz="4" w:space="0" w:color="auto"/><w:left w:val="nil"/><w:bottom w:val="single" w:sz="4" w:space="0" w:color="auto"/><w:right w:val="single" w:sz="4" w:space="0" w:color="auto"/></w:tcBorders></w:tcPr><w:p><w:pPr><w:pStyle w:val="Ttulo2"/><w:jc w:val="center"/><w:rPr><w:rFonts w:eastAsia="Times New Roman"/><w:color w:val="auto"/><w:sz w:val="24"/><w:szCs w:val="24"/><w:lang w:eastAsia="pt-BR"/></w:rPr></w:pPr><w:r><w:rPr><w:rFonts w:eastAsia="Times New Roman"/><w:color w:val="1F497D" w:themeColor="text2"/><w:sz w:val="24"/><w:szCs w:val="24"/><w:lang w:eastAsia="pt-BR"/></w:rPr><w:t>NCTE1</w:t></w:r><w:r><w:rPr><w:rFonts w:eastAsia="Times New Roman"/><w:color w:val="1F497D" w:themeColor="text2"/><w:sz w:val="24"/><w:szCs w:val="24"/><w:lang w:eastAsia="pt-BR"/></w:rPr><w:t>8</w:t></w:r><w:r><w:rPr><w:rFonts w:eastAsia="Times New Roman"/><w:color w:val="1F497D" w:themeColor="text2"/><w:sz w:val="24"/><w:szCs w:val="24"/><w:lang w:eastAsia="pt-BR"/></w:rPr><w:t>T 1</w:t></w:r><w:r><w:rPr><w:rFonts w:eastAsia="Times New Roman"/><w:color w:val="1F497D" w:themeColor="text2"/><w:sz w:val="24"/><w:szCs w:val="24"/><w:lang w:eastAsia="pt-BR"/></w:rPr><w:t>5</w:t></w:r><w:r><w:rPr><w:rFonts w:eastAsia="Times New Roman"/><w:color w:val="1F497D" w:themeColor="text2"/><w:sz w:val="24"/><w:szCs w:val="24"/><w:lang w:eastAsia="pt-BR"/></w:rPr><w:t>447</w:t></w:r></w:p></w:tc></w:tr><w:tr><w:trPr><w:trHeight w:val="315"/></w:trPr><w:tc><w:tcPr><w:tcW w:w="7240" w:type="dxa"/><w:tcBorders><w:top w:val="single" w:sz="4" w:space="0" w:color="auto"/><w:left w:val="single" w:sz="4" w:space="0" w:color="auto"/><w:bottom w:val="single" w:sz="4" w:space="0" w:color="auto"/><w:right w:val="single" w:sz="4" w:space="0" w:color="auto"/></w:tcBorders><w:noWrap/><w:vAlign w:val="bottom"/><w:hideMark/></w:tcPr><w:p><w:pPr><w:pStyle w:val="Ttulo2"/><w:jc w:val="center"/><w:rPr><w:rFonts w:eastAsia="Times New Roman"/><w:b/><w:bCs/><w:color w:val="auto"/><w:sz w:val="24"/><w:szCs w:val="24"/><w:lang w:eastAsia="pt-BR"/></w:rPr></w:pPr><w:r><w:rPr><w:rFonts w:eastAsia="Times New Roman"/><w:b/><w:bCs/><w:color w:val="auto"/><w:sz w:val="24"/><w:szCs w:val="24"/><w:lang w:eastAsia="pt-BR"/></w:rPr><w:t>País de Fabricação</w:t></w:r></w:p></w:tc><w:tc><w:tcPr><w:tcW w:w="2400" w:type="dxa"/><w:tcBorders><w:top w:val="single" w:sz="4" w:space="0" w:color="auto"/><w:left w:val="nil"/><w:bottom w:val="single" w:sz="4" w:space="0" w:color="auto"/><w:right w:val="single" w:sz="4" w:space="0" w:color="auto"/></w:tcBorders></w:tcPr><w:p><w:pPr><w:pStyle w:val="Ttulo2"/><w:jc w:val="center"/><w:rPr><w:rFonts w:eastAsia="Times New Roman"/><w:color w:val="17365D" w:themeColor="text2" w:themeShade="BF"/><w:sz w:val="24"/><w:szCs w:val="24"/><w:lang w:eastAsia="pt-BR"/></w:rPr></w:pPr><w:r><w:rPr><w:rFonts w:eastAsia="Times New Roman"/><w:color w:val="17365D" w:themeColor="text2" w:themeShade="BF"/><w:sz w:val="24"/><w:szCs w:val="24"/><w:lang w:eastAsia="pt-BR"/></w:rPr><w:t>CHINA</w:t></w:r></w:p></w:tc></w:tr><w:tr><w:trPr><w:trHeight w:val="315"/></w:trPr><w:tc><w:tcPr><w:tcW w:w="7240" w:type="dxa"/><w:tcBorders><w:top w:val="single" w:sz="4" w:space="0" w:color="auto"/><w:left w:val="single" w:sz="4" w:space="0" w:color="auto"/><w:bottom w:val="single" w:sz="4" w:space="0" w:color="auto"/><w:right w:val="single" w:sz="4" w:space="0" w:color="auto"/></w:tcBorders><w:noWrap/><w:vAlign w:val="bottom"/><w:hideMark/></w:tcPr><w:p><w:pPr><w:pStyle w:val="Ttulo2"/><w:jc w:val="center"/><w:rPr><w:rFonts w:eastAsia="Times New Roman"/><w:b/><w:bCs/><w:color w:val="auto"/><w:sz w:val="24"/><w:szCs w:val="24"/><w:lang w:eastAsia="pt-BR"/></w:rPr></w:pPr><w:r><w:rPr><w:rFonts w:eastAsia="Times New Roman"/><w:b/><w:bCs/><w:color w:val="auto"/><w:sz w:val="24"/><w:szCs w:val="24"/><w:lang w:eastAsia="pt-BR"/></w:rPr><w:t>Tamanho</w:t></w:r></w:p></w:tc><w:tc><w:tcPr><w:tcW w:w="2400" w:type="dxa"/><w:tcBorders><w:top w:val="single" w:sz="4" w:space="0" w:color="auto"/><w:left w:val="nil"/><w:bottom w:val="single" w:sz="4" w:space="0" w:color="auto"/><w:right w:val="single" w:sz="4" w:space="0" w:color="auto"/></w:tcBorders></w:tcPr><w:p><w:pPr><w:pStyle w:val="Ttulo2"/><w:jc w:val="center"/><w:rPr><w:rFonts w:eastAsia="Times New Roman"/><w:color w:val="17365D" w:themeColor="text2" w:themeShade="BF"/><w:sz w:val="24"/><w:szCs w:val="24"/><w:lang w:eastAsia="pt-BR"/></w:rPr></w:pPr><w:r><w:rPr><w:rFonts w:eastAsia="Times New Roman"/><w:color w:val="17365D" w:themeColor="text2" w:themeShade="BF"/><w:sz w:val="24"/><w:szCs w:val="24"/><w:lang w:eastAsia="pt-BR"/></w:rPr><w:t xml:space="preserve">20FT </w:t></w:r></w:p></w:tc></w:tr><w:tr><w:trPr><w:trHeight w:val="315"/></w:trPr><w:tc><w:tcPr><w:tcW w:w="7240" w:type="dxa"/><w:tcBorders><w:top w:val="single" w:sz="4" w:space="0" w:color="auto"/><w:left w:val="single" w:sz="4" w:space="0" w:color="auto"/><w:bottom w:val="single" w:sz="4" w:space="0" w:color="auto"/><w:right w:val="single" w:sz="4" w:space="0" w:color="auto"/></w:tcBorders><w:noWrap/><w:vAlign w:val="bottom"/><w:hideMark/></w:tcPr><w:p><w:pPr><w:pStyle w:val="Ttulo2"/><w:jc w:val="center"/><w:rPr><w:rFonts w:eastAsia="Times New Roman"/><w:b/><w:bCs/><w:color w:val="auto"/><w:sz w:val="24"/><w:szCs w:val="24"/><w:lang w:eastAsia="pt-BR"/></w:rPr></w:pPr><w:r><w:rPr><w:rFonts w:eastAsia="Times New Roman"/><w:b/><w:bCs/><w:color w:val="auto"/><w:sz w:val="24"/><w:szCs w:val="24"/><w:lang w:eastAsia="pt-BR"/></w:rPr><w:t>Capacidade Líquida Nominal</w:t></w:r></w:p></w:tc><w:tc><w:tcPr><w:tcW w:w="2400" w:type="dxa"/><w:tcBorders><w:top w:val="single" w:sz="4" w:space="0" w:color="auto"/><w:left w:val="nil"/><w:bottom w:val="single" w:sz="4" w:space="0" w:color="auto"/><w:right w:val="single" w:sz="4" w:space="0" w:color="auto"/></w:tcBorders></w:tcPr><w:p><w:pPr><w:pStyle w:val="Ttulo2"/><w:jc w:val="center"/><w:rPr><w:rFonts w:eastAsia="Times New Roman"/><w:color w:val="17365D" w:themeColor="text2" w:themeShade="BF"/><w:sz w:val="24"/><w:szCs w:val="24"/><w:lang w:eastAsia="pt-BR"/></w:rPr></w:pPr><w:r><w:rPr><w:rFonts w:eastAsia="Times New Roman"/><w:color w:val="17365D" w:themeColor="text2" w:themeShade="BF"/><w:sz w:val="24"/><w:szCs w:val="24"/><w:lang w:eastAsia="pt-BR"/></w:rPr><w:t>2</w:t></w:r><w:r><w:rPr><w:rFonts w:eastAsia="Times New Roman"/><w:color w:val="17365D" w:themeColor="text2" w:themeShade="BF"/><w:sz w:val="24"/><w:szCs w:val="24"/><w:lang w:eastAsia="pt-BR"/></w:rPr><w:t>5000</w:t></w:r><w:r><w:rPr><w:rFonts w:eastAsia="Times New Roman"/><w:color w:val="17365D" w:themeColor="text2" w:themeShade="BF"/><w:sz w:val="24"/><w:szCs w:val="24"/><w:lang w:eastAsia="pt-BR"/></w:rPr><w:t xml:space="preserve"> L</w:t></w:r></w:p></w:tc></w:tr><w:tr><w:trPr><w:trHeight w:val="315"/></w:trPr><w:tc><w:tcPr><w:tcW w:w="7240" w:type="dxa"/><w:tcBorders><w:top w:val="single" w:sz="4" w:space="0" w:color="auto"/><w:left w:val="single" w:sz="4" w:space="0" w:color="auto"/><w:bottom w:val="single" w:sz="4" w:space="0" w:color="auto"/><w:right w:val="single" w:sz="4" w:space="0" w:color="auto"/></w:tcBorders><w:noWrap/><w:vAlign w:val="bottom"/><w:hideMark/></w:tcPr><w:p><w:pPr><w:pStyle w:val="Ttulo2"/><w:jc w:val="center"/><w:rPr><w:rFonts w:eastAsia="Times New Roman"/><w:b/><w:bCs/><w:color w:val="auto"/><w:sz w:val="24"/><w:szCs w:val="24"/><w:lang w:eastAsia="pt-BR"/></w:rPr></w:pPr><w:r><w:rPr><w:rFonts w:eastAsia="Times New Roman"/><w:b/><w:bCs/><w:color w:val="auto"/><w:sz w:val="24"/><w:szCs w:val="24"/><w:lang w:eastAsia="pt-BR"/></w:rPr><w:t>Ano de Fabricação</w:t></w:r></w:p></w:tc><w:tc><w:tcPr><w:tcW w:w="2400" w:type="dxa"/><w:tcBorders><w:top w:val="single" w:sz="4" w:space="0" w:color="auto"/><w:left w:val="nil"/><w:bottom w:val="single" w:sz="4" w:space="0" w:color="auto"/><w:right w:val="single" w:sz="4" w:space="0" w:color="auto"/></w:tcBorders></w:tcPr><w:p><w:pPr><w:pStyle w:val="Ttulo2"/><w:jc w:val="center"/><w:rPr><w:rFonts w:eastAsia="Times New Roman"/><w:color w:val="17365D" w:themeColor="text2" w:themeShade="BF"/><w:sz w:val="24"/><w:szCs w:val="24"/><w:lang w:eastAsia="pt-BR"/></w:rPr></w:pPr><w:r><w:rPr><w:rFonts w:eastAsia="Times New Roman"/><w:color w:val="17365D" w:themeColor="text2" w:themeShade="BF"/><w:sz w:val="24"/><w:szCs w:val="24"/><w:lang w:eastAsia="pt-BR"/></w:rPr><w:t>201</w:t></w:r><w:r><w:rPr><w:rFonts w:eastAsia="Times New Roman"/><w:color w:val="17365D" w:themeColor="text2" w:themeShade="BF"/><w:sz w:val="24"/><w:szCs w:val="24"/><w:lang w:eastAsia="pt-BR"/></w:rPr><w:t>8</w:t></w:r></w:p></w:tc></w:tr><w:tr><w:trPr><w:trHeight w:val="315"/></w:trPr><w:tc><w:tcPr><w:tcW w:w="7240" w:type="dxa"/><w:tcBorders><w:top w:val="single" w:sz="4" w:space="0" w:color="auto"/><w:left w:val="single" w:sz="4" w:space="0" w:color="auto"/><w:bottom w:val="single" w:sz="4" w:space="0" w:color="auto"/><w:right w:val="single" w:sz="4" w:space="0" w:color="auto"/></w:tcBorders><w:noWrap/><w:vAlign w:val="bottom"/><w:hideMark/></w:tcPr><w:p><w:pPr><w:pStyle w:val="Ttulo2"/><w:jc w:val="center"/><w:rPr><w:rFonts w:eastAsia="Times New Roman"/><w:b/><w:bCs/><w:color w:val="auto"/><w:sz w:val="24"/><w:szCs w:val="24"/><w:lang w:eastAsia="pt-BR"/></w:rPr></w:pPr><w:r><w:rPr><w:rFonts w:eastAsia="Times New Roman"/><w:b/><w:bCs/><w:color w:val="auto"/><w:sz w:val="24"/><w:szCs w:val="24"/><w:lang w:eastAsia="pt-BR"/></w:rPr><w:t>Identificação</w:t></w:r></w:p></w:tc><w:tc><w:tcPr><w:tcW w:w="2400" w:type="dxa"/><w:tcBorders><w:top w:val="single" w:sz="4" w:space="0" w:color="auto"/><w:left w:val="nil"/><w:bottom w:val="single" w:sz="4" w:space="0" w:color="auto"/><w:right w:val="single" w:sz="4" w:space="0" w:color="auto"/></w:tcBorders></w:tcPr><w:p><w:pPr><w:pStyle w:val="Ttulo2"/><w:jc w:val="center"/><w:rPr><w:rFonts w:eastAsia="Times New Roman"/><w:color w:val="17365D" w:themeColor="text2" w:themeShade="BF"/><w:sz w:val="24"/><w:szCs w:val="24"/><w:lang w:eastAsia="pt-BR"/></w:rPr></w:pPr><w:r><w:rPr><w:rFonts w:eastAsia="Times New Roman"/><w:color w:val="17365D" w:themeColor="text2" w:themeShade="BF"/><w:sz w:val="24"/><w:szCs w:val="24"/><w:lang w:eastAsia="pt-BR"/></w:rPr><w:t>SUTU</w:t></w:r></w:p></w:tc></w:tr><w:tr><w:trPr><w:trHeight w:val="315"/></w:trPr><w:tc><w:tcPr><w:tcW w:w="7240" w:type="dxa"/><w:tcBorders><w:top w:val="single" w:sz="4" w:space="0" w:color="auto"/><w:left w:val="single" w:sz="4" w:space="0" w:color="auto"/><w:bottom w:val="single" w:sz="4" w:space="0" w:color="auto"/><w:right w:val="single" w:sz="4" w:space="0" w:color="auto"/></w:tcBorders><w:noWrap/><w:vAlign w:val="bottom"/><w:hideMark/></w:tcPr><w:p><w:pPr><w:pStyle w:val="Ttulo2"/><w:jc w:val="center"/><w:rPr><w:rFonts w:eastAsia="Times New Roman"/><w:b/><w:bCs/><w:color w:val="auto"/><w:sz w:val="24"/><w:szCs w:val="24"/><w:lang w:eastAsia="pt-BR"/></w:rPr></w:pPr><w:r><w:rPr><w:rFonts w:eastAsia="Times New Roman"/><w:b/><w:bCs/><w:color w:val="auto"/><w:sz w:val="24"/><w:szCs w:val="24"/><w:lang w:eastAsia="pt-BR"/></w:rPr><w:t>Tara</w:t></w:r></w:p></w:tc><w:tc><w:tcPr><w:tcW w:w="2400" w:type="dxa"/><w:tcBorders><w:top w:val="single" w:sz="4" w:space="0" w:color="auto"/><w:left w:val="nil"/><w:bottom w:val="single" w:sz="4" w:space="0" w:color="auto"/><w:right w:val="single" w:sz="4" w:space="0" w:color="auto"/></w:tcBorders></w:tcPr><w:p><w:pPr><w:pStyle w:val="Ttulo2"/><w:jc w:val="center"/><w:rPr><w:rFonts w:eastAsia="Times New Roman"/><w:color w:val="17365D" w:themeColor="text2" w:themeShade="BF"/><w:sz w:val="24"/><w:szCs w:val="24"/><w:lang w:eastAsia="pt-BR"/></w:rPr></w:pPr><w:r><w:rPr><w:rFonts w:eastAsia="Times New Roman"/><w:color w:val="17365D" w:themeColor="text2" w:themeShade="BF"/><w:sz w:val="24"/><w:szCs w:val="24"/><w:lang w:eastAsia="pt-BR"/></w:rPr><w:t>3</w:t></w:r><w:r><w:rPr><w:rFonts w:eastAsia="Times New Roman"/><w:color w:val="17365D" w:themeColor="text2" w:themeShade="BF"/><w:sz w:val="24"/><w:szCs w:val="24"/><w:lang w:eastAsia="pt-BR"/></w:rPr><w:t>7</w:t></w:r><w:r><w:rPr><w:rFonts w:eastAsia="Times New Roman"/><w:color w:val="17365D" w:themeColor="text2" w:themeShade="BF"/><w:sz w:val="24"/><w:szCs w:val="24"/><w:lang w:eastAsia="pt-BR"/></w:rPr><w:t>60</w:t></w:r><w:r><w:rPr><w:rFonts w:eastAsia="Times New Roman"/><w:color w:val="17365D" w:themeColor="text2" w:themeShade="BF"/><w:sz w:val="24"/><w:szCs w:val="24"/><w:lang w:eastAsia="pt-BR"/></w:rPr><w:t xml:space="preserve"> kg</w:t></w:r></w:p></w:tc></w:tr><w:tr><w:trPr><w:trHeight w:val="315"/></w:trPr><w:tc><w:tcPr><w:tcW w:w="7240" w:type="dxa"/><w:tcBorders><w:top w:val="single" w:sz="4" w:space="0" w:color="auto"/><w:left w:val="single" w:sz="4" w:space="0" w:color="auto"/><w:bottom w:val="single" w:sz="4" w:space="0" w:color="auto"/><w:right w:val="single" w:sz="4" w:space="0" w:color="auto"/></w:tcBorders><w:noWrap/><w:vAlign w:val="bottom"/><w:hideMark/></w:tcPr><w:p><w:pPr><w:pStyle w:val="Ttulo2"/><w:jc w:val="center"/><w:rPr><w:rFonts w:eastAsia="Times New Roman"/><w:b/><w:bCs/><w:color w:val="000000" w:themeColor="text1"/><w:sz w:val="24"/><w:szCs w:val="24"/><w:lang w:eastAsia="pt-BR"/></w:rPr></w:pPr><w:r><w:rPr><w:rFonts w:eastAsia="Times New Roman"/><w:b/><w:bCs/><w:color w:val="000000" w:themeColor="text1"/><w:sz w:val="24"/><w:szCs w:val="24"/><w:lang w:eastAsia="pt-BR"/></w:rPr><w:lastRenderedPageBreak/><w:t>Peso Carga Líquida</w:t></w:r></w:p></w:tc><w:tc><w:tcPr><w:tcW w:w="2400" w:type="dxa"/><w:tcBorders><w:top w:val="single" w:sz="4" w:space="0" w:color="auto"/><w:left w:val="nil"/><w:bottom w:val="single" w:sz="4" w:space="0" w:color="auto"/><w:right w:val="single" w:sz="4" w:space="0" w:color="auto"/></w:tcBorders></w:tcPr><w:p><w:pPr><w:pStyle w:val="Ttulo2"/><w:jc w:val="center"/><w:rPr><w:rFonts w:eastAsia="Times New Roman"/><w:color w:val="17365D" w:themeColor="text2" w:themeShade="BF"/><w:sz w:val="24"/><w:szCs w:val="24"/><w:lang w:eastAsia="pt-BR"/></w:rPr></w:pPr><w:r><w:rPr><w:rFonts w:eastAsia="Times New Roman"/><w:color w:val="17365D" w:themeColor="text2" w:themeShade="BF"/><w:sz w:val="24"/><w:szCs w:val="24"/><w:lang w:eastAsia="pt-BR"/></w:rPr><w:t>3</w:t></w:r><w:r><w:rPr><w:rFonts w:eastAsia="Times New Roman"/><w:color w:val="17365D" w:themeColor="text2" w:themeShade="BF"/><w:sz w:val="24"/><w:szCs w:val="24"/><w:lang w:eastAsia="pt-BR"/></w:rPr><w:t>2</w:t></w:r><w:r><w:rPr><w:rFonts w:eastAsia="Times New Roman"/><w:color w:val="17365D" w:themeColor="text2" w:themeShade="BF"/><w:sz w:val="24"/><w:szCs w:val="24"/><w:lang w:eastAsia="pt-BR"/></w:rPr><w:t>2</w:t></w:r><w:r><w:rPr><w:rFonts w:eastAsia="Times New Roman"/><w:color w:val="17365D" w:themeColor="text2" w:themeShade="BF"/><w:sz w:val="24"/><w:szCs w:val="24"/><w:lang w:eastAsia="pt-BR"/></w:rPr><w:t>4</w:t></w:r><w:r><w:rPr><w:rFonts w:eastAsia="Times New Roman"/><w:color w:val="17365D" w:themeColor="text2" w:themeShade="BF"/><w:sz w:val="24"/><w:szCs w:val="24"/><w:lang w:eastAsia="pt-BR"/></w:rPr><w:t>0</w:t></w:r><w:r><w:rPr><w:rFonts w:eastAsia="Times New Roman"/><w:color w:val="17365D" w:themeColor="text2" w:themeShade="BF"/><w:sz w:val="24"/><w:szCs w:val="24"/><w:lang w:eastAsia="pt-BR"/></w:rPr><w:t xml:space="preserve"> kg</w:t></w:r></w:p></w:tc></w:tr><w:tr><w:trPr><w:trHeight w:val="315"/></w:trPr><w:tc><w:tcPr><w:tcW w:w="7240" w:type="dxa"/><w:tcBorders><w:top w:val="single" w:sz="4" w:space="0" w:color="auto"/><w:left w:val="single" w:sz="4" w:space="0" w:color="auto"/><w:bottom w:val="single" w:sz="4" w:space="0" w:color="auto"/><w:right w:val="single" w:sz="4" w:space="0" w:color="auto"/></w:tcBorders><w:noWrap/><w:vAlign w:val="bottom"/><w:hideMark/></w:tcPr><w:p><w:pPr><w:pStyle w:val="Ttulo2"/><w:jc w:val="center"/><w:rPr><w:rFonts w:eastAsia="Times New Roman"/><w:b/><w:bCs/><w:color w:val="000000" w:themeColor="text1"/><w:sz w:val="24"/><w:szCs w:val="24"/><w:lang w:eastAsia="pt-BR"/></w:rPr></w:pPr><w:r><w:rPr><w:rFonts w:eastAsia="Times New Roman"/><w:b/><w:bCs/><w:color w:val="000000" w:themeColor="text1"/><w:sz w:val="24"/><w:szCs w:val="24"/><w:lang w:eastAsia="pt-BR"/></w:rPr><w:t>Peso Bruto Total</w:t></w:r></w:p></w:tc><w:tc><w:tcPr><w:tcW w:w="2400" w:type="dxa"/><w:tcBorders><w:top w:val="single" w:sz="4" w:space="0" w:color="auto"/><w:left w:val="nil"/><w:bottom w:val="single" w:sz="4" w:space="0" w:color="auto"/><w:right w:val="single" w:sz="4" w:space="0" w:color="auto"/></w:tcBorders></w:tcPr><w:p><w:pPr><w:pStyle w:val="Ttulo2"/><w:jc w:val="center"/><w:rPr><w:rFonts w:eastAsia="Times New Roman"/><w:color w:val="17365D" w:themeColor="text2" w:themeShade="BF"/><w:sz w:val="24"/><w:szCs w:val="24"/><w:lang w:eastAsia="pt-BR"/></w:rPr></w:pPr><w:r><w:rPr><w:rFonts w:eastAsia="Times New Roman"/><w:color w:val="17365D" w:themeColor="text2" w:themeShade="BF"/><w:sz w:val="24"/><w:szCs w:val="24"/><w:lang w:eastAsia="pt-BR"/></w:rPr><w:t>36000 kg</w:t></w:r></w:p></w:tc></w:tr><w:tr><w:trPr><w:trHeight w:val="315"/></w:trPr><w:tc><w:tcPr><w:tcW w:w="7240" w:type="dxa"/><w:tcBorders><w:top w:val="single" w:sz="4" w:space="0" w:color="auto"/><w:left w:val="single" w:sz="4" w:space="0" w:color="auto"/><w:bottom w:val="single" w:sz="4" w:space="0" w:color="auto"/><w:right w:val="single" w:sz="4" w:space="0" w:color="auto"/></w:tcBorders><w:noWrap/><w:vAlign w:val="bottom"/></w:tcPr><w:p><w:pPr><w:pStyle w:val="Ttulo2"/><w:jc w:val="center"/><w:rPr><w:rFonts w:eastAsia="Times New Roman"/><w:b/><w:bCs/><w:color w:val="000000" w:themeColor="text1"/><w:sz w:val="24"/><w:szCs w:val="24"/><w:lang w:eastAsia="pt-BR"/></w:rPr></w:pPr><w:r><w:rPr><w:rFonts w:eastAsia="Times New Roman"/><w:b/><w:bCs/><w:color w:val="000000" w:themeColor="text1"/><w:sz w:val="24"/><w:szCs w:val="24"/><w:lang w:eastAsia="pt-BR"/></w:rPr><w:t>Peso de empilhamento Permitido</w:t></w:r></w:p></w:tc><w:tc><w:tcPr><w:tcW w:w="2400" w:type="dxa"/><w:tcBorders><w:top w:val="single" w:sz="4" w:space="0" w:color="auto"/><w:left w:val="nil"/><w:bottom w:val="single" w:sz="4" w:space="0" w:color="auto"/><w:right w:val="single" w:sz="4" w:space="0" w:color="auto"/></w:tcBorders></w:tcPr><w:p><w:pPr><w:pStyle w:val="Ttulo2"/><w:jc w:val="center"/><w:rPr><w:rFonts w:eastAsia="Times New Roman"/><w:color w:val="17365D" w:themeColor="text2" w:themeShade="BF"/><w:sz w:val="24"/><w:szCs w:val="24"/><w:lang w:eastAsia="pt-BR"/></w:rPr></w:pPr><w:r><w:rPr><w:rFonts w:eastAsia="Times New Roman"/><w:color w:val="17365D" w:themeColor="text2" w:themeShade="BF"/><w:sz w:val="24"/><w:szCs w:val="24"/><w:lang w:eastAsia="pt-BR"/></w:rPr><w:t>192000 Kg</w:t></w:r></w:p></w:tc></w:tr><w:tr><w:trPr><w:trHeight w:val="315"/></w:trPr><w:tc><w:tcPr><w:tcW w:w="7240" w:type="dxa"/><w:tcBorders><w:top w:val="single" w:sz="4" w:space="0" w:color="auto"/><w:left w:val="single" w:sz="4" w:space="0" w:color="auto"/><w:bottom w:val="single" w:sz="4" w:space="0" w:color="auto"/><w:right w:val="single" w:sz="4" w:space="0" w:color="auto"/></w:tcBorders><w:noWrap/><w:vAlign w:val="bottom"/><w:hideMark/></w:tcPr><w:p><w:pPr><w:pStyle w:val="Ttulo2"/><w:jc w:val="center"/><w:rPr><w:rFonts w:eastAsia="Times New Roman"/><w:b/><w:bCs/><w:color w:val="auto"/><w:sz w:val="24"/><w:szCs w:val="24"/><w:lang w:eastAsia="pt-BR"/></w:rPr></w:pPr><w:r><w:rPr><w:rFonts w:eastAsia="Times New Roman"/><w:b/><w:bCs/><w:color w:val="auto"/><w:sz w:val="24"/><w:szCs w:val="24"/><w:lang w:eastAsia="pt-BR"/></w:rPr><w:t>Norma de Fabricação</w:t></w:r></w:p></w:tc><w:tc><w:tcPr><w:tcW w:w="2400" w:type="dxa"/><w:tcBorders><w:top w:val="single" w:sz="4" w:space="0" w:color="auto"/><w:left w:val="nil"/><w:bottom w:val="single" w:sz="4" w:space="0" w:color="auto"/><w:right w:val="single" w:sz="4" w:space="0" w:color="auto"/></w:tcBorders></w:tcPr><w:p><w:pPr><w:pStyle w:val="Ttulo2"/><w:jc w:val="center"/><w:rPr><w:rFonts w:eastAsia="Times New Roman"/><w:color w:val="17365D" w:themeColor="text2" w:themeShade="BF"/><w:sz w:val="24"/><w:szCs w:val="24"/><w:lang w:eastAsia="pt-BR"/></w:rPr></w:pPr><w:r><w:rPr><w:rFonts w:eastAsia="Times New Roman"/><w:color w:val="17365D" w:themeColor="text2" w:themeShade="BF"/><w:sz w:val="24"/><w:szCs w:val="24"/><w:lang w:eastAsia="pt-BR"/></w:rPr><w:t>ASME SECT. VIII DIV. 1(NCS)</w:t></w:r></w:p></w:tc></w:tr><w:tr><w:trPr><w:trHeight w:val="315"/></w:trPr><w:tc><w:tcPr><w:tcW w:w="7240" w:type="dxa"/><w:tcBorders><w:top w:val="single" w:sz="4" w:space="0" w:color="auto"/><w:left w:val="single" w:sz="4" w:space="0" w:color="auto"/><w:bottom w:val="single" w:sz="4" w:space="0" w:color="auto"/><w:right w:val="single" w:sz="4" w:space="0" w:color="auto"/></w:tcBorders><w:noWrap/><w:vAlign w:val="bottom"/><w:hideMark/></w:tcPr><w:p><w:pPr><w:pStyle w:val="Ttulo2"/><w:jc w:val="center"/><w:rPr><w:rFonts w:eastAsia="Times New Roman"/><w:b/><w:bCs/><w:color w:val="auto"/><w:sz w:val="24"/><w:szCs w:val="24"/><w:lang w:eastAsia="pt-BR"/></w:rPr></w:pPr><w:r><w:rPr><w:rFonts w:eastAsia="Times New Roman"/><w:b/><w:bCs/><w:color w:val="auto"/><w:sz w:val="24"/><w:szCs w:val="24"/><w:lang w:eastAsia="pt-BR"/></w:rPr><w:t>Pressão do Projeto</w:t></w:r></w:p></w:tc><w:tc><w:tcPr><w:tcW w:w="2400" w:type="dxa"/><w:tcBorders><w:top w:val="single" w:sz="4" w:space="0" w:color="auto"/><w:left w:val="nil"/><w:bottom w:val="single" w:sz="4" w:space="0" w:color="auto"/><w:right w:val="single" w:sz="4" w:space="0" w:color="auto"/></w:tcBorders></w:tcPr><w:p><w:pPr><w:pStyle w:val="Ttulo2"/><w:jc w:val="center"/><w:rPr><w:rFonts w:eastAsia="Times New Roman"/><w:color w:val="17365D" w:themeColor="text2" w:themeShade="BF"/><w:sz w:val="24"/><w:szCs w:val="24"/><w:lang w:eastAsia="pt-BR"/></w:rPr></w:pPr><w:r><w:rPr><w:rFonts w:eastAsia="Times New Roman"/><w:color w:val="17365D" w:themeColor="text2" w:themeShade="BF"/><w:sz w:val="24"/><w:szCs w:val="24"/><w:lang w:eastAsia="pt-BR"/></w:rPr><w:t>4</w:t></w:r><w:r><w:rPr><w:rFonts w:eastAsia="Times New Roman"/><w:color w:val="17365D" w:themeColor="text2" w:themeShade="BF"/><w:sz w:val="24"/><w:szCs w:val="24"/><w:lang w:eastAsia="pt-BR"/></w:rPr><w:t xml:space="preserve"> bar</w:t></w:r></w:p></w:tc></w:tr><w:tr><w:trPr><w:trHeight w:val="315"/></w:trPr><w:tc><w:tcPr><w:tcW w:w="7240" w:type="dxa"/><w:tcBorders><w:top w:val="single" w:sz="4" w:space="0" w:color="auto"/><w:left w:val="single" w:sz="4" w:space="0" w:color="auto"/><w:bottom w:val="single" w:sz="4" w:space="0" w:color="auto"/><w:right w:val="single" w:sz="4" w:space="0" w:color="auto"/></w:tcBorders><w:noWrap/><w:vAlign w:val="bottom"/><w:hideMark/></w:tcPr><w:p><w:pPr><w:pStyle w:val="Ttulo2"/><w:jc w:val="center"/><w:rPr><w:rFonts w:eastAsia="Times New Roman"/><w:b/><w:bCs/><w:color w:val="auto"/><w:sz w:val="24"/><w:szCs w:val="24"/><w:lang w:eastAsia="pt-BR"/></w:rPr></w:pPr><w:r><w:rPr><w:rFonts w:eastAsia="Times New Roman"/><w:b/><w:bCs/><w:color w:val="auto"/><w:sz w:val="24"/><w:szCs w:val="24"/><w:lang w:eastAsia="pt-BR"/></w:rPr><w:t>Pressão do Ensaio Hidrostático</w:t></w:r></w:p></w:tc><w:tc><w:tcPr><w:tcW w:w="2400" w:type="dxa"/><w:tcBorders><w:top w:val="single" w:sz="4" w:space="0" w:color="auto"/><w:left w:val="nil"/><w:bottom w:val="single" w:sz="4" w:space="0" w:color="auto"/><w:right w:val="single" w:sz="4" w:space="0" w:color="auto"/></w:tcBorders></w:tcPr><w:p><w:pPr><w:pStyle w:val="Ttulo2"/><w:jc w:val="center"/><w:rPr><w:rFonts w:eastAsia="Times New Roman"/><w:b/><w:bCs/><w:color w:val="17365D" w:themeColor="text2" w:themeShade="BF"/><w:sz w:val="24"/><w:szCs w:val="24"/><w:lang w:eastAsia="pt-BR"/></w:rPr></w:pPr><w:r><w:rPr><w:rFonts w:eastAsia="Times New Roman"/><w:color w:val="0F243E" w:themeColor="text2" w:themeShade="80"/><w:sz w:val="24"/><w:szCs w:val="24"/><w:lang w:eastAsia="pt-BR"/></w:rPr><w:t>6</w:t></w:r><w:r><w:rPr><w:rFonts w:eastAsia="Times New Roman"/><w:color w:val="0F243E" w:themeColor="text2" w:themeShade="80"/><w:sz w:val="24"/><w:szCs w:val="24"/><w:lang w:eastAsia="pt-BR"/></w:rPr><w:t xml:space="preserve"> bar</w:t></w:r></w:p></w:tc></w:tr><w:tr><w:trPr><w:trHeight w:val="315"/></w:trPr><w:tc><w:tcPr><w:tcW w:w="7240" w:type="dxa"/><w:tcBorders><w:top w:val="single" w:sz="4" w:space="0" w:color="auto"/><w:left w:val="single" w:sz="4" w:space="0" w:color="auto"/><w:bottom w:val="single" w:sz="4" w:space="0" w:color="auto"/><w:right w:val="single" w:sz="4" w:space="0" w:color="auto"/></w:tcBorders><w:noWrap/><w:vAlign w:val="bottom"/></w:tcPr><w:p><w:pPr><w:pStyle w:val="Ttulo2"/><w:jc w:val="center"/><w:rPr><w:rFonts w:eastAsia="Times New Roman"/><w:b/><w:bCs/><w:color w:val="auto"/><w:sz w:val="24"/><w:szCs w:val="24"/><w:lang w:eastAsia="pt-BR"/></w:rPr></w:pPr><w:r><w:rPr><w:rFonts w:eastAsia="Times New Roman"/><w:b/><w:bCs/><w:color w:val="auto"/><w:sz w:val="24"/><w:szCs w:val="24"/><w:lang w:eastAsia="pt-BR"/></w:rPr><w:t>Pressão Máxima de Trabalho Admissível</w:t></w:r></w:p></w:tc><w:tc><w:tcPr><w:tcW w:w="2400" w:type="dxa"/><w:tcBorders><w:top w:val="single" w:sz="4" w:space="0" w:color="auto"/><w:left w:val="nil"/><w:bottom w:val="single" w:sz="4" w:space="0" w:color="auto"/><w:right w:val="single" w:sz="4" w:space="0" w:color="auto"/></w:tcBorders><w:vAlign w:val="center"/></w:tcPr><w:p><w:pPr><w:pStyle w:val="Ttulo2"/><w:jc w:val="center"/><w:rPr><w:rFonts w:eastAsia="Times New Roman"/><w:color w:val="17365D" w:themeColor="text2" w:themeShade="BF"/><w:sz w:val="24"/><w:szCs w:val="24"/><w:lang w:eastAsia="pt-BR"/></w:rPr></w:pPr><w:r><w:rPr><w:rFonts w:eastAsia="Times New Roman"/><w:color w:val="17365D" w:themeColor="text2" w:themeShade="BF"/><w:sz w:val="24"/><w:szCs w:val="24"/><w:lang w:eastAsia="pt-BR"/></w:rPr><w:t>4 bar</w:t></w:r></w:p></w:tc></w:tr><w:tr><w:trPr><w:trHeight w:val="315"/></w:trPr><w:tc><w:tcPr><w:tcW w:w="7240" w:type="dxa"/><w:tcBorders><w:top w:val="single" w:sz="4" w:space="0" w:color="auto"/><w:left w:val="single" w:sz="4" w:space="0" w:color="auto"/><w:bottom w:val="single" w:sz="4" w:space="0" w:color="auto"/><w:right w:val="single" w:sz="4" w:space="0" w:color="auto"/></w:tcBorders><w:noWrap/><w:vAlign w:val="bottom"/></w:tcPr><w:p><w:pPr><w:pStyle w:val="Ttulo2"/><w:jc w:val="center"/><w:rPr><w:rFonts w:eastAsia="Times New Roman"/><w:b/><w:bCs/><w:color w:val="auto"/><w:lang w:eastAsia="pt-BR"/></w:rPr></w:pPr><w:r><w:rPr><w:rFonts w:eastAsia="Times New Roman"/><w:b/><w:bCs/><w:color w:val="auto"/><w:lang w:eastAsia="pt-BR"/></w:rPr><w:t>Temperatura do Projeto</w:t></w:r></w:p></w:tc><w:tc><w:tcPr><w:tcW w:w="2400" w:type="dxa"/><w:tcBorders><w:top w:val="single" w:sz="4" w:space="0" w:color="auto"/><w:left w:val="nil"/><w:bottom w:val="single" w:sz="4" w:space="0" w:color="auto"/><w:right w:val="single" w:sz="4" w:space="0" w:color="auto"/></w:tcBorders></w:tcPr><w:p><w:pPr><w:pStyle w:val="Ttulo2"/><w:jc w:val="center"/><w:rPr><w:rFonts w:eastAsia="Times New Roman"/><w:color w:val="17365D" w:themeColor="text2" w:themeShade="BF"/><w:lang w:eastAsia="pt-BR"/></w:rPr></w:pPr><w:r><w:rPr><w:rFonts w:eastAsia="Times New Roman"/><w:color w:val="17365D" w:themeColor="text2" w:themeShade="BF"/><w:lang w:eastAsia="pt-BR"/></w:rPr><w:t>- 40°C à 1</w:t></w:r><w:r><w:rPr><w:rFonts w:eastAsia="Times New Roman"/><w:color w:val="17365D" w:themeColor="text2" w:themeShade="BF"/><w:lang w:eastAsia="pt-BR"/></w:rPr><w:t>5</w:t></w:r><w:r><w:rPr><w:rFonts w:eastAsia="Times New Roman"/><w:color w:val="17365D" w:themeColor="text2" w:themeShade="BF"/><w:lang w:eastAsia="pt-BR"/></w:rPr><w:t>0°C</w:t></w:r></w:p></w:tc></w:tr><w:tr><w:trPr><w:trHeight w:val="315"/></w:trPr><w:tc><w:tcPr><w:tcW w:w="7240" w:type="dxa"/><w:tcBorders><w:top w:val="single" w:sz="4" w:space="0" w:color="auto"/><w:left w:val="single" w:sz="4" w:space="0" w:color="auto"/><w:bottom w:val="single" w:sz="4" w:space="0" w:color="auto"/><w:right w:val="single" w:sz="4" w:space="0" w:color="auto"/></w:tcBorders><w:noWrap/><w:vAlign w:val="bottom"/></w:tcPr><w:p><w:pPr><w:pStyle w:val="Ttulo2"/><w:jc w:val="center"/><w:rPr><w:rFonts w:eastAsia="Times New Roman"/><w:b/><w:bCs/><w:color w:val="auto"/><w:sz w:val="24"/><w:szCs w:val="24"/><w:lang w:eastAsia="pt-BR"/></w:rPr></w:pPr><w:r><w:rPr><w:rFonts w:eastAsia="Times New Roman"/><w:b/><w:bCs/><w:color w:val="auto"/><w:sz w:val="24"/><w:szCs w:val="24"/><w:lang w:eastAsia="pt-BR"/></w:rPr><w:t>Material da</w:t></w:r><w:r><w:rPr><w:rFonts w:eastAsia="Times New Roman"/><w:b/><w:bCs/><w:color w:val="auto"/><w:sz w:val="24"/><w:szCs w:val="24"/><w:lang w:eastAsia="pt-BR"/></w:rPr><w:t xml:space="preserve"> Calota</w:t></w:r></w:p></w:tc><w:tc><w:tcPr><w:tcW w:w="2400" w:type="dxa"/><w:tcBorders><w:top w:val="single" w:sz="4" w:space="0" w:color="auto"/><w:left w:val="nil"/><w:bottom w:val="single" w:sz="4" w:space="0" w:color="auto"/><w:right w:val="single" w:sz="4" w:space="0" w:color="auto"/></w:tcBorders></w:tcPr><w:p><w:pPr><w:pStyle w:val="Ttulo2"/><w:jc w:val="center"/><w:rPr><w:rFonts w:eastAsia="Times New Roman"/><w:color w:val="0F243E" w:themeColor="text2" w:themeShade="80"/><w:sz w:val="24"/><w:szCs w:val="24"/><w:lang w:eastAsia="pt-BR"/></w:rPr></w:pPr><w:r><w:rPr><w:rFonts w:eastAsia="Times New Roman"/><w:color w:val="0F243E" w:themeColor="text2" w:themeShade="80"/><w:sz w:val="24"/><w:szCs w:val="24"/><w:lang w:eastAsia="pt-BR"/></w:rPr><w:t>A</w:t></w:r><w:r><w:rPr><w:rFonts w:eastAsia="Times New Roman"/><w:color w:val="0F243E" w:themeColor="text2" w:themeShade="80"/><w:sz w:val="24"/><w:szCs w:val="24"/><w:lang w:eastAsia="pt-BR"/></w:rPr><w:t>WS316L</w:t></w:r></w:p></w:tc></w:tr><w:tr><w:trPr><w:trHeight w:val="315"/></w:trPr><w:tc><w:tcPr><w:tcW w:w="7240" w:type="dxa"/><w:tcBorders><w:top w:val="single" w:sz="4" w:space="0" w:color="auto"/><w:left w:val="single" w:sz="4" w:space="0" w:color="auto"/><w:bottom w:val="single" w:sz="4" w:space="0" w:color="auto"/><w:right w:val="single" w:sz="4" w:space="0" w:color="auto"/></w:tcBorders><w:noWrap/><w:vAlign w:val="bottom"/></w:tcPr><w:p><w:pPr><w:pStyle w:val="Ttulo2"/><w:jc w:val="center"/><w:rPr><w:rFonts w:eastAsia="Times New Roman"/><w:b/><w:bCs/><w:color w:val="auto"/><w:sz w:val="24"/><w:szCs w:val="24"/><w:lang w:eastAsia="pt-BR"/></w:rPr></w:pPr><w:r><w:rPr><w:rFonts w:eastAsia="Times New Roman"/><w:b/><w:bCs/><w:color w:val="auto"/><w:sz w:val="24"/><w:szCs w:val="24"/><w:lang w:eastAsia="pt-BR"/></w:rPr><w:t>Material do Costado</w:t></w:r></w:p></w:tc><w:tc><w:tcPr><w:tcW w:w="2400" w:type="dxa"/><w:tcBorders><w:top w:val="single" w:sz="4" w:space="0" w:color="auto"/><w:left w:val="nil"/><w:bottom w:val="single" w:sz="4" w:space="0" w:color="auto"/><w:right w:val="single" w:sz="4" w:space="0" w:color="auto"/></w:tcBorders></w:tcPr><w:p><w:pPr><w:pStyle w:val="Ttulo2"/><w:jc w:val="center"/><w:rPr><w:rFonts w:eastAsia="Times New Roman"/><w:color w:val="0F243E" w:themeColor="text2" w:themeShade="80"/><w:sz w:val="24"/><w:szCs w:val="24"/><w:lang w:eastAsia="pt-BR"/></w:rPr></w:pPr><w:r><w:rPr><w:rFonts w:eastAsia="Times New Roman"/><w:color w:val="0F243E" w:themeColor="text2" w:themeShade="80"/><w:sz w:val="24"/><w:szCs w:val="24"/><w:lang w:eastAsia="pt-BR"/></w:rPr><w:t>AWS316L</w:t></w:r></w:p></w:tc></w:tr><w:tr><w:trPr><w:trHeight w:val="315"/></w:trPr><w:tc><w:tcPr><w:tcW w:w="7240" w:type="dxa"/><w:tcBorders><w:top w:val="single" w:sz="4" w:space="0" w:color="auto"/><w:left w:val="single" w:sz="4" w:space="0" w:color="auto"/><w:bottom w:val="single" w:sz="4" w:space="0" w:color="auto"/><w:right w:val="single" w:sz="4" w:space="0" w:color="auto"/></w:tcBorders><w:noWrap/><w:vAlign w:val="bottom"/></w:tcPr><w:p><w:pPr><w:pStyle w:val="Ttulo2"/><w:jc w:val="center"/><w:rPr><w:rFonts w:eastAsia="Times New Roman"/><w:b/><w:bCs/><w:color w:val="auto"/><w:sz w:val="24"/><w:szCs w:val="24"/><w:lang w:eastAsia="pt-BR"/></w:rPr></w:pPr><w:r><w:rPr><w:rFonts w:eastAsia="Times New Roman"/><w:b/><w:bCs/><w:color w:val="auto"/><w:sz w:val="24"/><w:szCs w:val="24"/><w:lang w:eastAsia="pt-BR"/></w:rPr><w:t>Espessura das Calotas e Costado</w:t></w:r></w:p></w:tc><w:tc><w:tcPr><w:tcW w:w="2400" w:type="dxa"/><w:tcBorders><w:top w:val="single" w:sz="4" w:space="0" w:color="auto"/><w:left w:val="nil"/><w:bottom w:val="single" w:sz="4" w:space="0" w:color="auto"/><w:right w:val="single" w:sz="4" w:space="0" w:color="auto"/></w:tcBorders></w:tcPr><w:p><w:pPr><w:pStyle w:val="Ttulo2"/><w:jc w:val="center"/><w:rPr><w:rFonts w:eastAsia="Times New Roman"/><w:color w:val="17365D" w:themeColor="text2" w:themeShade="BF"/><w:sz w:val="24"/><w:szCs w:val="24"/><w:lang w:eastAsia="pt-BR"/></w:rPr></w:pPr><w:r><w:rPr><w:color w:val="17365D" w:themeColor="text2" w:themeShade="BF"/><w:sz w:val="24"/><w:szCs w:val="24"/></w:rPr><w:t>6 mm</w:t></w:r></w:p></w:tc></w:tr><w:tr><w:trPr><w:trHeight w:val="315"/></w:trPr><w:tc><w:tcPr><w:tcW w:w="7240" w:type="dxa"/><w:tcBorders><w:top w:val="single" w:sz="4" w:space="0" w:color="auto"/><w:left w:val="single" w:sz="4" w:space="0" w:color="auto"/><w:bottom w:val="single" w:sz="4" w:space="0" w:color="auto"/><w:right w:val="single" w:sz="4" w:space="0" w:color="auto"/></w:tcBorders><w:noWrap/><w:vAlign w:val="bottom"/></w:tcPr><w:p><w:pPr><w:pStyle w:val="Ttulo2"/><w:jc w:val="center"/><w:rPr><w:rFonts w:eastAsia="Times New Roman"/><w:b/><w:bCs/><w:color w:val="auto"/><w:sz w:val="24"/><w:szCs w:val="24"/><w:lang w:eastAsia="pt-BR"/></w:rPr></w:pPr><w:r><w:rPr><w:rFonts w:eastAsia="Times New Roman"/><w:b/><w:bCs/><w:color w:val="auto"/><w:sz w:val="24"/><w:szCs w:val="24"/><w:lang w:eastAsia="pt-BR"/></w:rPr><w:t>Conexões de Flange</w:t></w:r></w:p></w:tc><w:tc><w:tcPr><w:tcW w:w="2400" w:type="dxa"/><w:tcBorders><w:top w:val="single" w:sz="4" w:space="0" w:color="auto"/><w:left w:val="nil"/><w:bottom w:val="single" w:sz="4" w:space="0" w:color="auto"/><w:right w:val="single" w:sz="4" w:space="0" w:color="auto"/></w:tcBorders></w:tcPr><w:p><w:pPr><w:pStyle w:val="Ttulo2"/><w:jc w:val="center"/><w:rPr><w:rFonts w:eastAsia="Times New Roman"/><w:color w:val="17365D" w:themeColor="text2" w:themeShade="BF"/><w:sz w:val="24"/><w:szCs w:val="24"/><w:lang w:eastAsia="pt-BR"/></w:rPr></w:pPr><w:r><w:rPr><w:color w:val="17365D" w:themeColor="text2" w:themeShade="BF"/><w:sz w:val="24"/><w:szCs w:val="24"/></w:rPr><w:t>3 Pol</w:t></w:r></w:p></w:tc></w:tr><w:tr><w:trPr><w:trHeight w:val="315"/></w:trPr><w:tc><w:tcPr><w:tcW w:w="7240" w:type="dxa"/><w:tcBorders><w:top w:val="single" w:sz="4" w:space="0" w:color="auto"/><w:left w:val="single" w:sz="4" w:space="0" w:color="auto"/><w:bottom w:val="single" w:sz="4" w:space="0" w:color="auto"/><w:right w:val="single" w:sz="4" w:space="0" w:color="auto"/></w:tcBorders><w:noWrap/><w:vAlign w:val="bottom"/></w:tcPr><w:p><w:pPr><w:pStyle w:val="Ttulo2"/><w:jc w:val="center"/><w:rPr><w:rFonts w:eastAsia="Times New Roman"/><w:b/><w:bCs/><w:color w:val="auto"/><w:sz w:val="24"/><w:szCs w:val="24"/><w:lang w:eastAsia="pt-BR"/></w:rPr></w:pPr><w:r><w:rPr><w:rFonts w:eastAsia="Times New Roman"/><w:b/><w:bCs/><w:color w:val="auto"/><w:sz w:val="24"/><w:szCs w:val="24"/><w:lang w:eastAsia="pt-BR"/></w:rPr><w:t>Chapa de identificação de Fabricante</w:t></w:r></w:p></w:tc><w:tc><w:tcPr><w:tcW w:w="2400" w:type="dxa"/><w:tcBorders><w:top w:val="single" w:sz="4" w:space="0" w:color="auto"/><w:left w:val="nil"/><w:bottom w:val="single" w:sz="4" w:space="0" w:color="auto"/><w:right w:val="single" w:sz="4" w:space="0" w:color="auto"/></w:tcBorders></w:tcPr><w:p><w:pPr><w:pStyle w:val="Ttulo2"/><w:jc w:val="center"/><w:rPr><w:rFonts w:ascii="Calibri Light"/><w:color w:val="17365D" w:themeColor="text2" w:themeShade="BF"/><w:sz w:val="24"/><w:szCs w:val="24"/></w:rPr></w:pPr><w:r><w:rPr><w:rFonts w:eastAsia="Times New Roman"/><w:color w:val="17365D" w:themeColor="text2" w:themeShade="BF"/><w:sz w:val="24"/><w:szCs w:val="24"/><w:lang w:eastAsia="pt-BR"/></w:rPr><w:t>APROVADO</w:t></w:r></w:p></w:tc></w:tr><w:tr><w:trPr><w:trHeight w:val="315"/></w:trPr><w:tc><w:tcPr><w:tcW w:w="7240" w:type="dxa"/><w:tcBorders><w:top w:val="single" w:sz="4" w:space="0" w:color="auto"/><w:left w:val="single" w:sz="4" w:space="0" w:color="auto"/><w:bottom w:val="single" w:sz="4" w:space="0" w:color="auto"/><w:right w:val="single" w:sz="4" w:space="0" w:color="auto"/></w:tcBorders><w:noWrap/><w:vAlign w:val="bottom"/></w:tcPr><w:p><w:pPr><w:pStyle w:val="Ttulo2"/><w:jc w:val="center"/><w:rPr><w:rFonts w:eastAsia="Times New Roman"/><w:b/><w:bCs/><w:color w:val="auto"/><w:sz w:val="24"/><w:szCs w:val="24"/><w:lang w:eastAsia="pt-BR"/></w:rPr></w:pPr><w:r><w:rPr><w:rFonts w:eastAsia="Times New Roman"/><w:b/><w:bCs/><w:color w:val="auto"/><w:sz w:val="24"/><w:szCs w:val="24"/><w:lang w:eastAsia="pt-BR"/></w:rPr><w:t>Certificado de Calibração de Válvulas de Segurança</w:t></w:r></w:p></w:tc><w:tc><w:tcPr><w:tcW w:w="2400" w:type="dxa"/><w:tcBorders><w:top w:val="single" w:sz="4" w:space="0" w:color="auto"/><w:left w:val="nil"/><w:bottom w:val="single" w:sz="4" w:space="0" w:color="auto"/><w:right w:val="single" w:sz="4" w:space="0" w:color="auto"/></w:tcBorders></w:tcPr><w:p><w:pPr><w:pStyle w:val="Ttulo2"/><w:jc w:val="center"/><w:rPr><w:rFonts w:eastAsia="Times New Roman"/><w:color w:val="1F3864"/><w:sz w:val="24"/><w:szCs w:val="24"/><w:lang w:eastAsia="pt-BR"/></w:rPr></w:pPr><w:r><w:rPr><w:rFonts w:eastAsia="Times New Roman"/><w:color w:val="1F3864"/><w:sz w:val="24"/><w:szCs w:val="24"/><w:lang w:eastAsia="pt-BR"/></w:rPr><w:t>N/A</w:t></w:r></w:p></w:tc></w:tr><w:tr><w:trPr><w:trHeight w:val="315"/></w:trPr><w:tc><w:tcPr><w:tcW w:w="7240" w:type="dxa"/><w:tcBorders><w:top w:val="single" w:sz="4" w:space="0" w:color="auto"/><w:left w:val="single" w:sz="4" w:space="0" w:color="auto"/><w:bottom w:val="single" w:sz="4" w:space="0" w:color="auto"/><w:right w:val="single" w:sz="4" w:space="0" w:color="auto"/></w:tcBorders><w:noWrap/><w:vAlign w:val="bottom"/></w:tcPr><w:p><w:pPr><w:pStyle w:val="Ttulo2"/><w:jc w:val="center"/><w:rPr><w:rFonts w:eastAsia="Times New Roman"/><w:b/><w:bCs/><w:color w:val="auto"/><w:sz w:val="24"/><w:szCs w:val="24"/><w:lang w:eastAsia="pt-BR"/></w:rPr></w:pPr><w:r><w:rPr><w:rFonts w:eastAsia="Times New Roman"/><w:b/><w:bCs/><w:color w:val="auto"/><w:sz w:val="24"/><w:szCs w:val="24"/><w:lang w:eastAsia="pt-BR"/></w:rPr><w:t>Certificado de Descontaminação</w:t></w:r></w:p></w:tc><w:tc><w:tcPr><w:tcW w:w="2400" w:type="dxa"/><w:tcBorders><w:top w:val="single" w:sz="4" w:space="0" w:color="auto"/><w:left w:val="nil"/><w:bottom w:val="single" w:sz="4" w:space="0" w:color="auto"/><w:right w:val="single" w:sz="4" w:space="0" w:color="auto"/></w:tcBorders></w:tcPr><w:p><w:pPr><w:pStyle w:val="Ttulo2"/><w:jc w:val="center"/><w:rPr><w:rFonts w:eastAsia="Times New Roman"/><w:color w:val="1F3864"/><w:sz w:val="24"/><w:szCs w:val="24"/><w:lang w:eastAsia="pt-BR"/></w:rPr></w:pPr><w:r><w:rPr><w:rFonts w:eastAsia="Times New Roman"/><w:color w:val="1F3864"/><w:sz w:val="24"/><w:szCs w:val="24"/><w:lang w:eastAsia="pt-BR"/></w:rPr><w:t>N/A</w:t></w:r></w:p></w:tc></w:tr><w:tr><w:trPr><w:trHeight w:val="315"/></w:trPr><w:tc><w:tcPr><w:tcW w:w="9640" w:type="dxa"/><w:gridSpan w:val="2"/><w:tcBorders><w:top w:val="single" w:sz="4" w:space="0" w:color="auto"/><w:left w:val="single" w:sz="4" w:space="0" w:color="auto"/><w:bottom w:val="single" w:sz="4" w:space="0" w:color="auto"/><w:right w:val="single" w:sz="4" w:space="0" w:color="auto"/></w:tcBorders><w:shd w:val="clear" w:color="auto" w:fill="1B407E"/><w:noWrap/><w:vAlign w:val="bottom"/></w:tcPr><w:p><w:pPr><w:pStyle w:val="Ttulo2"/><w:jc w:val="center"/><w:rPr><w:rFonts w:eastAsia="Times New Roman"/><w:b/><w:bCs/><w:color w:val="1F3864"/><w:sz w:val="24"/><w:szCs w:val="24"/><w:lang w:eastAsia="pt-BR"/></w:rPr></w:pPr><w:r><w:rPr><w:rFonts w:eastAsia="Times New Roman"/><w:b/><w:bCs/><w:color w:val="FFFFFF" w:themeColor="background1"/><w:sz w:val="24"/><w:szCs w:val="24"/><w:lang w:eastAsia="pt-BR"/></w:rPr><w:t>ESTRUTURA EXTERNA</w:t></w:r></w:p></w:tc></w:tr><w:tr><w:trPr><w:trHeight w:val="315"/></w:trPr><w:tc><w:tcPr><w:tcW w:w="7240" w:type="dxa"/><w:tcBorders><w:top w:val="single" w:sz="4" w:space="0" w:color="auto"/><w:left w:val="single" w:sz="4" w:space="0" w:color="auto"/><w:bottom w:val="single" w:sz="4" w:space="0" w:color="auto"/><w:right w:val="single" w:sz="4" w:space="0" w:color="auto"/></w:tcBorders><w:noWrap/><w:vAlign w:val="bottom"/></w:tcPr><w:p><w:pPr><w:pStyle w:val="Ttulo2"/><w:jc w:val="center"/><w:rPr><w:rFonts w:eastAsia="Times New Roman"/><w:b/><w:bCs/><w:color w:val="auto"/><w:sz w:val="24"/><w:szCs w:val="24"/><w:lang w:eastAsia="pt-BR"/></w:rPr></w:pPr><w:r><w:rPr><w:rFonts w:eastAsia="Times New Roman"/><w:b/><w:bCs/><w:color w:val="auto"/><w:sz w:val="24"/><w:szCs w:val="24"/><w:lang w:eastAsia="pt-BR"/></w:rPr><w:t>Estrutura Externa</w:t></w:r></w:p></w:tc><w:tc><w:tcPr><w:tcW w:w="2400" w:type="dxa"/><w:tcBorders><w:top w:val="single" w:sz="4" w:space="0" w:color="auto"/><w:left w:val="nil"/><w:bottom w:val="single" w:sz="4" w:space="0" w:color="auto"/><w:right w:val="single" w:sz="4" w:space="0" w:color="auto"/></w:tcBorders></w:tcPr><w:p><w:pPr><w:pStyle w:val="Ttulo2"/><w:jc w:val="center"/><w:rPr><w:rFonts w:eastAsia="Times New Roman"/><w:color w:val="1F3864"/><w:sz w:val="24"/><w:szCs w:val="24"/><w:lang w:eastAsia="pt-BR"/></w:rPr></w:pPr><w:r><w:rPr><w:rFonts w:eastAsia="Times New Roman"/><w:color w:val="1F3864"/><w:sz w:val="24"/><w:szCs w:val="24"/><w:lang w:eastAsia="pt-BR"/></w:rPr><w:t>APROVADO</w:t></w:r></w:p></w:tc></w:tr><w:tr><w:trPr><w:trHeight w:val="315"/></w:trPr><w:tc><w:tcPr><w:tcW w:w="7240" w:type="dxa"/><w:tcBorders><w:top w:val="single" w:sz="4" w:space="0" w:color="auto"/><w:left w:val="single" w:sz="4" w:space="0" w:color="auto"/><w:bottom w:val="single" w:sz="4" w:space="0" w:color="auto"/><w:right w:val="single" w:sz="4" w:space="0" w:color="auto"/></w:tcBorders><w:noWrap/><w:vAlign w:val="bottom"/></w:tcPr><w:p><w:pPr><w:pStyle w:val="Ttulo2"/><w:jc w:val="center"/><w:rPr><w:rFonts w:eastAsia="Times New Roman"/><w:b/><w:bCs/><w:color w:val="auto"/><w:sz w:val="24"/><w:szCs w:val="24"/><w:lang w:eastAsia="pt-BR"/></w:rPr></w:pPr><w:r><w:rPr><w:rFonts w:eastAsia="Times New Roman"/><w:b/><w:bCs/><w:color w:val="auto"/><w:sz w:val="24"/><w:szCs w:val="24"/><w:lang w:eastAsia="pt-BR"/></w:rPr><w:t>Corpo do Tanque</w:t></w:r></w:p></w:tc><w:tc><w:tcPr><w:tcW w:w="2400" w:type="dxa"/><w:tcBorders><w:top w:val="single" w:sz="4" w:space="0" w:color="auto"/><w:left w:val="nil"/><w:bottom w:val="single" w:sz="4" w:space="0" w:color="auto"/><w:right w:val="single" w:sz="4" w:space="0" w:color="auto"/></w:tcBorders></w:tcPr><w:p><w:pPr><w:pStyle w:val="Ttulo2"/><w:jc w:val="center"/><w:rPr><w:rFonts w:eastAsia="Times New Roman"/><w:color w:val="1F3864"/><w:sz w:val="24"/><w:szCs w:val="24"/><w:lang w:eastAsia="pt-BR"/></w:rPr></w:pPr><w:r><w:rPr><w:rFonts w:eastAsia="Times New Roman"/><w:color w:val="1F3864"/><w:sz w:val="24"/><w:szCs w:val="24"/><w:lang w:eastAsia="pt-BR"/></w:rPr><w:t>APROVADO</w:t></w:r></w:p></w:tc></w:tr><w:tr><w:trPr><w:trHeight w:val="315"/></w:trPr><w:tc><w:tcPr><w:tcW w:w="7240" w:type="dxa"/><w:tcBorders><w:top w:val="single" w:sz="4" w:space="0" w:color="auto"/><w:left w:val="single" w:sz="4" w:space="0" w:color="auto"/><w:bottom w:val="single" w:sz="4" w:space="0" w:color="auto"/><w:right w:val="single" w:sz="4" w:space="0" w:color="auto"/></w:tcBorders><w:noWrap/><w:vAlign w:val="bottom"/></w:tcPr><w:p><w:pPr><w:pStyle w:val="Ttulo2"/><w:jc w:val="center"/><w:rPr><w:rFonts w:eastAsia="Times New Roman"/><w:b/><w:bCs/><w:color w:val="auto"/><w:sz w:val="24"/><w:szCs w:val="24"/><w:lang w:eastAsia="pt-BR"/></w:rPr></w:pPr><w:r><w:rPr><w:rFonts w:eastAsia="Times New Roman"/><w:b/><w:bCs/><w:color w:val="auto"/><w:sz w:val="24"/><w:szCs w:val="24"/><w:lang w:eastAsia="pt-BR"/></w:rPr><w:t>Passadiços</w:t></w:r></w:p></w:tc><w:tc><w:tcPr><w:tcW w:w="2400" w:type="dxa"/><w:tcBorders><w:top w:val="single" w:sz="4" w:space="0" w:color="auto"/><w:left w:val="nil"/><w:bottom w:val="single" w:sz="4" w:space="0" w:color="auto"/><w:right w:val="single" w:sz="4" w:space="0" w:color="auto"/></w:tcBorders></w:tcPr><w:p><w:pPr><w:pStyle w:val="Ttulo2"/><w:jc w:val="center"/><w:rPr><w:rFonts w:eastAsia="Times New Roman"/><w:color w:val="1F3864"/><w:sz w:val="24"/><w:szCs w:val="24"/><w:lang w:eastAsia="pt-BR"/></w:rPr></w:pPr><w:r><w:rPr><w:rFonts w:eastAsia="Times New Roman"/><w:color w:val="1F3864"/><w:sz w:val="24"/><w:szCs w:val="24"/><w:lang w:eastAsia="pt-BR"/></w:rPr><w:t>APROVADO</w:t></w:r></w:p></w:tc></w:tr><w:tr><w:trPr><w:trHeight w:val="315"/></w:trPr><w:tc><w:tcPr><w:tcW w:w="7240" w:type="dxa"/><w:tcBorders><w:top w:val="single" w:sz="4" w:space="0" w:color="auto"/><w:left w:val="single" w:sz="4" w:space="0" w:color="auto"/><w:bottom w:val="single" w:sz="4" w:space="0" w:color="auto"/><w:right w:val="single" w:sz="4" w:space="0" w:color="auto"/></w:tcBorders><w:noWrap/><w:vAlign w:val="bottom"/></w:tcPr><w:p><w:pPr><w:pStyle w:val="Ttulo2"/><w:jc w:val="center"/><w:rPr><w:rFonts w:eastAsia="Times New Roman"/><w:b/><w:bCs/><w:color w:val="auto"/><w:sz w:val="24"/><w:szCs w:val="24"/><w:lang w:eastAsia="pt-BR"/></w:rPr></w:pPr><w:r><w:rPr><w:rFonts w:eastAsia="Times New Roman"/><w:b/><w:bCs/><w:color w:val="auto"/><w:sz w:val="24"/><w:szCs w:val="24"/><w:lang w:eastAsia="pt-BR"/></w:rPr><w:t>Revestimento</w:t></w:r></w:p></w:tc><w:tc><w:tcPr><w:tcW w:w="2400" w:type="dxa"/><w:tcBorders><w:top w:val="single" w:sz="4" w:space="0" w:color="auto"/><w:left w:val="nil"/><w:bottom w:val="single" w:sz="4" w:space="0" w:color="auto"/><w:right w:val="single" w:sz="4" w:space="0" w:color="auto"/></w:tcBorders></w:tcPr><w:p><w:pPr><w:pStyle w:val="Ttulo2"/><w:jc w:val="center"/><w:rPr><w:rFonts w:eastAsia="Times New Roman"/><w:color w:val="1F3864"/><w:sz w:val="24"/><w:szCs w:val="24"/><w:lang w:eastAsia="pt-BR"/></w:rPr></w:pPr><w:r><w:rPr><w:rFonts w:eastAsia="Times New Roman"/><w:color w:val="17365D" w:themeColor="text2" w:themeShade="BF"/><w:sz w:val="24"/><w:szCs w:val="24"/><w:lang w:eastAsia="pt-BR"/></w:rPr><w:t>APROVADO</w:t></w:r></w:p></w:tc></w:tr><w:tr><w:trPr><w:trHeight w:val="315"/></w:trPr><w:tc><w:tcPr><w:tcW w:w="7240" w:type="dxa"/><w:tcBorders><w:top w:val="single" w:sz="4" w:space="0" w:color="auto"/><w:left w:val="single" w:sz="4" w:space="0" w:color="auto"/><w:bottom w:val="single" w:sz="4" w:space="0" w:color="auto"/><w:right w:val="single" w:sz="4" w:space="0" w:color="auto"/></w:tcBorders><w:noWrap/><w:vAlign w:val="bottom"/></w:tcPr><w:p><w:pPr><w:pStyle w:val="Ttulo2"/><w:jc w:val="center"/><w:rPr><w:rFonts w:eastAsia="Times New Roman"/><w:b/><w:bCs/><w:color w:val="FF0000"/><w:sz w:val="24"/><w:szCs w:val="24"/><w:lang w:eastAsia="pt-BR"/></w:rPr></w:pPr><w:r><w:rPr><w:rFonts w:eastAsia="Times New Roman"/><w:b/><w:bCs/><w:color w:val="auto"/><w:sz w:val="24"/><w:szCs w:val="24"/><w:lang w:eastAsia="pt-BR"/></w:rPr><w:t>Isolamento Térmico</w:t></w:r></w:p></w:tc><w:tc><w:tcPr><w:tcW w:w="2400" w:type="dxa"/><w:tcBorders><w:top w:val="single" w:sz="4" w:space="0" w:color="auto"/><w:left w:val="nil"/><w:bottom w:val="single" w:sz="4" w:space="0" w:color="auto"/><w:right w:val="single" w:sz="4" w:space="0" w:color="auto"/></w:tcBorders><w:vAlign w:val="bottom"/></w:tcPr><w:p><w:pPr><w:pStyle w:val="Ttulo2"/><w:jc w:val="center"/><w:rPr><w:rFonts w:eastAsia="Times New Roman"/><w:color w:val="FF0000"/><w:sz w:val="24"/><w:szCs w:val="24"/><w:lang w:eastAsia="pt-BR"/></w:rPr></w:pPr><w:r><w:rPr><w:rFonts w:eastAsia="Times New Roman"/><w:color w:val="17365D" w:themeColor="text2" w:themeShade="BF"/><w:sz w:val="24"/><w:szCs w:val="24"/><w:lang w:eastAsia="pt-BR"/></w:rPr><w:t>N/A</w:t></w:r></w:p></w:tc></w:tr><w:tr><w:trPr><w:trHeight w:val="315"/></w:trPr><w:tc><w:tcPr><w:tcW w:w="7240" w:type="dxa"/><w:tcBorders><w:top w:val="single" w:sz="4" w:space="0" w:color="auto"/><w:left w:val="single" w:sz="4" w:space="0" w:color="auto"/><w:bottom w:val="single" w:sz="4" w:space="0" w:color="auto"/><w:right w:val="single" w:sz="4" w:space="0" w:color="auto"/></w:tcBorders><w:noWrap/><w:vAlign w:val="bottom"/></w:tcPr><w:p><w:pPr><w:pStyle w:val="Ttulo2"/><w:jc w:val="center"/><w:rPr><w:rFonts w:eastAsia="Times New Roman"/><w:b/><w:bCs/><w:color w:val="auto"/><w:sz w:val="24"/><w:szCs w:val="24"/><w:lang w:eastAsia="pt-BR"/></w:rPr></w:pPr><w:r><w:rPr><w:rFonts w:eastAsia="Times New Roman"/><w:b/><w:bCs/><w:color w:val="auto"/><w:sz w:val="24"/><w:szCs w:val="24"/><w:lang w:eastAsia="pt-BR"/></w:rPr><w:t>Escada</w:t></w:r></w:p></w:tc><w:tc><w:tcPr><w:tcW w:w="2400" w:type="dxa"/><w:tcBorders><w:top w:val="single" w:sz="4" w:space="0" w:color="auto"/><w:left w:val="nil"/><w:bottom w:val="single" w:sz="4" w:space="0" w:color="auto"/><w:right w:val="single" w:sz="4" w:space="0" w:color="auto"/></w:tcBorders><w:vAlign w:val="bottom"/></w:tcPr><w:p><w:pPr><w:pStyle w:val="Ttulo2"/><w:jc w:val="center"/><w:rPr><w:rFonts w:eastAsia="Times New Roman"/><w:color w:val="1F3864"/><w:sz w:val="24"/><w:szCs w:val="24"/><w:lang w:eastAsia="pt-BR"/></w:rPr></w:pPr><w:r><w:rPr><w:rFonts w:eastAsia="Times New Roman"/><w:color w:val="1F3864"/><w:sz w:val="24"/><w:szCs w:val="24"/><w:lang w:eastAsia="pt-BR"/></w:rPr><w:t>APROVADO</w:t></w:r></w:p></w:tc></w:tr><w:tr><w:trPr><w:trHeight w:val="280"/></w:trPr><w:tc><w:tcPr><w:tcW w:w="7240" w:type="dxa"/><w:tcBorders><w:top w:val="single" w:sz="4" w:space="0" w:color="auto"/><w:left w:val="single" w:sz="4" w:space="0" w:color="auto"/><w:bottom w:val="single" w:sz="4" w:space="0" w:color="auto"/><w:right w:val="single" w:sz="4" w:space="0" w:color="auto"/></w:tcBorders><w:noWrap/><w:vAlign w:val="bottom"/></w:tcPr><w:p><w:pPr><w:pStyle w:val="Ttulo2"/><w:jc w:val="center"/><w:rPr><w:rFonts w:eastAsia="Times New Roman"/><w:b/><w:bCs/><w:color w:val="auto"/><w:sz w:val="24"/><w:szCs w:val="24"/><w:lang w:eastAsia="pt-BR"/></w:rPr></w:pPr><w:r><w:rPr><w:rFonts w:eastAsia="Times New Roman"/><w:b/><w:bCs/><w:color w:val="auto"/><w:sz w:val="24"/><w:szCs w:val="24"/><w:lang w:eastAsia="pt-BR"/></w:rPr><w:t>Dispositivos de Canto de Chassi (Porta-Container)</w:t></w:r></w:p></w:tc><w:tc><w:tcPr><w:tcW w:w="2400" w:type="dxa"/><w:tcBorders><w:top w:val="single" w:sz="4" w:space="0" w:color="auto"/><w:left w:val="nil"/><w:bottom w:val="single" w:sz="4" w:space="0" w:color="auto"/><w:right w:val="single" w:sz="4" w:space="0" w:color="auto"/></w:tcBorders><w:vAlign w:val="center"/></w:tcPr><w:p><w:pPr><w:pStyle w:val="Ttulo2"/><w:jc w:val="center"/><w:rPr><w:rFonts w:eastAsia="Times New Roman"/><w:color w:val="1F3864"/><w:sz w:val="24"/><w:szCs w:val="24"/><w:lang w:eastAsia="pt-BR"/></w:rPr></w:pPr><w:r><w:rPr><w:rFonts w:eastAsia="Times New Roman"/><w:color w:val="1F3864"/><w:sz w:val="24"/><w:szCs w:val="24"/><w:lang w:eastAsia="pt-BR"/></w:rPr><w:t>APROVADO</w:t></w:r></w:p></w:tc></w:tr><w:tr><w:trPr><w:trHeight w:val="315"/></w:trPr><w:tc><w:tcPr><w:tcW w:w="7240" w:type="dxa"/><w:tcBorders><w:top w:val="single" w:sz="4" w:space="0" w:color="auto"/><w:left w:val="single" w:sz="4" w:space="0" w:color="auto"/><w:bottom w:val="single" w:sz="4" w:space="0" w:color="auto"/><w:right w:val="single" w:sz="4" w:space="0" w:color="auto"/></w:tcBorders><w:noWrap/><w:vAlign w:val="bottom"/></w:tcPr><w:p><w:pPr><w:pStyle w:val="Ttulo2"/><w:jc w:val="center"/><w:rPr><w:rFonts w:eastAsia="Times New Roman"/><w:b/><w:bCs/><w:color w:val="FF0000"/><w:sz w:val="24"/><w:szCs w:val="24"/><w:lang w:eastAsia="pt-BR"/></w:rPr></w:pPr><w:r><w:rPr><w:rFonts w:eastAsia="Times New Roman"/><w:b/><w:bCs/><w:color w:val="000000" w:themeColor="text1"/><w:sz w:val="24"/><w:szCs w:val="24"/><w:lang w:eastAsia="pt-BR"/></w:rPr><w:t>Ponto de Aterramento</w:t></w:r></w:p></w:tc><w:tc><w:tcPr><w:tcW w:w="2400" w:type="dxa"/><w:tcBorders><w:top w:val="single" w:sz="4" w:space="0" w:color="auto"/><w:left w:val="nil"/><w:bottom w:val="single" w:sz="4" w:space="0" w:color="auto"/><w:right w:val="single" w:sz="4" w:space="0" w:color="auto"/></w:tcBorders><w:vAlign w:val="bottom"/></w:tcPr><w:p><w:pPr><w:pStyle w:val="Ttulo2"/><w:jc w:val="center"/><w:rPr><w:rFonts w:eastAsia="Times New Roman"/><w:color w:val="FF0000"/><w:sz w:val="24"/><w:szCs w:val="24"/><w:lang w:eastAsia="pt-BR"/></w:rPr></w:pPr><w:r><w:rPr><w:rFonts w:eastAsia="Times New Roman"/><w:color w:val="0F243E" w:themeColor="text2" w:themeShade="80"/><w:sz w:val="24"/><w:szCs w:val="24"/><w:lang w:eastAsia="pt-BR"/></w:rPr><w:t xml:space="preserve">APROVADO </w:t></w:r></w:p></w:tc></w:tr><w:tr><w:trPr><w:trHeight w:val="315"/></w:trPr><w:tc><w:tcPr><w:tcW w:w="7240" w:type="dxa"/><w:tcBorders><w:top w:val="single" w:sz="4" w:space="0" w:color="auto"/><w:left w:val="single" w:sz="4" w:space="0" w:color="auto"/><w:bottom w:val="single" w:sz="4" w:space="0" w:color="auto"/><w:right w:val="single" w:sz="4" w:space="0" w:color="auto"/></w:tcBorders><w:noWrap/><w:vAlign w:val="bottom"/></w:tcPr><w:p><w:pPr><w:pStyle w:val="Ttulo2"/><w:jc w:val="center"/><w:rPr><w:rFonts w:eastAsia="Times New Roman"/><w:b/><w:bCs/><w:color w:val="auto"/><w:sz w:val="24"/><w:szCs w:val="24"/><w:lang w:eastAsia="pt-BR"/></w:rPr></w:pPr><w:r><w:rPr><w:rFonts w:eastAsia="Times New Roman"/><w:b/><w:bCs/><w:color w:val="auto"/><w:sz w:val="24"/><w:szCs w:val="24"/><w:lang w:eastAsia="pt-BR"/></w:rPr><w:t>Fixações (parafusos, porcas etc.)</w:t></w:r></w:p></w:tc><w:tc><w:tcPr><w:tcW w:w="2400" w:type="dxa"/><w:tcBorders><w:top w:val="single" w:sz="4" w:space="0" w:color="auto"/><w:left w:val="nil"/><w:bottom w:val="single" w:sz="4" w:space="0" w:color="auto"/><w:right w:val="single" w:sz="4" w:space="0" w:color="auto"/></w:tcBorders><w:vAlign w:val="bottom"/></w:tcPr><w:p><w:pPr><w:pStyle w:val="Ttulo2"/><w:jc w:val="center"/><w:rPr><w:rFonts w:eastAsia="Times New Roman"/><w:color w:val="1F3864"/><w:sz w:val="24"/><w:szCs w:val="24"/><w:lang w:eastAsia="pt-BR"/></w:rPr></w:pPr><w:r><w:rPr><w:rFonts w:eastAsia="Times New Roman"/><w:color w:val="17365D" w:themeColor="text2" w:themeShade="BF"/><w:sz w:val="24"/><w:szCs w:val="24"/><w:lang w:eastAsia="pt-BR"/></w:rPr><w:t xml:space="preserve">APROVADO </w:t></w:r></w:p></w:tc></w:tr><w:tr><w:trPr><w:trHeight w:val="315"/></w:trPr><w:tc><w:tcPr><w:tcW w:w="7240" w:type="dxa"/><w:tcBorders><w:top w:val="single" w:sz="4" w:space="0" w:color="auto"/><w:left w:val="single" w:sz="4" w:space="0" w:color="auto"/><w:bottom w:val="single" w:sz="4" w:space="0" w:color="auto"/><w:right w:val="single" w:sz="4" w:space="0" w:color="auto"/></w:tcBorders><w:noWrap/><w:vAlign w:val="bottom"/></w:tcPr><w:p><w:pPr><w:pStyle w:val="Ttulo2"/><w:jc w:val="center"/><w:rPr><w:rFonts w:eastAsia="Times New Roman"/><w:b/><w:bCs/><w:color w:val="auto"/><w:sz w:val="24"/><w:szCs w:val="24"/><w:lang w:eastAsia="pt-BR"/></w:rPr></w:pPr><w:r><w:rPr><w:rFonts w:eastAsia="Times New Roman"/><w:b/><w:bCs/><w:color w:val="auto"/><w:sz w:val="24"/><w:szCs w:val="24"/><w:lang w:eastAsia="pt-BR"/></w:rPr><w:t>Berços de Fixação do Container</w:t></w:r></w:p></w:tc><w:tc><w:tcPr><w:tcW w:w="2400" w:type="dxa"/><w:tcBorders><w:top w:val="single" w:sz="4" w:space="0" w:color="auto"/><w:left w:val="nil"/><w:bottom w:val="single" w:sz="4" w:space="0" w:color="auto"/><w:right w:val="single" w:sz="4" w:space="0" w:color="auto"/></w:tcBorders><w:vAlign w:val="bottom"/></w:tcPr><w:p><w:pPr><w:pStyle w:val="Ttulo2"/><w:jc w:val="center"/><w:rPr><w:rFonts w:eastAsia="Times New Roman"/><w:color w:val="1F3864"/><w:sz w:val="24"/><w:szCs w:val="24"/><w:lang w:eastAsia="pt-BR"/></w:rPr></w:pPr><w:r><w:rPr><w:rFonts w:eastAsia="Times New Roman"/><w:color w:val="1F3864"/><w:sz w:val="24"/><w:szCs w:val="24"/><w:lang w:eastAsia="pt-BR"/></w:rPr><w:t xml:space="preserve">APROVADO </w:t></w:r></w:p></w:tc></w:tr><w:tr><w:trPr><w:trHeight w:val="315"/></w:trPr><w:tc><w:tcPr><w:tcW w:w="7240" w:type="dxa"/><w:tcBorders><w:top w:val="single" w:sz="4" w:space="0" w:color="auto"/><w:left w:val="single" w:sz="4" w:space="0" w:color="auto"/><w:bottom w:val="single" w:sz="4" w:space="0" w:color="auto"/><w:right w:val="single" w:sz="4" w:space="0" w:color="auto"/></w:tcBorders><w:noWrap/><w:vAlign w:val="bottom"/></w:tcPr><w:p><w:pPr><w:pStyle w:val="Ttulo2"/><w:jc w:val="center"/><w:rPr><w:rFonts w:eastAsia="Times New Roman"/><w:b/><w:bCs/><w:color w:val="FF0000"/><w:sz w:val="24"/><w:szCs w:val="24"/><w:lang w:eastAsia="pt-BR"/></w:rPr></w:pPr><w:r><w:rPr><w:rFonts w:eastAsia="Times New Roman"/><w:b/><w:bCs/><w:color w:val="auto"/><w:sz w:val="24"/><w:szCs w:val="24"/><w:lang w:eastAsia="pt-BR"/></w:rPr><w:t xml:space="preserve">Mossas, Escavações, Cortes, Trincas e </w:t></w:r><w:r><w:rPr><w:rFonts w:eastAsia="Times New Roman"/><w:b/><w:bCs/><w:color w:val="auto"/><w:sz w:val="24"/><w:szCs w:val="24"/><w:lang w:eastAsia="pt-BR"/></w:rPr><w:t>Corrosão</w:t></w:r></w:p></w:tc><w:tc><w:tcPr><w:tcW w:w="2400" w:type="dxa"/><w:tcBorders><w:top w:val="single" w:sz="4" w:space="0" w:color="auto"/><w:left w:val="nil"/><w:bottom w:val="single" w:sz="4" w:space="0" w:color="auto"/><w:right w:val="single" w:sz="4" w:space="0" w:color="auto"/></w:tcBorders><w:vAlign w:val="center"/></w:tcPr><w:p><w:pPr><w:pStyle w:val="Ttulo2"/><w:jc w:val="center"/><w:rPr><w:rFonts w:eastAsia="Times New Roman"/><w:color w:val="FF0000"/><w:sz w:val="24"/><w:szCs w:val="24"/><w:lang w:eastAsia="pt-BR"/></w:rPr></w:pPr><w:r><w:rPr><w:rFonts w:eastAsia="Times New Roman"/><w:color w:val="244061" w:themeColor="accent1" w:themeShade="80"/><w:sz w:val="24"/><w:szCs w:val="24"/><w:lang w:eastAsia="pt-BR"/></w:rPr><w:t>APROVADO</w:t></w:r></w:p></w:tc></w:tr><w:tr><w:trPr><w:trHeight w:val="315"/></w:trPr><w:tc><w:tcPr><w:tcW w:w="7240" w:type="dxa"/><w:tcBorders><w:top w:val="single" w:sz="4" w:space="0" w:color="auto"/><w:left w:val="single" w:sz="4" w:space="0" w:color="auto"/><w:bottom w:val="single" w:sz="4" w:space="0" w:color="auto"/><w:right w:val="single" w:sz="4" w:space="0" w:color="auto"/></w:tcBorders><w:noWrap/><w:vAlign w:val="bottom"/></w:tcPr><w:p><w:pPr><w:pStyle w:val="Ttulo2"/><w:jc w:val="center"/><w:rPr><w:rFonts w:eastAsia="Times New Roman"/><w:b/><w:bCs/><w:color w:val="FF0000"/><w:sz w:val="24"/><w:szCs w:val="24"/><w:lang w:eastAsia="pt-BR"/></w:rPr></w:pPr><w:r><w:rPr><w:rFonts w:eastAsia="Times New Roman"/><w:b/><w:bCs/><w:color w:val="000000" w:themeColor="text1"/><w:sz w:val="24"/><w:szCs w:val="24"/><w:lang w:eastAsia="pt-BR"/></w:rPr><w:t>Porosidade dos Cordões e Solda</w:t></w:r></w:p></w:tc><w:tc><w:tcPr><w:tcW w:w="2400" w:type="dxa"/><w:tcBorders><w:top w:val="single" w:sz="4" w:space="0" w:color="auto"/><w:left w:val="nil"/><w:bottom w:val="single" w:sz="4" w:space="0" w:color="auto"/><w:right w:val="single" w:sz="4" w:space="0" w:color="auto"/></w:tcBorders><w:vAlign w:val="bottom"/></w:tcPr><w:p><w:pPr><w:pStyle w:val="Ttulo2"/><w:jc w:val="center"/><w:rPr><w:rFonts w:eastAsia="Times New Roman"/><w:color w:val="FF0000"/><w:sz w:val="24"/><w:szCs w:val="24"/><w:lang w:eastAsia="pt-BR"/></w:rPr></w:pPr><w:r><w:rPr><w:rFonts w:eastAsia="Times New Roman"/><w:color w:val="17365D" w:themeColor="text2" w:themeShade="BF"/><w:sz w:val="24"/><w:szCs w:val="24"/><w:lang w:eastAsia="pt-BR"/></w:rPr><w:t>APROVADO</w:t></w:r></w:p></w:tc></w:tr></w:tbl><w:p><w:pPr><w:spacing w:after="0" w:line="240" w:lineRule="auto"/><w:rPr><w:rFonts w:ascii="Calibri-Bold" w:eastAsia="Arial MT" w:hAnsi="Calibri-Bold" w:cs="Arial MT"/><w:b/><w:bCs/><w:color w:val="000000"/><w:sz w:val="28"/><w:szCs w:val="28"/><w:lang w:val="pt-PT"/></w:rPr></w:pPr></w:p><w:tbl><w:tblPr><w:tblpPr w:leftFromText="141" w:rightFromText="141" w:vertAnchor="text" w:horzAnchor="margin" w:tblpXSpec="center" w:tblpY="187"/><w:tblW w:w="9650" w:type="dxa"/><w:tblCellMar><w:left w:w="70" w:type="dxa"/><w:right w:w="70" w:type="dxa"/></w:tblCellMar><w:tblLook w:val="04A0" w:firstRow="1" w:lastRow="0" w:firstColumn="1" w:lastColumn="0" w:noHBand="0" w:noVBand="1"/></w:tblPr><w:tblGrid><w:gridCol w:w="7225"/><w:gridCol w:w="2425"/></w:tblGrid><w:tr><w:trPr><w:trHeight w:val="315"/></w:trPr><w:tc><w:tcPr><w:tcW w:w="9650" w:type="dxa"/><w:gridSpan w:val="2"/><w:tcBorders><w:top w:val="single" w:sz="4" w:space="0" w:color="auto"/><w:left w:val="single" w:sz="4" w:space="0" w:color="auto"/><w:bottom w:val="single" w:sz="4" w:space="0" w:color="auto"/><w:right w:val="single" w:sz="4" w:space="0" w:color="auto"/></w:tcBorders><w:shd w:val="clear" w:color="auto" w:fill="1F497D" w:themeFill="text2"/><w:noWrap/><w:vAlign w:val="bottom"/></w:tcPr><w:p><w:pPr><w:pStyle w:val="Ttulo2"/><w:jc w:val="center"/><w:rPr><w:rFonts w:eastAsia="Times New Roman"/><w:b/><w:bCs/><w:color w:val="1F3864"/><w:sz w:val="24"/><w:szCs w:val="24"/><w:lang w:eastAsia="pt-BR"/></w:rPr></w:pPr><w:r><w:rPr><w:rFonts w:eastAsia="Times New Roman"/><w:b/><w:bCs/><w:color w:val="FFFFFF" w:themeColor="background1"/><w:sz w:val="24"/><w:szCs w:val="24"/><w:lang w:eastAsia="pt-BR"/></w:rPr><w:t>COMPONENTES E ACESSÓRIOS</w:t></w:r></w:p></w:tc></w:tr><w:tr><w:trPr><w:trHeight w:val="315"/></w:trPr><w:tc><w:tcPr><w:tcW w:w="7225" w:type="dxa"/><w:tcBorders><w:top w:val="single" w:sz="4" w:space="0" w:color="auto"/><w:left w:val="single" w:sz="4" w:space="0" w:color="auto"/><w:bottom w:val="single" w:sz="4" w:space="0" w:color="auto"/><w:right w:val="single" w:sz="4" w:space="0" w:color="auto"/></w:tcBorders><w:noWrap/><w:vAlign w:val="bottom"/></w:tcPr><w:p><w:pPr><w:pStyle w:val="Ttulo2"/><w:jc w:val="center"/><w:rPr><w:rFonts w:eastAsia="Times New Roman"/><w:b/><w:bCs/><w:color w:val="auto"/><w:sz w:val="24"/><w:szCs w:val="24"/><w:lang w:eastAsia="pt-BR"/></w:rPr></w:pPr><w:r><w:rPr><w:rFonts w:eastAsia="Times New Roman"/><w:b/><w:bCs/><w:color w:val="auto"/><w:sz w:val="24"/><w:szCs w:val="24"/><w:lang w:eastAsia="pt-BR"/></w:rPr><w:t xml:space="preserve">Bocal de Descarga </w:t></w:r></w:p></w:tc><w:tc><w:tcPr><w:tcW w:w="2425" w:type="dxa"/><w:tcBorders><w:top w:val="single" w:sz="4" w:space="0" w:color="auto"/><w:left w:val="nil"/><w:bottom w:val="single" w:sz="4" w:space="0" w:color="auto"/><w:right w:val="single" w:sz="4" w:space="0" w:color="auto"/></w:tcBorders><w:noWrap/><w:vAlign w:val="bottom"/></w:tcPr><w:p><w:pPr><w:pStyle w:val="Ttulo2"/><w:jc w:val="center"/><w:rPr><w:rFonts w:eastAsia="Times New Roman"/><w:color w:val="1F3864"/><w:sz w:val="24"/><w:szCs w:val="24"/><w:lang w:eastAsia="pt-BR"/></w:rPr></w:pPr><w:r><w:rPr><w:rFonts w:eastAsia="Times New Roman"/><w:color w:val="1F3864"/><w:sz w:val="24"/><w:szCs w:val="24"/><w:lang w:eastAsia="pt-BR"/></w:rPr><w:t>APROVADO</w:t></w:r></w:p></w:tc></w:tr><w:tr><w:trPr><w:trHeight w:val="315"/></w:trPr><w:tc><w:tcPr><w:tcW w:w="7225" w:type="dxa"/><w:tcBorders><w:top w:val="single" w:sz="4" w:space="0" w:color="auto"/><w:left w:val="single" w:sz="4" w:space="0" w:color="auto"/><w:bottom w:val="single" w:sz="4" w:space="0" w:color="auto"/><w:right w:val="single" w:sz="4" w:space="0" w:color="auto"/></w:tcBorders><w:noWrap/><w:vAlign w:val="bottom"/></w:tcPr><w:p><w:pPr><w:pStyle w:val="Ttulo2"/><w:jc w:val="center"/><w:rPr><w:rFonts w:eastAsia="Times New Roman"/><w:b/><w:bCs/><w:color w:val="auto"/><w:sz w:val="24"/><w:szCs w:val="24"/><w:lang w:eastAsia="pt-BR"/></w:rPr></w:pPr><w:r><w:rPr><w:rFonts w:eastAsia="Times New Roman"/><w:b/><w:bCs/><w:color w:val="auto"/><w:sz w:val="24"/><w:szCs w:val="24"/><w:lang w:eastAsia="pt-BR"/></w:rPr><w:t>Boca de Visita</w:t></w:r></w:p></w:tc><w:tc><w:tcPr><w:tcW w:w="2425" w:type="dxa"/><w:tcBorders><w:top w:val="single" w:sz="4" w:space="0" w:color="auto"/><w:left w:val="nil"/><w:bottom w:val="single" w:sz="4" w:space="0" w:color="auto"/><w:right w:val="single" w:sz="4" w:space="0" w:color="auto"/></w:tcBorders><w:noWrap/><w:vAlign w:val="center"/><w:hideMark/></w:tcPr><w:p><w:pPr><w:pStyle w:val="Ttulo2"/><w:jc w:val="center"/><w:rPr><w:rFonts w:eastAsia="Times New Roman"/><w:color w:val="1F3864"/><w:sz w:val="24"/><w:szCs w:val="24"/><w:lang w:eastAsia="pt-BR"/></w:rPr></w:pPr><w:r><w:rPr><w:rFonts w:eastAsia="Times New Roman"/><w:color w:val="1F3864"/><w:sz w:val="24"/><w:szCs w:val="24"/><w:lang w:eastAsia="pt-BR"/></w:rPr><w:t>APROVADO</w:t></w:r></w:p></w:tc></w:tr><w:tr><w:trPr><w:trHeight w:val="315"/></w:trPr><w:tc><w:tcPr><w:tcW w:w="7225" w:type="dxa"/><w:tcBorders><w:top w:val="single" w:sz="4" w:space="0" w:color="auto"/><w:left w:val="single" w:sz="4" w:space="0" w:color="auto"/><w:bottom w:val="single" w:sz="4" w:space="0" w:color="auto"/><w:right w:val="single" w:sz="4" w:space="0" w:color="auto"/></w:tcBorders><w:noWrap/><w:vAlign w:val="bottom"/></w:tcPr><w:p><w:pPr><w:pStyle w:val="Ttulo2"/><w:jc w:val="center"/><w:rPr><w:rFonts w:eastAsia="Times New Roman"/><w:b/><w:bCs/><w:color w:val="FF0000"/><w:sz w:val="24"/><w:szCs w:val="24"/><w:lang w:eastAsia="pt-BR"/></w:rPr></w:pPr><w:r><w:rPr><w:rFonts w:eastAsia="Times New Roman"/><w:b/><w:bCs/><w:color w:val="000000" w:themeColor="text1"/><w:sz w:val="24"/><w:szCs w:val="24"/><w:lang w:eastAsia="pt-BR"/></w:rPr><w:t>Válvula de Alívio</w:t></w:r></w:p></w:tc><w:tc><w:tcPr><w:tcW w:w="2425" w:type="dxa"/><w:tcBorders><w:top w:val="single" w:sz="4" w:space="0" w:color="auto"/><w:left w:val="nil"/><w:bottom w:val="single" w:sz="4" w:space="0" w:color="auto"/><w:right w:val="single" w:sz="4" w:space="0" w:color="auto"/></w:tcBorders><w:noWrap/><w:vAlign w:val="bottom"/><w:hideMark/></w:tcPr><w:p><w:pPr><w:pStyle w:val="Ttulo2"/><w:jc w:val="center"/><w:rPr><w:rFonts w:eastAsia="Times New Roman"/><w:color w:val="FF0000"/><w:sz w:val="24"/><w:szCs w:val="24"/><w:lang w:eastAsia="pt-BR"/></w:rPr></w:pPr><w:r><w:rPr><w:rFonts w:eastAsia="Times New Roman"/><w:color w:val="17365D" w:themeColor="text2" w:themeShade="BF"/><w:sz w:val="24"/><w:szCs w:val="24"/><w:lang w:eastAsia="pt-BR"/></w:rPr><w:t>N/A</w:t></w:r></w:p></w:tc></w:tr><w:tr><w:trPr><w:trHeight w:val="315"/></w:trPr><w:tc><w:tcPr><w:tcW w:w="7225" w:type="dxa"/><w:tcBorders><w:top w:val="single" w:sz="4" w:space="0" w:color="auto"/><w:left w:val="single" w:sz="4" w:space="0" w:color="auto"/><w:bottom w:val="single" w:sz="4" w:space="0" w:color="auto"/><w:right w:val="single" w:sz="4" w:space="0" w:color="auto"/></w:tcBorders><w:noWrap/><w:vAlign w:val="center"/></w:tcPr><w:p><w:pPr><w:pStyle w:val="Ttulo2"/><w:jc w:val="center"/><w:rPr><w:rFonts w:eastAsia="Times New Roman"/><w:b/><w:bCs/><w:color w:val="auto"/><w:sz w:val="24"/><w:szCs w:val="24"/><w:lang w:eastAsia="pt-BR"/></w:rPr></w:pPr><w:r><w:rPr><w:rFonts w:eastAsia="Times New Roman"/><w:b/><w:bCs/><w:color w:val="auto"/><w:sz w:val="24"/><w:szCs w:val="24"/><w:lang w:eastAsia="pt-BR"/></w:rPr><w:t>Linha de Ar</w:t></w:r></w:p></w:tc><w:tc><w:tcPr><w:tcW w:w="2425" w:type="dxa"/><w:tcBorders><w:top w:val="single" w:sz="4" w:space="0" w:color="auto"/><w:left w:val="nil"/><w:bottom w:val="single" w:sz="4" w:space="0" w:color="auto"/><w:right w:val="single" w:sz="4" w:space="0" w:color="auto"/></w:tcBorders><w:noWrap/><w:vAlign w:val="bottom"/><w:hideMark/></w:tcPr><w:p><w:pPr><w:pStyle w:val="Ttulo2"/><w:jc w:val="center"/><w:rPr><w:rFonts w:eastAsia="Times New Roman"/><w:color w:val="1F3864"/><w:sz w:val="24"/><w:szCs w:val="24"/><w:lang w:eastAsia="pt-BR"/></w:rPr></w:pPr><w:r><w:rPr><w:rFonts w:eastAsia="Times New Roman"/><w:color w:val="1F3864"/><w:sz w:val="24"/><w:szCs w:val="24"/><w:lang w:eastAsia="pt-BR"/></w:rPr><w:t>APROVADO</w:t></w:r></w:p></w:tc></w:tr><w:tr><w:trPr><w:trHeight w:val="315"/></w:trPr><w:tc><w:tcPr><w:tcW w:w="7225" w:type="dxa"/><w:tcBorders><w:top w:val="single" w:sz="4" w:space="0" w:color="auto"/><w:left w:val="single" w:sz="4" w:space="0" w:color="auto"/><w:bottom w:val="single" w:sz="4" w:space="0" w:color="auto"/><w:right w:val="single" w:sz="4" w:space="0" w:color="auto"/></w:tcBorders><w:noWrap/><w:vAlign w:val="bottom"/></w:tcPr><w:p><w:pPr><w:pStyle w:val="Ttulo2"/><w:jc w:val="center"/><w:rPr><w:rFonts w:eastAsia="Times New Roman"/><w:b/><w:bCs/><w:color w:val="FF0000"/><w:sz w:val="24"/><w:szCs w:val="24"/><w:lang w:eastAsia="pt-BR"/></w:rPr></w:pPr><w:r><w:rPr><w:rFonts w:eastAsia="Times New Roman"/><w:b/><w:bCs/><w:color w:val="000000" w:themeColor="text1"/><w:sz w:val="24"/><w:szCs w:val="24"/><w:lang w:eastAsia="pt-BR"/></w:rPr><w:t>Linha de Recuperação de V</w:t></w:r><w:r><w:rPr><w:rFonts w:eastAsia="Times New Roman"/><w:b/><w:bCs/><w:color w:val="000000" w:themeColor="text1"/><w:sz w:val="24"/><w:szCs w:val="24"/><w:lang w:eastAsia="pt-BR"/></w:rPr><w:t>apor</w:t></w:r></w:p></w:tc><w:tc><w:tcPr><w:tcW w:w="2425" w:type="dxa"/><w:tcBorders><w:top w:val="single" w:sz="4" w:space="0" w:color="auto"/><w:left w:val="nil"/><w:bottom w:val="single" w:sz="4" w:space="0" w:color="auto"/><w:right w:val="single" w:sz="4" w:space="0" w:color="auto"/></w:tcBorders><w:noWrap/><w:vAlign w:val="bottom"/><w:hideMark/></w:tcPr><w:p><w:pPr><w:pStyle w:val="Ttulo2"/><w:jc w:val="center"/><w:rPr><w:rFonts w:eastAsia="Times New Roman"/><w:color w:val="FF0000"/><w:sz w:val="24"/><w:szCs w:val="24"/><w:lang w:eastAsia="pt-BR"/></w:rPr></w:pPr><w:r><w:rPr><w:rFonts w:eastAsia="Times New Roman"/><w:color w:val="17365D" w:themeColor="text2" w:themeShade="BF"/><w:sz w:val="24"/><w:szCs w:val="24"/><w:lang w:eastAsia="pt-BR"/></w:rPr><w:t>N/A</w:t></w:r></w:p></w:tc></w:tr><w:tr><w:trPr><w:trHeight w:val="315"/></w:trPr><w:tc><w:tcPr><w:tcW w:w="7225" w:type="dxa"/><w:tcBorders><w:top w:val="single" w:sz="4" w:space="0" w:color="auto"/><w:left w:val="single" w:sz="4" w:space="0" w:color="auto"/><w:bottom w:val="single" w:sz="4" w:space="0" w:color="auto"/><w:right w:val="single" w:sz="4" w:space="0" w:color="auto"/></w:tcBorders><w:noWrap/><w:vAlign w:val="bottom"/></w:tcPr><w:p><w:pPr><w:pStyle w:val="Ttulo2"/><w:jc w:val="center"/><w:rPr><w:rFonts w:eastAsia="Times New Roman"/><w:b/><w:bCs/><w:color w:val="auto"/><w:sz w:val="24"/><w:szCs w:val="24"/><w:lang w:eastAsia="pt-BR"/></w:rPr></w:pPr><w:r><w:rPr><w:rFonts w:eastAsia="Times New Roman"/><w:b/><w:bCs/><w:color w:val="auto"/><w:sz w:val="24"/><w:szCs w:val="24"/><w:lang w:eastAsia="pt-BR"/></w:rPr><w:t>Sistema de Acionamento Remoto</w:t></w:r></w:p></w:tc><w:tc><w:tcPr><w:tcW w:w="2425" w:type="dxa"/><w:tcBorders><w:top w:val="single" w:sz="4" w:space="0" w:color="auto"/><w:left w:val="nil"/><w:bottom w:val="single" w:sz="4" w:space="0" w:color="auto"/><w:right w:val="single" w:sz="4" w:space="0" w:color="auto"/></w:tcBorders><w:noWrap/><w:vAlign w:val="bottom"/><w:hideMark/></w:tcPr><w:p><w:pPr><w:pStyle w:val="Ttulo2"/><w:jc w:val="center"/><w:rPr><w:rFonts w:eastAsia="Times New Roman"/><w:color w:val="1F3864"/><w:sz w:val="24"/><w:szCs w:val="24"/><w:lang w:eastAsia="pt-BR"/></w:rPr></w:pPr><w:r><w:rPr><w:rFonts w:eastAsia="Times New Roman"/><w:color w:val="1F3864"/><w:sz w:val="24"/><w:szCs w:val="24"/><w:lang w:eastAsia="pt-BR"/></w:rPr><w:t>APROVADO</w:t></w:r></w:p></w:tc></w:tr><w:tr><w:trPr><w:trHeight w:val="315"/></w:trPr><w:tc><w:tcPr><w:tcW w:w="7225" w:type="dxa"/><w:tcBorders><w:top w:val="single" w:sz="4" w:space="0" w:color="auto"/><w:left w:val="single" w:sz="4" w:space="0" w:color="auto"/><w:bottom w:val="single" w:sz="4" w:space="0" w:color="auto"/><w:right w:val="single" w:sz="4" w:space="0" w:color="auto"/></w:tcBorders><w:noWrap/><w:vAlign w:val="bottom"/></w:tcPr><w:p><w:pPr><w:pStyle w:val="Ttulo2"/><w:jc w:val="center"/><w:rPr><w:rFonts w:eastAsia="Times New Roman"/><w:b/><w:bCs/><w:color w:val="auto"/><w:sz w:val="24"/><w:szCs w:val="24"/><w:lang w:eastAsia="pt-BR"/></w:rPr></w:pPr><w:r><w:rPr><w:rFonts w:eastAsia="Times New Roman"/><w:b/><w:bCs/><w:color w:val="auto"/><w:sz w:val="24"/><w:szCs w:val="24"/><w:lang w:eastAsia="pt-BR"/></w:rPr><w:t>Tomada</w:t></w:r><w:r><w:rPr><w:rFonts w:eastAsia="Times New Roman"/><w:b/><w:bCs/><w:color w:val="auto"/><w:sz w:val="24"/><w:szCs w:val="24"/><w:lang w:eastAsia="pt-BR"/></w:rPr><w:t xml:space="preserve"> de Saída de Vapor </w:t></w:r></w:p></w:tc><w:tc><w:tcPr><w:tcW w:w="2425" w:type="dxa"/><w:tcBorders><w:top w:val="single" w:sz="4" w:space="0" w:color="auto"/><w:left w:val="nil"/><w:bottom w:val="single" w:sz="4" w:space="0" w:color="auto"/><w:right w:val="single" w:sz="4" w:space="0" w:color="auto"/></w:tcBorders><w:noWrap/><w:vAlign w:val="bottom"/><w:hideMark/></w:tcPr><w:p><w:pPr><w:pStyle w:val="Ttulo2"/><w:jc w:val="center"/><w:rPr><w:rFonts w:eastAsia="Times New Roman"/><w:color w:val="1F3864"/><w:sz w:val="24"/><w:szCs w:val="24"/><w:lang w:eastAsia="pt-BR"/></w:rPr></w:pPr><w:r><w:rPr><w:rFonts w:eastAsia="Times New Roman"/><w:color w:val="1F3864"/><w:sz w:val="24"/><w:szCs w:val="24"/><w:lang w:eastAsia="pt-BR"/></w:rPr><w:t xml:space="preserve">APROVADO </w:t></w:r></w:p></w:tc></w:tr><w:tr><w:trPr><w:trHeight w:val="315"/></w:trPr><w:tc><w:tcPr><w:tcW w:w="7225" w:type="dxa"/><w:tcBorders><w:top w:val="single" w:sz="4" w:space="0" w:color="auto"/><w:left w:val="single" w:sz="4" w:space="0" w:color="auto"/><w:bottom w:val="single" w:sz="4" w:space="0" w:color="auto"/><w:right w:val="single" w:sz="4" w:space="0" w:color="auto"/></w:tcBorders><w:noWrap/><w:vAlign w:val="bottom"/></w:tcPr><w:p><w:pPr><w:pStyle w:val="Ttulo2"/><w:jc w:val="center"/><w:rPr><w:rFonts w:eastAsia="Times New Roman"/><w:b/><w:bCs/><w:color w:val="FF0000"/><w:sz w:val="24"/><w:szCs w:val="24"/><w:lang w:eastAsia="pt-BR"/></w:rPr></w:pPr><w:r><w:rPr><w:rFonts w:eastAsia="Times New Roman"/><w:b/><w:bCs/><w:color w:val="000000" w:themeColor="text1"/><w:sz w:val="24"/><w:szCs w:val="24"/><w:lang w:eastAsia="pt-BR"/></w:rPr><w:lastRenderedPageBreak/><w:t>Sistema de Carga e Descarga</w:t></w:r></w:p></w:tc><w:tc><w:tcPr><w:tcW w:w="2425" w:type="dxa"/><w:tcBorders><w:top w:val="single" w:sz="4" w:space="0" w:color="auto"/><w:left w:val="nil"/><w:bottom w:val="single" w:sz="4" w:space="0" w:color="auto"/><w:right w:val="single" w:sz="4" w:space="0" w:color="auto"/></w:tcBorders><w:noWrap/><w:vAlign w:val="bottom"/><w:hideMark/></w:tcPr><w:p><w:pPr><w:pStyle w:val="Ttulo2"/><w:jc w:val="center"/><w:rPr><w:rFonts w:eastAsia="Times New Roman"/><w:color w:val="FF0000"/><w:sz w:val="24"/><w:szCs w:val="24"/><w:lang w:eastAsia="pt-BR"/></w:rPr></w:pPr><w:r><w:rPr><w:rFonts w:eastAsia="Times New Roman"/><w:color w:val="17365D" w:themeColor="text2" w:themeShade="BF"/><w:sz w:val="24"/><w:szCs w:val="24"/><w:lang w:eastAsia="pt-BR"/></w:rPr><w:t>APROVADO</w:t></w:r></w:p></w:tc></w:tr><w:tr><w:trPr><w:trHeight w:val="206"/></w:trPr><w:tc><w:tcPr><w:tcW w:w="7225" w:type="dxa"/><w:tcBorders><w:top w:val="single" w:sz="4" w:space="0" w:color="auto"/><w:left w:val="single" w:sz="4" w:space="0" w:color="auto"/><w:bottom w:val="single" w:sz="4" w:space="0" w:color="auto"/><w:right w:val="single" w:sz="4" w:space="0" w:color="auto"/></w:tcBorders><w:noWrap/><w:vAlign w:val="bottom"/></w:tcPr><w:p><w:pPr><w:pStyle w:val="Ttulo2"/><w:jc w:val="center"/><w:rPr><w:rFonts w:eastAsia="Times New Roman"/><w:b/><w:bCs/><w:color w:val="FF0000"/><w:sz w:val="24"/><w:szCs w:val="24"/><w:lang w:eastAsia="pt-BR"/></w:rPr></w:pPr><w:r><w:rPr><w:rFonts w:eastAsia="Times New Roman"/><w:b/><w:bCs/><w:color w:val="000000" w:themeColor="text1"/><w:sz w:val="24"/><w:szCs w:val="24"/><w:lang w:eastAsia="pt-BR"/></w:rPr><w:t xml:space="preserve">Dispositivo de Medição de Volume </w:t></w:r></w:p></w:tc><w:tc><w:tcPr><w:tcW w:w="2425" w:type="dxa"/><w:tcBorders><w:top w:val="single" w:sz="4" w:space="0" w:color="auto"/><w:left w:val="nil"/><w:bottom w:val="single" w:sz="4" w:space="0" w:color="auto"/><w:right w:val="single" w:sz="4" w:space="0" w:color="auto"/></w:tcBorders><w:noWrap/><w:vAlign w:val="bottom"/><w:hideMark/></w:tcPr><w:p><w:pPr><w:pStyle w:val="Ttulo2"/><w:jc w:val="center"/><w:rPr><w:rFonts w:eastAsia="Times New Roman"/><w:color w:val="FF0000"/><w:sz w:val="24"/><w:szCs w:val="24"/><w:lang w:eastAsia="pt-BR"/></w:rPr></w:pPr><w:r><w:rPr><w:rFonts w:eastAsia="Times New Roman"/><w:color w:val="17365D" w:themeColor="text2" w:themeShade="BF"/><w:sz w:val="24"/><w:szCs w:val="24"/><w:lang w:eastAsia="pt-BR"/></w:rPr><w:t>N/A</w:t></w:r></w:p></w:tc></w:tr><w:tr><w:trPr><w:trHeight w:val="315"/></w:trPr><w:tc><w:tcPr><w:tcW w:w="7225" w:type="dxa"/><w:tcBorders><w:top w:val="single" w:sz="4" w:space="0" w:color="auto"/><w:left w:val="single" w:sz="4" w:space="0" w:color="auto"/><w:bottom w:val="single" w:sz="4" w:space="0" w:color="auto"/><w:right w:val="single" w:sz="4" w:space="0" w:color="auto"/></w:tcBorders><w:noWrap/><w:vAlign w:val="center"/></w:tcPr><w:p><w:pPr><w:pStyle w:val="Ttulo2"/><w:jc w:val="center"/><w:rPr><w:rFonts w:eastAsia="Times New Roman"/><w:b/><w:bCs/><w:color w:val="auto"/><w:sz w:val="24"/><w:szCs w:val="24"/><w:lang w:eastAsia="pt-BR"/></w:rPr></w:pPr><w:r><w:rPr><w:rFonts w:eastAsia="Times New Roman"/><w:b/><w:bCs/><w:color w:val="auto"/><w:sz w:val="24"/><w:szCs w:val="24"/><w:lang w:eastAsia="pt-BR"/></w:rPr><w:t>Válvula de Fundo</w:t></w:r></w:p></w:tc><w:tc><w:tcPr><w:tcW w:w="2425" w:type="dxa"/><w:tcBorders><w:top w:val="single" w:sz="4" w:space="0" w:color="auto"/><w:left w:val="nil"/><w:bottom w:val="single" w:sz="4" w:space="0" w:color="auto"/><w:right w:val="single" w:sz="4" w:space="0" w:color="auto"/></w:tcBorders><w:noWrap/><w:vAlign w:val="center"/><w:hideMark/></w:tcPr><w:p><w:pPr><w:pStyle w:val="Ttulo2"/><w:jc w:val="center"/><w:rPr><w:rFonts w:eastAsia="Times New Roman"/><w:color w:val="1F3864"/><w:sz w:val="24"/><w:szCs w:val="24"/><w:lang w:eastAsia="pt-BR"/></w:rPr></w:pPr><w:r><w:rPr><w:rFonts w:eastAsia="Times New Roman"/><w:color w:val="1F3864"/><w:sz w:val="24"/><w:szCs w:val="24"/><w:lang w:eastAsia="pt-BR"/></w:rPr><w:t>N/A</w:t></w:r></w:p><w:p><w:pPr><w:rPr><w:color w:val="1F3864"/><w:sz w:val="24"/><w:szCs w:val="24"/><w:lang w:eastAsia="pt-BR"/></w:rPr></w:pPr></w:p></w:tc></w:tr><w:tr><w:trPr><w:trHeight w:val="315"/></w:trPr><w:tc><w:tcPr><w:tcW w:w="7225" w:type="dxa"/><w:tcBorders><w:top w:val="single" w:sz="4" w:space="0" w:color="auto"/><w:left w:val="single" w:sz="4" w:space="0" w:color="auto"/><w:bottom w:val="single" w:sz="4" w:space="0" w:color="auto"/><w:right w:val="single" w:sz="4" w:space="0" w:color="auto"/></w:tcBorders><w:noWrap/><w:vAlign w:val="bottom"/></w:tcPr><w:p><w:pPr><w:pStyle w:val="Ttulo2"/><w:jc w:val="center"/><w:rPr><w:rFonts w:eastAsia="Times New Roman"/><w:b/><w:bCs/><w:color w:val="auto"/><w:sz w:val="24"/><w:szCs w:val="24"/><w:lang w:eastAsia="pt-BR"/></w:rPr></w:pPr><w:r><w:rPr><w:rFonts w:eastAsia="Times New Roman"/><w:b/><w:bCs/><w:color w:val="000000" w:themeColor="text1"/><w:sz w:val="24"/><w:szCs w:val="24"/><w:lang w:eastAsia="pt-BR"/></w:rPr><w:t>Tomada</w:t></w:r><w:r><w:rPr><w:rFonts w:eastAsia="Times New Roman"/><w:b/><w:bCs/><w:color w:val="auto"/><w:sz w:val="24"/><w:szCs w:val="24"/><w:lang w:eastAsia="pt-BR"/></w:rPr><w:t xml:space="preserve"> de Entrada de Vapor</w:t></w:r></w:p></w:tc><w:tc><w:tcPr><w:tcW w:w="2425" w:type="dxa"/><w:tcBorders><w:top w:val="single" w:sz="4" w:space="0" w:color="auto"/><w:left w:val="nil"/><w:bottom w:val="single" w:sz="4" w:space="0" w:color="auto"/><w:right w:val="single" w:sz="4" w:space="0" w:color="auto"/></w:tcBorders><w:noWrap/><w:vAlign w:val="bottom"/><w:hideMark/></w:tcPr><w:p><w:pPr><w:pStyle w:val="Ttulo2"/><w:jc w:val="center"/><w:rPr><w:rFonts w:eastAsia="Times New Roman"/><w:color w:val="1F3864"/><w:sz w:val="24"/><w:szCs w:val="24"/><w:lang w:eastAsia="pt-BR"/></w:rPr></w:pPr><w:r><w:rPr><w:rFonts w:eastAsia="Times New Roman"/><w:color w:val="1F3864"/><w:sz w:val="24"/><w:szCs w:val="24"/><w:lang w:eastAsia="pt-BR"/></w:rPr><w:t xml:space="preserve">APROVADO </w:t></w:r></w:p></w:tc></w:tr><w:tr><w:trPr><w:trHeight w:val="315"/></w:trPr><w:tc><w:tcPr><w:tcW w:w="7225" w:type="dxa"/><w:tcBorders><w:top w:val="single" w:sz="4" w:space="0" w:color="auto"/><w:left w:val="single" w:sz="4" w:space="0" w:color="auto"/><w:bottom w:val="single" w:sz="4" w:space="0" w:color="auto"/><w:right w:val="single" w:sz="4" w:space="0" w:color="auto"/></w:tcBorders><w:noWrap/><w:vAlign w:val="bottom"/></w:tcPr><w:p><w:pPr><w:pStyle w:val="Ttulo2"/><w:jc w:val="center"/><w:rPr><w:rFonts w:eastAsia="Times New Roman"/><w:b/><w:bCs/><w:color w:val="auto"/><w:sz w:val="24"/><w:szCs w:val="24"/><w:lang w:eastAsia="pt-BR"/></w:rPr></w:pPr><w:r><w:rPr><w:rFonts w:eastAsia="Times New Roman"/><w:b/><w:bCs/><w:color w:val="auto"/><w:sz w:val="24"/><w:szCs w:val="24"/><w:lang w:eastAsia="pt-BR"/></w:rPr><w:t>Termômetro</w:t></w:r></w:p></w:tc><w:tc><w:tcPr><w:tcW w:w="2425" w:type="dxa"/><w:tcBorders><w:top w:val="single" w:sz="4" w:space="0" w:color="auto"/><w:left w:val="nil"/><w:bottom w:val="single" w:sz="4" w:space="0" w:color="auto"/><w:right w:val="single" w:sz="4" w:space="0" w:color="auto"/></w:tcBorders><w:noWrap/><w:vAlign w:val="bottom"/><w:hideMark/></w:tcPr><w:p><w:pPr><w:pStyle w:val="Ttulo2"/><w:jc w:val="center"/><w:rPr><w:rFonts w:eastAsia="Times New Roman"/><w:color w:val="1F3864"/><w:sz w:val="24"/><w:szCs w:val="24"/><w:lang w:eastAsia="pt-BR"/></w:rPr></w:pPr><w:r><w:rPr><w:rFonts w:eastAsia="Times New Roman"/><w:color w:val="1F3864"/><w:sz w:val="24"/><w:szCs w:val="24"/><w:lang w:eastAsia="pt-BR"/></w:rPr><w:t xml:space="preserve">APROVADO </w:t></w:r></w:p></w:tc></w:tr><w:tr><w:trPr><w:trHeight w:val="315"/></w:trPr><w:tc><w:tcPr><w:tcW w:w="7225" w:type="dxa"/><w:tcBorders><w:top w:val="single" w:sz="4" w:space="0" w:color="auto"/><w:left w:val="single" w:sz="4" w:space="0" w:color="auto"/><w:bottom w:val="single" w:sz="4" w:space="0" w:color="auto"/><w:right w:val="single" w:sz="4" w:space="0" w:color="auto"/></w:tcBorders><w:noWrap/><w:vAlign w:val="bottom"/></w:tcPr><w:p><w:pPr><w:pStyle w:val="Ttulo2"/><w:jc w:val="center"/><w:rPr><w:rFonts w:eastAsia="Times New Roman"/><w:b/><w:bCs/><w:color w:val="auto"/><w:sz w:val="24"/><w:szCs w:val="24"/><w:lang w:eastAsia="pt-BR"/></w:rPr></w:pPr><w:r><w:rPr><w:rFonts w:eastAsia="Times New Roman"/><w:b/><w:bCs/><w:color w:val="auto"/><w:sz w:val="24"/><w:szCs w:val="24"/><w:lang w:eastAsia="pt-BR"/></w:rPr><w:t>Manômetro</w:t></w:r></w:p></w:tc><w:tc><w:tcPr><w:tcW w:w="2425" w:type="dxa"/><w:tcBorders><w:top w:val="single" w:sz="4" w:space="0" w:color="auto"/><w:left w:val="nil"/><w:bottom w:val="single" w:sz="4" w:space="0" w:color="auto"/><w:right w:val="single" w:sz="4" w:space="0" w:color="auto"/></w:tcBorders><w:noWrap/><w:vAlign w:val="bottom"/><w:hideMark/></w:tcPr><w:p><w:pPr><w:pStyle w:val="Ttulo2"/><w:jc w:val="center"/><w:rPr><w:rFonts w:eastAsia="Times New Roman"/><w:color w:val="1F3864"/><w:sz w:val="24"/><w:szCs w:val="24"/><w:lang w:eastAsia="pt-BR"/></w:rPr></w:pPr><w:r><w:rPr><w:rFonts w:eastAsia="Times New Roman"/><w:color w:val="1F3864"/><w:sz w:val="24"/><w:szCs w:val="24"/><w:lang w:eastAsia="pt-BR"/></w:rPr><w:t>N/A</w:t></w:r></w:p></w:tc></w:tr><w:tr><w:trPr><w:trHeight w:val="315"/></w:trPr><w:tc><w:tcPr><w:tcW w:w="7225" w:type="dxa"/><w:tcBorders><w:top w:val="single" w:sz="4" w:space="0" w:color="auto"/><w:left w:val="single" w:sz="4" w:space="0" w:color="auto"/><w:bottom w:val="single" w:sz="4" w:space="0" w:color="auto"/><w:right w:val="single" w:sz="4" w:space="0" w:color="auto"/></w:tcBorders><w:noWrap/><w:vAlign w:val="bottom"/></w:tcPr><w:p><w:pPr><w:pStyle w:val="Ttulo2"/><w:jc w:val="center"/><w:rPr><w:rFonts w:eastAsia="Times New Roman"/><w:b/><w:bCs/><w:color w:val="auto"/><w:lang w:eastAsia="pt-BR"/></w:rPr></w:pPr><w:r><w:rPr><w:rFonts w:eastAsia="Times New Roman"/><w:b/><w:bCs/><w:color w:val="auto"/><w:lang w:eastAsia="pt-BR"/></w:rPr><w:t>Tubulações</w:t></w:r></w:p></w:tc><w:tc><w:tcPr><w:tcW w:w="2425" w:type="dxa"/><w:tcBorders><w:top w:val="single" w:sz="4" w:space="0" w:color="auto"/><w:left w:val="nil"/><w:bottom w:val="single" w:sz="4" w:space="0" w:color="auto"/><w:right w:val="single" w:sz="4" w:space="0" w:color="auto"/></w:tcBorders><w:noWrap/><w:vAlign w:val="center"/><w:hideMark/></w:tcPr><w:p><w:pPr><w:pStyle w:val="Ttulo2"/><w:jc w:val="center"/><w:rPr><w:rFonts w:eastAsia="Times New Roman"/><w:color w:val="FF0000"/><w:lang w:eastAsia="pt-BR"/></w:rPr></w:pPr><w:r><w:rPr><w:rFonts w:eastAsia="Times New Roman"/><w:color w:val="1F3864"/><w:sz w:val="24"/><w:szCs w:val="24"/><w:lang w:eastAsia="pt-BR"/></w:rPr><w:t>APROVADO</w:t></w:r></w:p></w:tc></w:tr><w:tr><w:trPr><w:trHeight w:val="315"/></w:trPr><w:tc><w:tcPr><w:tcW w:w="7225" w:type="dxa"/><w:tcBorders><w:top w:val="single" w:sz="4" w:space="0" w:color="auto"/><w:left w:val="single" w:sz="4" w:space="0" w:color="auto"/><w:bottom w:val="single" w:sz="4" w:space="0" w:color="auto"/><w:right w:val="single" w:sz="4" w:space="0" w:color="auto"/></w:tcBorders><w:noWrap/><w:vAlign w:val="bottom"/></w:tcPr><w:p><w:pPr><w:pStyle w:val="Ttulo2"/><w:jc w:val="center"/><w:rPr><w:rFonts w:eastAsia="Times New Roman"/><w:b/><w:bCs/><w:color w:val="auto"/><w:sz w:val="24"/><w:szCs w:val="24"/><w:lang w:eastAsia="pt-BR"/></w:rPr></w:pPr><w:r><w:rPr><w:rFonts w:eastAsia="Times New Roman"/><w:b/><w:bCs/><w:color w:val="auto"/><w:sz w:val="24"/><w:szCs w:val="24"/><w:lang w:eastAsia="pt-BR"/></w:rPr><w:t>Estrutura Externa Visual</w:t></w:r></w:p></w:tc><w:tc><w:tcPr><w:tcW w:w="2425" w:type="dxa"/><w:tcBorders><w:top w:val="single" w:sz="4" w:space="0" w:color="auto"/><w:left w:val="nil"/><w:bottom w:val="single" w:sz="4" w:space="0" w:color="auto"/><w:right w:val="single" w:sz="4" w:space="0" w:color="auto"/></w:tcBorders><w:noWrap/><w:vAlign w:val="bottom"/><w:hideMark/></w:tcPr><w:p><w:pPr><w:pStyle w:val="Ttulo2"/><w:jc w:val="center"/><w:rPr><w:rFonts w:eastAsia="Times New Roman"/><w:color w:val="FF0000"/><w:sz w:val="24"/><w:szCs w:val="24"/><w:lang w:eastAsia="pt-BR"/></w:rPr></w:pPr><w:r><w:rPr><w:rFonts w:eastAsia="Times New Roman"/><w:color w:val="1F3864"/><w:sz w:val="24"/><w:szCs w:val="24"/><w:lang w:eastAsia="pt-BR"/></w:rPr><w:t>APROVADO</w:t></w:r></w:p></w:tc></w:tr></w:tbl><w:p><w:pPr><w:spacing w:line="240" w:lineRule="auto"/><w:rPr><w:rFonts w:ascii="Arial MT" w:hAnsi="Arial MT"/><w:lang w:eastAsia="pt-BR"/></w:rPr></w:pPr></w:p><w:tbl><w:tblPr><w:tblStyle w:val="Tabelacomgrade"/><w:tblpPr w:leftFromText="141" w:rightFromText="141" w:vertAnchor="text" w:horzAnchor="margin" w:tblpXSpec="center" w:tblpY="-31"/><w:tblW w:w="9727" w:type="dxa"/><w:shd w:val="clear" w:color="auto" w:fill="FFFF00"/><w:tblLook w:val="04A0" w:firstRow="1" w:lastRow="0" w:firstColumn="1" w:lastColumn="0" w:noHBand="0" w:noVBand="1"/></w:tblPr><w:tblGrid><w:gridCol w:w="9727"/></w:tblGrid><w:tr><w:trPr><w:trHeight w:val="469"/></w:trPr><w:tc><w:tcPr><w:tcW w:w="9727" w:type="dxa"/><w:tcBorders><w:top w:val="single" w:sz="4" w:space="0" w:color="1B407E"/><w:left w:val="single" w:sz="4" w:space="0" w:color="1B407E"/><w:bottom w:val="single" w:sz="4" w:space="0" w:color="1B407E"/><w:right w:val="single" w:sz="4" w:space="0" w:color="1B407E"/></w:tcBorders><w:shd w:val="clear" w:color="auto" w:fill="1B407E"/><w:vAlign w:val="center"/></w:tcPr><w:p><w:pPr><w:rPr><w:rFonts w:ascii="Times New Roman" w:hAnsi="Times New Roman" w:cs="Times New Roman"/><w:b/><w:sz w:val="24"/><w:szCs w:val="24"/></w:rPr></w:pPr><w:r><w:rPr><w:rFonts w:ascii="Times New Roman" w:hAnsi="Times New Roman" w:cs="Times New Roman"/><w:b/><w:color w:val="FFFFFF" w:themeColor="background1"/><w:sz w:val="24"/><w:szCs w:val="24"/></w:rPr><w:t>3 – NORMAS DE REFERÊNCIA</w:t></w:r></w:p></w:tc></w:tr></w:tbl><w:p><w:pPr><w:spacing w:after="0" w:line="240" w:lineRule="auto"/><w:rPr><w:rFonts w:ascii="Arial MT" w:hAnsi="Arial MT"/><w:lang w:eastAsia="pt-BR"/></w:rPr></w:pPr><w:r><w:rPr><w:rFonts w:ascii="Arial MT" w:hAnsi="Arial MT"/><w:lang w:eastAsia="pt-BR"/></w:rPr><w:t xml:space="preserve"> </w:t></w:r></w:p><w:p><w:pPr><w:spacing w:after="0" w:line="240" w:lineRule="auto"/><w:rPr><w:rFonts w:ascii="Arial MT" w:hAnsi="Arial MT"/><w:lang w:eastAsia="pt-BR"/></w:rPr></w:pPr><w:r><w:rPr><w:rFonts w:ascii="Arial MT" w:hAnsi="Arial MT"/><w:lang w:eastAsia="pt-BR"/></w:rPr><w:t xml:space="preserve">ITCO ACC </w:t></w:r><w:r><w:rPr><w:rFonts w:ascii="Arial MT" w:hAnsi="Arial MT"/><w:lang w:eastAsia="pt-BR"/></w:rPr><w:t>MANUAL</w:t></w:r><w:r><w:rPr><w:rFonts w:ascii="Arial MT" w:hAnsi="Arial MT"/><w:lang w:eastAsia="pt-BR"/></w:rPr><w:t xml:space="preserve"> (2017)</w:t></w:r></w:p><w:p><w:pPr><w:spacing w:after="0" w:line="240" w:lineRule="auto"/><w:rPr><w:rFonts w:ascii="Arial MT" w:hAnsi="Arial MT"/><w:lang w:eastAsia="pt-BR"/></w:rPr></w:pPr><w:r><w:rPr><w:rFonts w:ascii="Arial MT" w:hAnsi="Arial MT"/><w:lang w:eastAsia="pt-BR"/></w:rPr><w:t>RESOLUÇÃO Nº 5.998, DE 3 DE NOVEMBRO DE 2022</w:t></w:r></w:p><w:p><w:pPr><w:spacing w:after="120" w:line="240" w:lineRule="auto"/><w:rPr><w:rFonts w:ascii="Arial MT" w:hAnsi="Arial MT"/></w:rPr></w:pPr></w:p><w:tbl><w:tblPr><w:tblStyle w:val="Tabelacomgrade"/><w:tblW w:w="9594" w:type="dxa"/><w:tblInd w:w="-289" w:type="dxa"/><w:shd w:val="clear" w:color="auto" w:fill="FFFF00"/><w:tblLook w:val="04A0" w:firstRow="1" w:lastRow="0" w:firstColumn="1" w:lastColumn="0" w:noHBand="0" w:noVBand="1"/></w:tblPr><w:tblGrid><w:gridCol w:w="9594"/></w:tblGrid><w:tr><w:trPr><w:trHeight w:val="403"/></w:trPr><w:tc><w:tcPr><w:tcW w:w="9594" w:type="dxa"/><w:tcBorders><w:top w:val="single" w:sz="4" w:space="0" w:color="1B407E"/><w:left w:val="single" w:sz="4" w:space="0" w:color="1B407E"/><w:bottom w:val="single" w:sz="4" w:space="0" w:color="1B407E"/><w:right w:val="single" w:sz="4" w:space="0" w:color="1B407E"/></w:tcBorders><w:shd w:val="clear" w:color="auto" w:fill="1B407E"/><w:vAlign w:val="center"/></w:tcPr><w:p><w:pPr><w:rPr><w:rFonts w:ascii="Times New Roman" w:hAnsi="Times New Roman" w:cs="Times New Roman"/><w:b/><w:sz w:val="24"/><w:szCs w:val="24"/></w:rPr></w:pPr><w:r><w:rPr><w:rFonts w:ascii="Times New Roman" w:hAnsi="Times New Roman" w:cs="Times New Roman"/><w:b/><w:color w:val="FFFFFF" w:themeColor="background1"/><w:sz w:val="24"/><w:szCs w:val="24"/></w:rPr><w:t>4 – REGISTRO FOTOGRÁFICOS</w:t></w:r></w:p></w:tc></w:tr></w:tbl><w:p><w:pPr><w:spacing w:before="240" w:after="60"/><w:jc w:val="both"/><w:rPr><w:rFonts w:ascii="Times New Roman" w:hAnsi="Times New Roman" w:cs="Times New Roman"/></w:rPr></w:pPr><w:r><w:rPr><w:noProof/></w:rPr><w:drawing><wp:anchor distT="0" distB="0" distL="114300" distR="114300" simplePos="0" relativeHeight="251792896" behindDoc="1" locked="0" layoutInCell="1" allowOverlap="1" wp14:anchorId="0C5FAAD5" wp14:editId="565EC285"><wp:simplePos x="0" y="0"/><wp:positionH relativeFrom="column"><wp:posOffset>215265</wp:posOffset></wp:positionH><wp:positionV relativeFrom="paragraph"><wp:posOffset>98425</wp:posOffset></wp:positionV><wp:extent cx="2167890" cy="1959610"/><wp:effectExtent l="0" t="0" r="3810" b="2540"/><wp:wrapTight wrapText="bothSides"><wp:wrapPolygon edited="0"><wp:start x="0" y="0"/><wp:lineTo x="0" y="21418"/><wp:lineTo x="21448" y="21418"/><wp:lineTo x="21448" y="0"/><wp:lineTo x="0" y="0"/></wp:wrapPolygon></wp:wrapTight><wp:docPr id="1016530794" name="Imagem 1" descr="Caminhão de lixo&#xA;&#xA;O conteúdo gerado por IA pode estar incorreto."/><wp:cNvGraphicFramePr><a:graphicFrameLocks xmlns:a="http://schemas.openxmlformats.org/drawingml/2006/main" noChangeAspect="1"/></wp:cNvGraphicFramePr><a:graphic xmlns:a="http://schemas.openxmlformats.org/drawingml/2006/main"><a:graphicData uri="http://schemas.openxmlformats.org/drawingml/2006/picture"><pic:pic xmlns:pic="http://schemas.openxmlformats.org/drawingml/2006/picture"><pic:nvPicPr><pic:cNvPr id="1016530794" name="Imagem 1" descr="Caminhão de lixo&#xA;&#xA;O conteúdo gerado por IA pode estar incorreto."/><pic:cNvPicPr/></pic:nvPicPr><pic:blipFill><a:blip r:embed="rId12"/><a:stretch><a:fillRect/></a:stretch></pic:blipFill><pic:spPr><a:xfrm><a:off x="0" y="0"/><a:ext cx="2167890" cy="1959610"/></a:xfrm><a:prstGeom prst="rect"><a:avLst/></a:prstGeom></pic:spPr></pic:pic></a:graphicData></a:graphic><wp14:sizeRelH relativeFrom="margin"><wp14:pctWidth>0</wp14:pctWidth></wp14:sizeRelH><wp14:sizeRelV relativeFrom="margin"><wp14:pctHeight>0</wp14:pctHeight></wp14:sizeRelV></wp:anchor></w:drawing></w:r><w:r><w:rPr><w:noProof/></w:rPr><w:drawing><wp:anchor distT="0" distB="0" distL="114300" distR="114300" simplePos="0" relativeHeight="251791872" behindDoc="1" locked="0" layoutInCell="1" allowOverlap="1" wp14:anchorId="454D9861" wp14:editId="7F75CB0D"><wp:simplePos x="0" y="0"/><wp:positionH relativeFrom="column"><wp:posOffset>3382010</wp:posOffset></wp:positionH><wp:positionV relativeFrom="paragraph"><wp:posOffset>93980</wp:posOffset></wp:positionV><wp:extent cx="2135505" cy="1959610"/><wp:effectExtent l="0" t="0" r="0" b="2540"/><wp:wrapTight wrapText="bothSides"><wp:wrapPolygon edited="0"><wp:start x="0" y="0"/><wp:lineTo x="0" y="21418"/><wp:lineTo x="21388" y="21418"/><wp:lineTo x="21388" y="0"/><wp:lineTo x="0" y="0"/></wp:wrapPolygon></wp:wrapTight><wp:docPr id="819311495" name="Imagem 1" descr="Placa branca com letras pretas&#xA;&#xA;O conteúdo gerado por IA pode estar incorreto."/><wp:cNvGraphicFramePr><a:graphicFrameLocks xmlns:a="http://schemas.openxmlformats.org/drawingml/2006/main" noChangeAspect="1"/></wp:cNvGraphicFramePr><a:graphic xmlns:a="http://schemas.openxmlformats.org/drawingml/2006/main"><a:graphicData uri="http://schemas.openxmlformats.org/drawingml/2006/picture"><pic:pic xmlns:pic="http://schemas.openxmlformats.org/drawingml/2006/picture"><pic:nvPicPr><pic:cNvPr id="819311495" name="Imagem 1" descr="Placa branca com letras pretas&#xA;&#xA;O conteúdo gerado por IA pode estar incorreto."/><pic:cNvPicPr/></pic:nvPicPr><pic:blipFill><a:blip r:embed="rId13"/><a:stretch><a:fillRect/></a:stretch></pic:blipFill><pic:spPr><a:xfrm><a:off x="0" y="0"/><a:ext cx="2135505" cy="1959610"/></a:xfrm><a:prstGeom prst="rect"><a:avLst/></a:prstGeom></pic:spPr></pic:pic></a:graphicData></a:graphic><wp14:sizeRelH relativeFrom="margin"><wp14:pctWidth>0</wp14:pctWidth></wp14:sizeRelH><wp14:sizeRelV relativeFrom="margin"><wp14:pctHeight>0</wp14:pctHeight></wp14:sizeRelV></wp:anchor></w:drawing></w:r><w:r><w:rPr><w:noProof/></w:rPr><w:t xml:space="preserve"> </w:t></w:r><w:r><w:rPr><w:noProof/></w:rPr><w:t xml:space="preserve"> </w:t></w:r><w:r><w:rPr><w:noProof/></w:rPr><w:t xml:space="preserve"> </w:t></w:r></w:p><w:p><w:pPr><w:spacing w:before="240" w:after="60"/><w:jc w:val="both"/><w:rPr><w:rFonts w:ascii="Times New Roman" w:hAnsi="Times New Roman" w:cs="Times New Roman"/></w:rPr></w:pPr></w:p><w:p><w:pPr><w:spacing w:before="240" w:after="60"/><w:jc w:val="both"/><w:rPr><w:rFonts w:ascii="Times New Roman" w:hAnsi="Times New Roman" w:cs="Times New Roman"/></w:rPr></w:pPr></w:p><w:p><w:pPr><w:spacing w:before="240" w:after="60"/><w:jc w:val="both"/><w:rPr><w:rFonts w:ascii="Times New Roman" w:hAnsi="Times New Roman" w:cs="Times New Roman"/></w:rPr></w:pPr></w:p><w:p><w:pPr><w:spacing w:before="240" w:after="60"/><w:jc w:val="both"/><w:rPr><w:rFonts w:ascii="Times New Roman" w:hAnsi="Times New Roman" w:cs="Times New Roman"/></w:rPr></w:pPr></w:p><w:p><w:pPr><w:spacing w:before="240" w:after="60"/><w:jc w:val="both"/><w:rPr><w:rFonts w:ascii="Times New Roman" w:hAnsi="Times New Roman" w:cs="Times New Roman"/></w:rPr></w:pPr></w:p><w:p><w:pPr><w:spacing w:after="120"/><w:jc w:val="both"/><w:rPr><w:rFonts w:ascii="Times New Roman" w:hAnsi="Times New Roman" w:cs="Times New Roman"/></w:rPr></w:pPr><w:r><w:rPr><w:rFonts w:ascii="Times New Roman" w:hAnsi="Times New Roman" w:cs="Times New Roman"/><w:color w:val="FF0000"/></w:rPr><w:t xml:space="preserve">                      </w:t></w:r><w:r><w:rPr><w:rFonts w:ascii="Times New Roman" w:hAnsi="Times New Roman" w:cs="Times New Roman"/><w:color w:val="FF0000"/></w:rPr><w:t xml:space="preserve"> </w:t></w:r><w:r><w:rPr><w:rFonts w:ascii="Times New Roman" w:hAnsi="Times New Roman" w:cs="Times New Roman"/><w:color w:val="FF0000"/></w:rPr><w:t xml:space="preserve">   </w:t></w:r><w:r><w:rPr><w:rFonts w:ascii="Times New Roman" w:hAnsi="Times New Roman" w:cs="Times New Roman"/></w:rPr><w:t>FOTO FRONTAL</w:t></w:r><w:r><w:rPr><w:rFonts w:ascii="Times New Roman" w:hAnsi="Times New Roman" w:cs="Times New Roman"/></w:rPr><w:t xml:space="preserve">                                                        </w:t></w:r><w:r><w:rPr><w:rFonts w:ascii="Times New Roman" w:hAnsi="Times New Roman" w:cs="Times New Roman"/></w:rPr><w:t xml:space="preserve"> </w:t></w:r><w:r><w:rPr><w:rFonts w:ascii="Times New Roman" w:hAnsi="Times New Roman" w:cs="Times New Roman"/></w:rPr><w:t xml:space="preserve"> FOTO</w:t></w:r><w:r><w:rPr><w:rFonts w:ascii="Times New Roman" w:hAnsi="Times New Roman" w:cs="Times New Roman"/></w:rPr><w:t xml:space="preserve"> TRASEIR</w:t></w:r><w:r><w:rPr><w:rFonts w:ascii="Times New Roman" w:hAnsi="Times New Roman" w:cs="Times New Roman"/></w:rPr><w:t>A</w:t></w:r></w:p><w:p><w:pPr><w:spacing w:after="120"/><w:jc w:val="both"/><w:rPr><w:rFonts w:ascii="Times New Roman" w:hAnsi="Times New Roman" w:cs="Times New Roman"/></w:rPr></w:pPr><w:r><w:rPr><w:rFonts w:ascii="Times New Roman" w:hAnsi="Times New Roman" w:cs="Times New Roman"/><w:noProof/></w:rPr><w:drawing><wp:anchor distT="0" distB="0" distL="114300" distR="114300" simplePos="0" relativeHeight="251794944" behindDoc="1" locked="0" layoutInCell="1" allowOverlap="1" wp14:anchorId="1B58DE0E" wp14:editId="275946DC"><wp:simplePos x="0" y="0"/><wp:positionH relativeFrom="column"><wp:posOffset>2943225</wp:posOffset></wp:positionH><wp:positionV relativeFrom="paragraph"><wp:posOffset>302895</wp:posOffset></wp:positionV><wp:extent cx="2739390" cy="1823720"/><wp:effectExtent l="0" t="0" r="3810" b="5080"/><wp:wrapTight wrapText="bothSides"><wp:wrapPolygon edited="0"><wp:start x="0" y="0"/><wp:lineTo x="0" y="21435"/><wp:lineTo x="21480" y="21435"/><wp:lineTo x="21480" y="0"/><wp:lineTo x="0" y="0"/></wp:wrapPolygon></wp:wrapTight><wp:docPr id="580316957" name="Imagem 1" descr="Trem de passageiros parado na rua&#xA;&#xA;O conteúdo gerado por IA pode estar incorreto."/><wp:cNvGraphicFramePr><a:graphicFrameLocks xmlns:a="http://schemas.openxmlformats.org/drawingml/2006/main" noChangeAspect="1"/></wp:cNvGraphicFramePr><a:graphic xmlns:a="http://schemas.openxmlformats.org/drawingml/2006/main"><a:graphicData uri="http://schemas.openxmlformats.org/drawingml/2006/picture"><pic:pic xmlns:pic="http://schemas.openxmlformats.org/drawingml/2006/picture"><pic:nvPicPr><pic:cNvPr id="580316957" name="Imagem 1" descr="Trem de passageiros parado na rua&#xA;&#xA;O conteúdo gerado por IA pode estar incorreto."/><pic:cNvPicPr/></pic:nvPicPr><pic:blipFill><a:blip r:embed="rId14"/><a:stretch><a:fillRect/></a:stretch></pic:blipFill><pic:spPr><a:xfrm><a:off x="0" y="0"/><a:ext cx="2739390" cy="1823720"/></a:xfrm><a:prstGeom prst="rect"><a:avLst/></a:prstGeom></pic:spPr></pic:pic></a:graphicData></a:graphic><wp14:sizeRelH relativeFrom="margin"><wp14:pctWidth>0</wp14:pctWidth></wp14:sizeRelH><wp14:sizeRelV relativeFrom="margin"><wp14:pctHeight>0</wp14:pctHeight></wp14:sizeRelV></wp:anchor></w:drawing></w:r><w:r><w:rPr><w:rFonts w:ascii="Times New Roman" w:hAnsi="Times New Roman" w:cs="Times New Roman"/><w:noProof/></w:rPr><w:drawing><wp:anchor distT="0" distB="0" distL="114300" distR="114300" simplePos="0" relativeHeight="251793920" behindDoc="1" locked="0" layoutInCell="1" allowOverlap="1" wp14:anchorId="77111F2F" wp14:editId="5B00245D"><wp:simplePos x="0" y="0"/><wp:positionH relativeFrom="column"><wp:posOffset>-63500</wp:posOffset></wp:positionH><wp:positionV relativeFrom="paragraph"><wp:posOffset>229870</wp:posOffset></wp:positionV><wp:extent cx="2654935" cy="1897380"/><wp:effectExtent l="0" t="0" r="0" b="7620"/><wp:wrapTight wrapText="bothSides"><wp:wrapPolygon edited="0"><wp:start x="0" y="0"/><wp:lineTo x="0" y="21470"/><wp:lineTo x="21388" y="21470"/><wp:lineTo x="21388" y="0"/><wp:lineTo x="0" y="0"/></wp:wrapPolygon></wp:wrapTight><wp:docPr id="570088845" name="Imagem 1" descr="Ônibus de transporte público&#xA;&#xA;O conteúdo gerado por IA pode estar incorreto."/><wp:cNvGraphicFramePr><a:graphicFrameLocks xmlns:a="http://schemas.openxmlformats.org/drawingml/2006/main" noChangeAspect="1"/></wp:cNvGraphicFramePr><a:graphic xmlns:a="http://schemas.openxmlformats.org/drawingml/2006/main"><a:graphicData uri="http://schemas.openxmlformats.org/drawingml/2006/picture"><pic:pic xmlns:pic="http://schemas.openxmlformats.org/drawingml/2006/picture"><pic:nvPicPr><pic:cNvPr id="570088845" name="Imagem 1" descr="Ônibus de transporte público&#xA;&#xA;O conteúdo gerado por IA pode estar incorreto."/><pic:cNvPicPr/></pic:nvPicPr><pic:blipFill><a:blip r:embed="rId15"/><a:stretch><a:fillRect/></a:stretch></pic:blipFill><pic:spPr><a:xfrm><a:off x="0" y="0"/><a:ext cx="2654935" cy="1897380"/></a:xfrm><a:prstGeom prst="rect"><a:avLst/></a:prstGeom></pic:spPr></pic:pic></a:graphicData></a:graphic><wp14:sizeRelH relativeFrom="margin"><wp14:pctWidth>0</wp14:pctWidth></wp14:sizeRelH><wp14:sizeRelV relativeFrom="margin"><wp14:pctHeight>0</wp14:pctHeight></wp14:sizeRelV></wp:anchor></w:drawing></w:r></w:p><w:p><w:pPr><w:spacing w:after="0"/><w:ind w:left="708" w:firstLine="708"/></w:pPr><w:r><w:t xml:space="preserve">FOTO LATERAL         </w:t></w:r><w:r><w:t xml:space="preserve">                                                        </w:t></w:r><w:r><w:t xml:space="preserve">    </w:t></w:r><w:r><w:t xml:space="preserve"> </w:t></w:r><w:r><w:t xml:space="preserve">FOTO </w:t></w:r><w:r><w:t>LATERAL</w:t></w:r><w:r><w:t xml:space="preserve">                   </w:t></w:r></w:p><w:p><w:pPr><w:spacing w:after="0"/><w:ind w:left="708" w:firstLine="708"/></w:pPr><w:r><w:rPr><w:noProof/></w:rPr><w:lastRenderedPageBreak/><w:drawing><wp:anchor distT="0" distB="0" distL="114300" distR="114300" simplePos="0" relativeHeight="251764224" behindDoc="1" locked="0" layoutInCell="1" allowOverlap="1" wp14:anchorId="2BE3D14A" wp14:editId="3ECA2BDD"><wp:simplePos x="0" y="0"/><wp:positionH relativeFrom="column"><wp:posOffset>469265</wp:posOffset></wp:positionH><wp:positionV relativeFrom="paragraph"><wp:posOffset>1270</wp:posOffset></wp:positionV><wp:extent cx="1887220" cy="2362200"/><wp:effectExtent l="0" t="0" r="0" b="0"/><wp:wrapTight wrapText="bothSides"><wp:wrapPolygon edited="0"><wp:start x="0" y="0"/><wp:lineTo x="0" y="21426"/><wp:lineTo x="21367" y="21426"/><wp:lineTo x="21367" y="0"/><wp:lineTo x="0" y="0"/></wp:wrapPolygon></wp:wrapTight><wp:docPr id="1431023822" name="Imagem 1" descr="Mala de viagem&#xA;&#xA;O conteúdo gerado por IA pode estar incorreto."/><wp:cNvGraphicFramePr><a:graphicFrameLocks xmlns:a="http://schemas.openxmlformats.org/drawingml/2006/main" noChangeAspect="1"/></wp:cNvGraphicFramePr><a:graphic xmlns:a="http://schemas.openxmlformats.org/drawingml/2006/main"><a:graphicData uri="http://schemas.openxmlformats.org/drawingml/2006/picture"><pic:pic xmlns:pic="http://schemas.openxmlformats.org/drawingml/2006/picture"><pic:nvPicPr><pic:cNvPr id="1431023822" name="Imagem 1" descr="Mala de viagem&#xA;&#xA;O conteúdo gerado por IA pode estar incorreto."/><pic:cNvPicPr/></pic:nvPicPr><pic:blipFill><a:blip r:embed="rId16"/><a:stretch><a:fillRect/></a:stretch></pic:blipFill><pic:spPr><a:xfrm><a:off x="0" y="0"/><a:ext cx="1887220" cy="2362200"/></a:xfrm><a:prstGeom prst="rect"><a:avLst/></a:prstGeom></pic:spPr></pic:pic></a:graphicData></a:graphic><wp14:sizeRelH relativeFrom="margin"><wp14:pctWidth>0</wp14:pctWidth></wp14:sizeRelH><wp14:sizeRelV relativeFrom="margin"><wp14:pctHeight>0</wp14:pctHeight></wp14:sizeRelV></wp:anchor></w:drawing></w:r><w:r><w:rPr><w:noProof/></w:rPr><w:drawing><wp:anchor distT="0" distB="0" distL="114300" distR="114300" simplePos="0" relativeHeight="251799040" behindDoc="1" locked="0" layoutInCell="1" allowOverlap="1" wp14:anchorId="0075BB80" wp14:editId="179F5E39"><wp:simplePos x="0" y="0"/><wp:positionH relativeFrom="column"><wp:posOffset>3388995</wp:posOffset></wp:positionH><wp:positionV relativeFrom="paragraph"><wp:posOffset>1270</wp:posOffset></wp:positionV><wp:extent cx="1923415" cy="2361565"/><wp:effectExtent l="0" t="0" r="635" b="635"/><wp:wrapTight wrapText="bothSides"><wp:wrapPolygon edited="0"><wp:start x="0" y="0"/><wp:lineTo x="0" y="21432"/><wp:lineTo x="21393" y="21432"/><wp:lineTo x="21393" y="0"/><wp:lineTo x="0" y="0"/></wp:wrapPolygon></wp:wrapTight><wp:docPr id="529903417" name="Imagem 1" descr="Relógio de ponteiros&#xA;&#xA;O conteúdo gerado por IA pode estar incorreto."/><wp:cNvGraphicFramePr><a:graphicFrameLocks xmlns:a="http://schemas.openxmlformats.org/drawingml/2006/main" noChangeAspect="1"/></wp:cNvGraphicFramePr><a:graphic xmlns:a="http://schemas.openxmlformats.org/drawingml/2006/main"><a:graphicData uri="http://schemas.openxmlformats.org/drawingml/2006/picture"><pic:pic xmlns:pic="http://schemas.openxmlformats.org/drawingml/2006/picture"><pic:nvPicPr><pic:cNvPr id="529903417" name="Imagem 1" descr="Relógio de ponteiros&#xA;&#xA;O conteúdo gerado por IA pode estar incorreto."/><pic:cNvPicPr/></pic:nvPicPr><pic:blipFill><a:blip r:embed="rId17"/><a:stretch><a:fillRect/></a:stretch></pic:blipFill><pic:spPr><a:xfrm><a:off x="0" y="0"/><a:ext cx="1923415" cy="2361565"/></a:xfrm><a:prstGeom prst="rect"><a:avLst/></a:prstGeom></pic:spPr></pic:pic></a:graphicData></a:graphic><wp14:sizeRelH relativeFrom="margin"><wp14:pctWidth>0</wp14:pctWidth></wp14:sizeRelH><wp14:sizeRelV relativeFrom="margin"><wp14:pctHeight>0</wp14:pctHeight></wp14:sizeRelV></wp:anchor></w:drawing></w:r><w:r><w:rPr><w:noProof/></w:rPr><w:t xml:space="preserve"> </w:t></w:r></w:p><w:p><w:pPr><w:spacing w:after="0"/><w:ind w:left="708" w:firstLine="708"/></w:pPr></w:p><w:p><w:pPr><w:spacing w:after="0"/><w:ind w:left="708" w:firstLine="708"/></w:pPr></w:p><w:p><w:pPr><w:spacing w:after="0"/><w:ind w:left="708" w:firstLine="708"/></w:pPr></w:p><w:p><w:pPr><w:spacing w:after="0"/><w:ind w:left="708" w:firstLine="708"/></w:pPr></w:p><w:p><w:pPr><w:spacing w:after="0"/><w:ind w:left="708" w:firstLine="708"/></w:pPr></w:p><w:p><w:pPr><w:spacing w:after="0"/><w:ind w:left="708" w:firstLine="708"/></w:pPr></w:p><w:p><w:pPr><w:spacing w:after="0"/><w:ind w:left="708" w:firstLine="708"/></w:pPr></w:p><w:p><w:pPr><w:spacing w:after="0"/><w:ind w:left="708" w:firstLine="708"/></w:pPr></w:p><w:p><w:pPr><w:spacing w:after="0"/><w:ind w:left="708" w:firstLine="708"/></w:pPr></w:p><w:p><w:pPr><w:spacing w:after="0"/><w:ind w:left="708" w:firstLine="708"/></w:pPr></w:p><w:p><w:pPr><w:spacing w:after="0"/><w:ind w:left="708" w:firstLine="708"/></w:pPr></w:p><w:p><w:pPr><w:spacing w:after="120"/><w:ind w:left="708" w:firstLine="708"/></w:pPr><w:r><w:t>FOTO SUPERIOR</w:t></w:r><w:r><w:t xml:space="preserve">                                  </w:t></w:r><w:r><w:t xml:space="preserve">                         </w:t></w:r><w:r><w:t xml:space="preserve">  </w:t></w:r><w:r><w:t>FOTO TERMÔMETRO</w:t></w:r></w:p><w:p><w:pPr><w:spacing w:after="0"/></w:pPr></w:p><w:p><w:pPr><w:spacing w:after="0"/></w:pPr><w:r><w:rPr><w:noProof/></w:rPr><w:drawing><wp:anchor distT="0" distB="0" distL="114300" distR="114300" simplePos="0" relativeHeight="251795968" behindDoc="1" locked="0" layoutInCell="1" allowOverlap="1" wp14:anchorId="60DF2FAC" wp14:editId="19BEACA1"><wp:simplePos x="0" y="0"/><wp:positionH relativeFrom="column"><wp:posOffset>404495</wp:posOffset></wp:positionH><wp:positionV relativeFrom="paragraph"><wp:posOffset>10160</wp:posOffset></wp:positionV><wp:extent cx="1952625" cy="2106295"/><wp:effectExtent l="0" t="0" r="9525" b="8255"/><wp:wrapTight wrapText="bothSides"><wp:wrapPolygon edited="0"><wp:start x="0" y="0"/><wp:lineTo x="0" y="21489"/><wp:lineTo x="21495" y="21489"/><wp:lineTo x="21495" y="0"/><wp:lineTo x="0" y="0"/></wp:wrapPolygon></wp:wrapTight><wp:docPr id="1042597827" name="Imagem 1" descr="Uma imagem contendo no interior, metal, aberto, sujo&#xA;&#xA;O conteúdo gerado por IA pode estar incorreto."/><wp:cNvGraphicFramePr><a:graphicFrameLocks xmlns:a="http://schemas.openxmlformats.org/drawingml/2006/main" noChangeAspect="1"/></wp:cNvGraphicFramePr><a:graphic xmlns:a="http://schemas.openxmlformats.org/drawingml/2006/main"><a:graphicData uri="http://schemas.openxmlformats.org/drawingml/2006/picture"><pic:pic xmlns:pic="http://schemas.openxmlformats.org/drawingml/2006/picture"><pic:nvPicPr><pic:cNvPr id="1042597827" name="Imagem 1" descr="Uma imagem contendo no interior, metal, aberto, sujo&#xA;&#xA;O conteúdo gerado por IA pode estar incorreto."/><pic:cNvPicPr/></pic:nvPicPr><pic:blipFill><a:blip r:embed="rId18"/><a:stretch><a:fillRect/></a:stretch></pic:blipFill><pic:spPr><a:xfrm><a:off x="0" y="0"/><a:ext cx="1952625" cy="2106295"/></a:xfrm><a:prstGeom prst="rect"><a:avLst/></a:prstGeom></pic:spPr></pic:pic></a:graphicData></a:graphic><wp14:sizeRelH relativeFrom="margin"><wp14:pctWidth>0</wp14:pctWidth></wp14:sizeRelH><wp14:sizeRelV relativeFrom="margin"><wp14:pctHeight>0</wp14:pctHeight></wp14:sizeRelV></wp:anchor></w:drawing></w:r><w:r><w:rPr><w:noProof/></w:rPr><w:drawing><wp:anchor distT="0" distB="0" distL="114300" distR="114300" simplePos="0" relativeHeight="251796992" behindDoc="1" locked="0" layoutInCell="1" allowOverlap="1" wp14:anchorId="639FA87D" wp14:editId="4BE81B10"><wp:simplePos x="0" y="0"/><wp:positionH relativeFrom="column"><wp:posOffset>3388995</wp:posOffset></wp:positionH><wp:positionV relativeFrom="paragraph"><wp:posOffset>10160</wp:posOffset></wp:positionV><wp:extent cx="1988820" cy="2105660"/><wp:effectExtent l="0" t="0" r="0" b="8890"/><wp:wrapTight wrapText="bothSides"><wp:wrapPolygon edited="0"><wp:start x="0" y="0"/><wp:lineTo x="0" y="21496"/><wp:lineTo x="21310" y="21496"/><wp:lineTo x="21310" y="0"/><wp:lineTo x="0" y="0"/></wp:wrapPolygon></wp:wrapTight><wp:docPr id="2059827774" name="Imagem 1" descr="Uma imagem contendo no interior, armário, forno, cozinha&#xA;&#xA;O conteúdo gerado por IA pode estar incorreto."/><wp:cNvGraphicFramePr><a:graphicFrameLocks xmlns:a="http://schemas.openxmlformats.org/drawingml/2006/main" noChangeAspect="1"/></wp:cNvGraphicFramePr><a:graphic xmlns:a="http://schemas.openxmlformats.org/drawingml/2006/main"><a:graphicData uri="http://schemas.openxmlformats.org/drawingml/2006/picture"><pic:pic xmlns:pic="http://schemas.openxmlformats.org/drawingml/2006/picture"><pic:nvPicPr><pic:cNvPr id="2059827774" name="Imagem 1" descr="Uma imagem contendo no interior, armário, forno, cozinha&#xA;&#xA;O conteúdo gerado por IA pode estar incorreto."/><pic:cNvPicPr/></pic:nvPicPr><pic:blipFill><a:blip r:embed="rId19"/><a:stretch><a:fillRect/></a:stretch></pic:blipFill><pic:spPr><a:xfrm><a:off x="0" y="0"/><a:ext cx="1988820" cy="2105660"/></a:xfrm><a:prstGeom prst="rect"><a:avLst/></a:prstGeom></pic:spPr></pic:pic></a:graphicData></a:graphic><wp14:sizeRelH relativeFrom="margin"><wp14:pctWidth>0</wp14:pctWidth></wp14:sizeRelH><wp14:sizeRelV relativeFrom="margin"><wp14:pctHeight>0</wp14:pctHeight></wp14:sizeRelV></wp:anchor></w:drawing></w:r></w:p><w:p><w:pPr><w:spacing w:after="0"/></w:pPr></w:p><w:p><w:pPr><w:spacing w:after="0"/></w:pPr></w:p><w:p><w:pPr><w:spacing w:after="0"/></w:pPr></w:p><w:p><w:pPr><w:spacing w:after="0"/></w:pPr></w:p><w:p><w:pPr><w:spacing w:after="0"/></w:pPr></w:p><w:p><w:pPr><w:spacing w:after="0"/></w:pPr></w:p><w:p><w:pPr><w:spacing w:after="0"/></w:pPr></w:p><w:p><w:pPr><w:spacing w:after="0"/></w:pPr></w:p><w:p><w:pPr><w:spacing w:after="0"/></w:pPr><w:r><w:t xml:space="preserve">                </w:t></w:r></w:p><w:p><w:pPr><w:spacing w:after="0"/></w:pPr><w:r><w:t xml:space="preserve">            </w:t></w:r></w:p><w:p><w:pPr><w:spacing w:after="0"/></w:pPr><w:r><w:t xml:space="preserve">              </w:t></w:r><w:r><w:t xml:space="preserve"> </w:t></w:r><w:r><w:t xml:space="preserve">   </w:t></w:r><w:r><w:t xml:space="preserve">FOTO TAMPA BOCA DE VISITA                                            </w:t></w:r><w:r><w:t>FOTO VÁLVULA</w:t></w:r><w:r><w:t xml:space="preserve"> </w:t></w:r><w:r><w:t>DE ALÍVIO</w:t></w:r></w:p><w:p><w:pPr><w:spacing w:after="0"/></w:pPr></w:p><w:p><w:pPr><w:spacing w:after="0"/></w:pPr><w:r><w:rPr><w:noProof/></w:rPr><w:drawing><wp:anchor distT="0" distB="0" distL="114300" distR="114300" simplePos="0" relativeHeight="251800064" behindDoc="1" locked="0" layoutInCell="1" allowOverlap="1" wp14:anchorId="2C725EBF" wp14:editId="43DEB47A"><wp:simplePos x="0" y="0"/><wp:positionH relativeFrom="column"><wp:posOffset>3714902</wp:posOffset></wp:positionH><wp:positionV relativeFrom="paragraph"><wp:posOffset>174625</wp:posOffset></wp:positionV><wp:extent cx="1422400" cy="2375535"/><wp:effectExtent l="0" t="0" r="6350" b="5715"/><wp:wrapTight wrapText="bothSides"><wp:wrapPolygon edited="0"><wp:start x="0" y="0"/><wp:lineTo x="0" y="21479"/><wp:lineTo x="21407" y="21479"/><wp:lineTo x="21407" y="0"/><wp:lineTo x="0" y="0"/></wp:wrapPolygon></wp:wrapTight><wp:docPr id="1030755027" name="Imagem 1" descr="Uma imagem contendo no interior, metal, cozinha, porta&#xA;&#xA;O conteúdo gerado por IA pode estar incorreto."/><wp:cNvGraphicFramePr><a:graphicFrameLocks xmlns:a="http://schemas.openxmlformats.org/drawingml/2006/main" noChangeAspect="1"/></wp:cNvGraphicFramePr><a:graphic xmlns:a="http://schemas.openxmlformats.org/drawingml/2006/main"><a:graphicData uri="http://schemas.openxmlformats.org/drawingml/2006/picture"><pic:pic xmlns:pic="http://schemas.openxmlformats.org/drawingml/2006/picture"><pic:nvPicPr><pic:cNvPr id="1030755027" name="Imagem 1" descr="Uma imagem contendo no interior, metal, cozinha, porta&#xA;&#xA;O conteúdo gerado por IA pode estar incorreto."/><pic:cNvPicPr/></pic:nvPicPr><pic:blipFill><a:blip r:embed="rId20"/><a:stretch><a:fillRect/></a:stretch></pic:blipFill><pic:spPr><a:xfrm><a:off x="0" y="0"/><a:ext cx="1422400" cy="2375535"/></a:xfrm><a:prstGeom prst="rect"><a:avLst/></a:prstGeom></pic:spPr></pic:pic></a:graphicData></a:graphic><wp14:sizeRelH relativeFrom="margin"><wp14:pctWidth>0</wp14:pctWidth></wp14:sizeRelH><wp14:sizeRelV relativeFrom="margin"><wp14:pctHeight>0</wp14:pctHeight></wp14:sizeRelV></wp:anchor></w:drawing></w:r></w:p><w:p><w:pPr><w:spacing w:after="0"/></w:pPr><w:r><w:rPr><w:noProof/></w:rPr><w:drawing><wp:anchor distT="0" distB="0" distL="114300" distR="114300" simplePos="0" relativeHeight="251798016" behindDoc="1" locked="0" layoutInCell="1" allowOverlap="1" wp14:anchorId="0F7F318D" wp14:editId="7D8F3240"><wp:simplePos x="0" y="0"/><wp:positionH relativeFrom="column"><wp:posOffset>404495</wp:posOffset></wp:positionH><wp:positionV relativeFrom="paragraph"><wp:posOffset>29845</wp:posOffset></wp:positionV><wp:extent cx="2054860" cy="2282190"/><wp:effectExtent l="0" t="0" r="2540" b="3810"/><wp:wrapTight wrapText="bothSides"><wp:wrapPolygon edited="0"><wp:start x="0" y="0"/><wp:lineTo x="0" y="21456"/><wp:lineTo x="21426" y="21456"/><wp:lineTo x="21426" y="0"/><wp:lineTo x="0" y="0"/></wp:wrapPolygon></wp:wrapTight><wp:docPr id="833255731" name="Imagem 1" descr="Uma imagem contendo ao ar livre, moto, velho, estacionado&#xA;&#xA;O conteúdo gerado por IA pode estar incorreto."/><wp:cNvGraphicFramePr><a:graphicFrameLocks xmlns:a="http://schemas.openxmlformats.org/drawingml/2006/main" noChangeAspect="1"/></wp:cNvGraphicFramePr><a:graphic xmlns:a="http://schemas.openxmlformats.org/drawingml/2006/main"><a:graphicData uri="http://schemas.openxmlformats.org/drawingml/2006/picture"><pic:pic xmlns:pic="http://schemas.openxmlformats.org/drawingml/2006/picture"><pic:nvPicPr><pic:cNvPr id="833255731" name="Imagem 1" descr="Uma imagem contendo ao ar livre, moto, velho, estacionado&#xA;&#xA;O conteúdo gerado por IA pode estar incorreto."/><pic:cNvPicPr/></pic:nvPicPr><pic:blipFill><a:blip r:embed="rId21"/><a:stretch><a:fillRect/></a:stretch></pic:blipFill><pic:spPr><a:xfrm><a:off x="0" y="0"/><a:ext cx="2054860" cy="2282190"/></a:xfrm><a:prstGeom prst="rect"><a:avLst/></a:prstGeom></pic:spPr></pic:pic></a:graphicData></a:graphic><wp14:sizeRelH relativeFrom="margin"><wp14:pctWidth>0</wp14:pctWidth></wp14:sizeRelH></wp:anchor></w:drawing></w:r><w:r><w:rPr><w:noProof/></w:rPr><w:t xml:space="preserve"> </w:t></w:r></w:p><w:p><w:pPr><w:spacing w:after="0"/></w:pPr></w:p><w:p><w:pPr><w:spacing w:after="0"/></w:pPr></w:p><w:p><w:pPr><w:spacing w:after="0"/></w:pPr></w:p><w:p><w:pPr><w:spacing w:after="0"/></w:pPr></w:p><w:p><w:pPr><w:spacing w:after="0"/></w:pPr></w:p><w:p><w:pPr><w:spacing w:after="0"/></w:pPr></w:p><w:p><w:pPr><w:spacing w:after="0"/></w:pPr></w:p><w:p><w:pPr><w:spacing w:after="0"/></w:pPr></w:p><w:p><w:pPr><w:spacing w:after="0"/></w:pPr><w:r><w:t xml:space="preserve">     </w:t></w:r></w:p><w:p><w:pPr><w:spacing w:after="0"/></w:pPr></w:p><w:p><w:pPr><w:spacing w:after="0"/></w:pPr><w:r><w:t xml:space="preserve">    </w:t></w:r></w:p><w:p><w:pPr><w:spacing w:after="0"/></w:pPr><w:r><w:t xml:space="preserve">      </w:t></w:r><w:r><w:t xml:space="preserve">    </w:t></w:r><w:r><w:t>FOTO VÁLVULA INFERIOR DE DESCARGA</w:t></w:r><w:r><w:t xml:space="preserve">                                   </w:t></w:r><w:r><w:t>PLACA DE IDENTIFICAÇÃO</w:t></w:r></w:p><w:p><w:pPr><w:spacing w:after="0"/></w:pPr></w:p><w:p><w:pPr><w:spacing w:after="0"/></w:pPr></w:p><w:p><w:pPr><w:spacing w:after="0"/></w:pPr></w:p><w:tbl><w:tblPr><w:tblStyle w:val="Tabelacomgrade"/><w:tblpPr w:leftFromText="141" w:rightFromText="141" w:vertAnchor="text" w:horzAnchor="margin" w:tblpXSpec="center" w:tblpY="91"/><w:tblW w:w="9764" w:type="dxa"/><w:shd w:val="clear" w:color="auto" w:fill="FFFF00"/><w:tblLook w:val="04A0" w:firstRow="1" w:lastRow="0" w:firstColumn="1" w:lastColumn="0" w:noHBand="0" w:noVBand="1"/></w:tblPr><w:tblGrid><w:gridCol w:w="9764"/></w:tblGrid><w:tr><w:trPr><w:trHeight w:val="403"/></w:trPr><w:tc><w:tcPr><w:tcW w:w="9764" w:type="dxa"/><w:tcBorders><w:top w:val="single" w:sz="4" w:space="0" w:color="1B407E"/><w:left w:val="single" w:sz="4" w:space="0" w:color="1B407E"/><w:bottom w:val="single" w:sz="4" w:space="0" w:color="1B407E"/><w:right w:val="single" w:sz="4" w:space="0" w:color="1B407E"/></w:tcBorders><w:shd w:val="clear" w:color="auto" w:fill="1B407E"/><w:vAlign w:val="center"/></w:tcPr><w:p><w:pPr><w:rPr><w:rFonts w:ascii="Times New Roman" w:hAnsi="Times New Roman" w:cs="Times New Roman"/><w:b/><w:sz w:val="24"/><w:szCs w:val="24"/></w:rPr></w:pPr><w:r><w:rPr><w:rFonts w:ascii="Times New Roman" w:hAnsi="Times New Roman" w:cs="Times New Roman"/><w:b/><w:color w:val="FFFFFF" w:themeColor="background1"/><w:sz w:val="24"/><w:szCs w:val="24"/></w:rPr><w:lastRenderedPageBreak/><w:t>5 - CONCLUSÃO</w:t></w:r></w:p></w:tc></w:tr></w:tbl><w:p><w:pPr><w:spacing w:before="120" w:after="0"/><w:jc w:val="both"/><w:rPr><w:rFonts w:ascii="Times New Roman" w:hAnsi="Times New Roman" w:cs="Times New Roman"/><w:b/><w:bCs/></w:rPr></w:pPr><w:r><w:rPr><w:rFonts w:ascii="Times New Roman" w:hAnsi="Times New Roman" w:cs="Times New Roman"/><w:b/><w:bCs/></w:rPr><w:t>{conclusao}</w:t></w:r></w:p><w:tbl><w:tblPr><w:tblStyle w:val="Tabelacomgrade"/><w:tblpPr w:leftFromText="141" w:rightFromText="141" w:vertAnchor="text" w:horzAnchor="margin" w:tblpXSpec="center" w:tblpY="91"/><w:tblW w:w="9764" w:type="dxa"/><w:shd w:val="clear" w:color="auto" w:fill="FFFF00"/><w:tblLook w:val="04A0" w:firstRow="1" w:lastRow="0" w:firstColumn="1" w:lastColumn="0" w:noHBand="0" w:noVBand="1"/></w:tblPr><w:tblGrid><w:gridCol w:w="9764"/></w:tblGrid><w:tr><w:trPr><w:trHeight w:val="403"/></w:trPr><w:tc><w:tcPr><w:tcW w:w="9764" w:type="dxa"/><w:tcBorders><w:top w:val="single" w:sz="4" w:space="0" w:color="1B407E"/><w:left w:val="single" w:sz="4" w:space="0" w:color="1B407E"/><w:bottom w:val="single" w:sz="4" w:space="0" w:color="1B407E"/><w:right w:val="single" w:sz="4" w:space="0" w:color="1B407E"/></w:tcBorders><w:shd w:val="clear" w:color="auto" w:fill="1B407E"/><w:vAlign w:val="center"/></w:tcPr><w:p><w:pPr><w:rPr><w:rFonts w:ascii="Times New Roman" w:hAnsi="Times New Roman" w:cs="Times New Roman"/><w:b/><w:sz w:val="24"/><w:szCs w:val="24"/></w:rPr></w:pPr><w:r><w:rPr><w:rFonts w:ascii="Times New Roman" w:hAnsi="Times New Roman" w:cs="Times New Roman"/><w:b/><w:color w:val="FFFFFF" w:themeColor="background1"/><w:sz w:val="24"/><w:szCs w:val="24"/></w:rPr><w:t>6 - RECOMENDAÇÃO</w:t></w:r></w:p></w:tc></w:tr></w:tbl><w:p><w:pPr><w:spacing w:before="120"/><w:ind w:right="-111"/><w:jc w:val="both"/><w:rPr><w:rFonts w:ascii="Times New Roman" w:hAnsi="Times New Roman" w:cs="Times New Roman"/></w:rPr></w:pPr><w:r><w:rPr><w:rFonts w:ascii="Times New Roman" w:hAnsi="Times New Roman" w:cs="Times New Roman"/></w:rPr><w:t>{recomendacao}</w:t></w:r></w:p><w:p><w:pPr><w:ind w:right="-111"/><w:jc w:val="both"/><w:rPr><w:rFonts w:ascii="Times New Roman" w:hAnsi="Times New Roman" w:cs="Times New Roman"/></w:rPr></w:pPr><w:r><w:rPr><w:rFonts w:ascii="Times New Roman" w:hAnsi="Times New Roman" w:cs="Times New Roman"/></w:rPr><w:t></w:t></w:r></w:p><w:p><w:pPr><w:ind w:right="-111"/><w:jc w:val="both"/><w:rPr><w:rFonts w:ascii="Times New Roman" w:hAnsi="Times New Roman" w:cs="Times New Roman"/></w:rPr></w:pPr></w:p><w:p><w:pPr><w:ind w:right="-111"/><w:jc w:val="both"/><w:rPr><w:rFonts w:ascii="Times New Roman" w:hAnsi="Times New Roman" w:cs="Times New Roman"/></w:rPr></w:pPr></w:p><w:p><w:pPr><w:spacing w:after="20"/><w:ind w:right="6"/><w:rPr><w:rFonts w:cstheme="minorHAnsi"/><w:b/><w:bCs/><w:i/><w:iCs/><w:szCs w:val="24"/></w:rPr></w:pPr><w:r><w:rPr><w:rFonts w:ascii="Arial" w:hAnsi="Arial" w:cs="Arial"/><w:noProof/></w:rPr><w:drawing><wp:anchor distT="0" distB="0" distL="114300" distR="114300" simplePos="0" relativeHeight="251744256" behindDoc="1" locked="0" layoutInCell="1" allowOverlap="1" wp14:anchorId="61D5230F" wp14:editId="5C694AAA"><wp:simplePos x="0" y="0"/><wp:positionH relativeFrom="column"><wp:posOffset>624840</wp:posOffset></wp:positionH><wp:positionV relativeFrom="paragraph"><wp:posOffset>212725</wp:posOffset></wp:positionV><wp:extent cx="701040" cy="537210"/><wp:effectExtent l="0" t="0" r="3810" b="0"/><wp:wrapTight wrapText="bothSides"><wp:wrapPolygon edited="0"><wp:start x="0" y="0"/><wp:lineTo x="0" y="20681"/><wp:lineTo x="21130" y="20681"/><wp:lineTo x="21130" y="0"/><wp:lineTo x="0" y="0"/></wp:wrapPolygon></wp:wrapTight><wp:docPr id="1312009626" name="Imagem 1"/><wp:cNvGraphicFramePr><a:graphicFrameLocks xmlns:a="http://schemas.openxmlformats.org/drawingml/2006/main" noChangeAspect="1"/></wp:cNvGraphicFramePr><a:graphic xmlns:a="http://schemas.openxmlformats.org/drawingml/2006/main"><a:graphicData uri="http://schemas.openxmlformats.org/drawingml/2006/picture"><pic:pic xmlns:pic="http://schemas.openxmlformats.org/drawingml/2006/picture"><pic:nvPicPr><pic:cNvPr id="1312009626" name=""/><pic:cNvPicPr/></pic:nvPicPr><pic:blipFill><a:blip r:embed="rId22"/><a:stretch><a:fillRect/></a:stretch></pic:blipFill><pic:spPr><a:xfrm><a:off x="0" y="0"/><a:ext cx="701040" cy="537210"/></a:xfrm><a:prstGeom prst="rect"><a:avLst/></a:prstGeom></pic:spPr></pic:pic></a:graphicData></a:graphic><wp14:sizeRelH relativeFrom="margin"><wp14:pctWidth>0</wp14:pctWidth></wp14:sizeRelH><wp14:sizeRelV relativeFrom="margin"><wp14:pctHeight>0</wp14:pctHeight></wp14:sizeRelV></wp:anchor></w:drawing></w:r></w:p><w:p><w:pPr><w:spacing w:after="20"/><w:ind w:right="6"/><w:rPr><w:rFonts w:ascii="Arial" w:hAnsi="Arial" w:cs="Arial"/></w:rPr></w:pPr></w:p><w:p><w:pPr><w:spacing w:after="20"/><w:ind w:right="6"/><w:rPr><w:rFonts w:ascii="Arial" w:hAnsi="Arial" w:cs="Arial"/></w:rPr></w:pPr></w:p><w:p><w:pPr><w:spacing w:after="20"/><w:ind w:left="60" w:right="6"/><w:rPr><w:rFonts w:ascii="Arial" w:hAnsi="Arial" w:cs="Arial"/></w:rPr></w:pPr></w:p><w:p><w:pPr><w:spacing w:after="20"/><w:ind w:left="60" w:right="6"/><w:rPr><w:rFonts w:ascii="Arial" w:hAnsi="Arial" w:cs="Arial"/></w:rPr></w:pPr><w:r><w:rPr><w:rFonts w:ascii="Arial" w:hAnsi="Arial" w:cs="Arial"/></w:rPr><w:t xml:space="preserve">  </w:t></w:r><w:r><w:rPr><w:rFonts w:ascii="Arial" w:hAnsi="Arial" w:cs="Arial"/></w:rPr><w:t xml:space="preserve">  </w:t></w:r><w:r><w:rPr><w:rFonts w:ascii="Arial" w:hAnsi="Arial" w:cs="Arial"/></w:rPr><w:t xml:space="preserve">Responsável pela Inspeção                       </w:t></w:r><w:r><w:rPr><w:rFonts w:ascii="Arial" w:hAnsi="Arial" w:cs="Arial"/></w:rPr><w:t xml:space="preserve">                 Engenheiro</w:t></w:r><w:r><w:rPr><w:rFonts w:ascii="Arial" w:hAnsi="Arial" w:cs="Arial"/></w:rPr><w:t xml:space="preserve"> </w:t></w:r><w:r><w:rPr><w:rFonts w:ascii="Arial" w:hAnsi="Arial" w:cs="Arial"/></w:rPr><w:t>Responsá</w:t></w:r><w:r><w:rPr><w:rFonts w:ascii="Arial" w:hAnsi="Arial" w:cs="Arial"/></w:rPr><w:t>vel</w:t></w:r></w:p><w:p><w:pPr><w:spacing w:after="0"/><w:rPr><w:rFonts w:ascii="Arial" w:hAnsi="Arial" w:cs="Arial"/></w:rPr></w:pPr><w:r><w:rPr><w:rFonts w:ascii="Arial" w:hAnsi="Arial" w:cs="Arial"/></w:rPr><w:t xml:space="preserve">      </w:t></w:r><w:r><w:rPr><w:rFonts w:ascii="Arial" w:hAnsi="Arial" w:cs="Arial"/></w:rPr><w:t xml:space="preserve">          Elton Vie</w:t></w:r><w:r><w:rPr><w:rFonts w:ascii="Arial" w:hAnsi="Arial" w:cs="Arial"/></w:rPr><w:t>i</w:t></w:r><w:r><w:rPr><w:rFonts w:ascii="Arial" w:hAnsi="Arial" w:cs="Arial"/></w:rPr><w:t>ra</w:t></w:r><w:r><w:rPr><w:rFonts w:ascii="Arial" w:hAnsi="Arial" w:cs="Arial"/></w:rPr><w:t xml:space="preserve">                                              </w:t></w:r><w:r><w:rPr><w:rFonts w:ascii="Arial" w:hAnsi="Arial" w:cs="Arial"/></w:rPr><w:t xml:space="preserve">        </w:t></w:r><w:r><w:rPr><w:rFonts w:ascii="Arial" w:hAnsi="Arial" w:cs="Arial"/></w:rPr><w:t xml:space="preserve"> Diego Aparecido de Lima </w:t></w:r></w:p><w:p><w:pPr><w:rPr><w:rFonts w:ascii="Arial" w:hAnsi="Arial" w:cs="Arial"/><w:b/><w:bCs/></w:rPr></w:pPr><w:r><w:rPr><w:rFonts w:ascii="Arial" w:hAnsi="Arial" w:cs="Arial"/></w:rPr><w:t xml:space="preserve"> </w:t></w:r><w:r><w:rPr><w:rFonts w:ascii="Arial" w:hAnsi="Arial" w:cs="Arial"/></w:rPr><w:t xml:space="preserve">  </w:t></w:r><w:r><w:rPr><w:rFonts w:ascii="Arial" w:hAnsi="Arial" w:cs="Arial"/></w:rPr><w:t xml:space="preserve"> </w:t></w:r><w:r><w:rPr><w:rFonts w:ascii="Arial" w:hAnsi="Arial" w:cs="Arial"/></w:rPr><w:t>Encarregado Operacional</w:t></w:r><w:r><w:rPr><w:rFonts w:ascii="Arial" w:hAnsi="Arial" w:cs="Arial"/></w:rPr><w:t xml:space="preserve">          </w:t></w:r><w:r><w:rPr><w:rFonts w:ascii="Arial" w:hAnsi="Arial" w:cs="Arial"/></w:rPr><w:t xml:space="preserve">       </w:t></w:r><w:r><w:rPr><w:rFonts w:ascii="Arial" w:hAnsi="Arial" w:cs="Arial"/></w:rPr><w:t xml:space="preserve">      </w:t></w:r><w:r><w:rPr><w:rFonts w:ascii="Arial" w:hAnsi="Arial" w:cs="Arial"/></w:rPr><w:t xml:space="preserve"> </w:t></w:r><w:r><w:rPr><w:rFonts w:ascii="Arial" w:hAnsi="Arial" w:cs="Arial"/></w:rPr><w:t xml:space="preserve">  </w:t></w:r><w:r><w:rPr><w:rFonts w:ascii="Arial" w:hAnsi="Arial" w:cs="Arial"/></w:rPr><w:t xml:space="preserve"> </w:t></w:r><w:r><w:rPr><w:rFonts w:ascii="Arial" w:hAnsi="Arial" w:cs="Arial"/></w:rPr><w:t>Engenheiro Mecânico</w:t></w:r><w:r><w:rPr><w:rFonts w:ascii="Arial" w:hAnsi="Arial" w:cs="Arial"/></w:rPr><w:t xml:space="preserve"> – </w:t></w:r><w:r><w:rPr><w:rFonts w:ascii="Arial" w:hAnsi="Arial" w:cs="Arial"/><w:b/><w:bCs/></w:rPr><w:t>CREA:506.927.6941-S</w:t></w:r></w:p><w:p><w:pPr><w:rPr><w:rFonts w:ascii="Arial" w:hAnsi="Arial" w:cs="Arial"/></w:rPr></w:pPr></w:p><w:p><w:pPr><w:ind w:right="-111"/><w:rPr><w:rFonts w:ascii="Times New Roman" w:hAnsi="Times New Roman" w:cs="Times New Roman"/></w:rPr></w:pPr><w:r><w:rPr><w:rFonts w:ascii="Times New Roman" w:hAnsi="Times New Roman" w:cs="Times New Roman"/></w:rPr><w:t xml:space="preserve">                                                  </w:t></w:r><w:r><w:rPr><w:rFonts w:ascii="Times New Roman" w:hAnsi="Times New Roman" w:cs="Times New Roman"/></w:rPr><w:t xml:space="preserve">Cubatão, </w:t></w:r><w:r><w:rPr><w:rFonts w:ascii="Times New Roman" w:hAnsi="Times New Roman" w:cs="Times New Roman"/></w:rPr><w:t>1</w:t></w:r><w:r><w:rPr><w:rFonts w:ascii="Times New Roman" w:hAnsi="Times New Roman" w:cs="Times New Roman"/></w:rPr><w:t>7</w:t></w:r><w:r><w:rPr><w:rFonts w:ascii="Times New Roman" w:hAnsi="Times New Roman" w:cs="Times New Roman"/></w:rPr><w:t xml:space="preserve"> de </w:t></w:r><w:r><w:rPr><w:rFonts w:ascii="Times New Roman" w:hAnsi="Times New Roman" w:cs="Times New Roman"/></w:rPr><w:t>Março</w:t></w:r><w:r><w:rPr><w:rFonts w:ascii="Times New Roman" w:hAnsi="Times New Roman" w:cs="Times New Roman"/></w:rPr><w:t xml:space="preserve"> </w:t></w:r><w:r><w:rPr><w:rFonts w:ascii="Times New Roman" w:hAnsi="Times New Roman" w:cs="Times New Roman"/></w:rPr><w:t>de 202</w:t></w:r><w:bookmarkEnd w:id="2"/><w:r><w:rPr><w:rFonts w:ascii="Times New Roman" w:hAnsi="Times New Roman" w:cs="Times New Roman"/></w:rPr><w:t>6</w:t></w:r></w:p><w:sectPr><w:headerReference w:type="default" r:id="rId25"/><w:footerReference w:type="default" r:id="rId26"/><w:headerReference w:type="first" r:id="rId27"/><w:pgSz w:w="11906" w:h="16838"/><w:pgMar w:top="156" w:right="1133" w:bottom="1134" w:left="1701" w:header="397" w:footer="283" w:gutter="0"/><w:pgNumType w:start="0"/><w:cols w:space="708"/><w:titlePg/><w:docGrid w:linePitch="360"/></w:sectPr></w:body></w:document>
 </file>
 
 <file path=word/endnotes.xml><?xml version="1.0" encoding="utf-8"?>

</xml_diff>

<commit_message>
Rodapé do laudo: encarregado via req.user, tag engenheiro_nome e crea_info
- buildTemplateData passa a receber req.user.nome com fallback cfg.encarregado
- Pós-processamento XML usa templateData.encarregado_nome ao substituir Elton Vieira
- template.docx: parágrafo com {engenheiro_nome} entre inspetor e {crea_info}

Made-with: Cursor
</commit_message>
<xml_diff>
--- a/template/template.docx
+++ b/template/template.docx
@@ -8833,6 +8833,20 @@
           <w:rFonts w:ascii="Arial" w:hAnsi="Arial" w:cs="Arial"/>
         </w:rPr>
         <w:t xml:space="preserve"/>
+      </w:r>
+    </w:p>
+    <w:p>
+      <w:pPr>
+        <w:spacing w:after="0"/>
+        <w:rPr>
+          <w:rFonts w:ascii="Arial" w:hAnsi="Arial" w:cs="Arial"/>
+        </w:rPr>
+      </w:pPr>
+      <w:r>
+        <w:rPr>
+          <w:rFonts w:ascii="Arial" w:hAnsi="Arial" w:cs="Arial"/>
+        </w:rPr>
+        <w:t xml:space="preserve">{engenheiro_nome}</w:t>
       </w:r>
     </w:p>
     <w:p>

</xml_diff>

<commit_message>
fix: correct page numbering with NUMPAGES field, add image13.png, analyze layout
</commit_message>
<xml_diff>
--- a/template/template.docx
+++ b/template/template.docx
@@ -9320,13 +9320,16 @@
               <w:t xml:space="preserve"> de </w:t>
             </w:r>
             <w:r>
-              <w:rPr>
-                <w:b/>
-                <w:bCs/>
-                <w:sz w:val="18"/>
-                <w:szCs w:val="18"/>
-              </w:rPr>
+              <w:fldChar w:fldCharType="begin"/>
+            </w:r>
+            <w:r>
+              <w:instrText> NUMPAGES </w:instrText>
+            </w:r>
+            <w:r>
               <w:t>5</w:t>
+            </w:r>
+            <w:r>
+              <w:fldChar w:fldCharType="end"/>
             </w:r>
           </w:p>
         </w:sdtContent>

</xml_diff>

<commit_message>
fix(template): logo CEINSPEC no header e IDENTIFICAÇÃO sem quebra
- Restaura word/media/image13.png a partir do backup (arquivo corrompido ~189B)
- Insere WORD JOINER entre Ã e O em IDENTIFICAÇÃO (2 ocorrências no document.xml)
- Script scripts/fix_template_logo_identificacao.py para repetir a correção com lxml/zip

Made-with: Cursor
</commit_message>
<xml_diff>
--- a/template/template.docx
+++ b/template/template.docx
@@ -305,7 +305,7 @@
                 <w:sz w:val="32"/>
                 <w:szCs w:val="32"/>
               </w:rPr>
-              <w:t>IDENTIFICAÇÃO</w:t>
+              <w:t>IDENTIFICAÇÃ⁠O</w:t>
             </w:r>
           </w:p>
         </w:tc>
@@ -8263,7 +8263,7 @@
         <w:t xml:space="preserve">                                   </w:t>
       </w:r>
       <w:r>
-        <w:t>PLACA DE IDENTIFICAÇÃO</w:t>
+        <w:t>PLACA DE IDENTIFICAÇÃ⁠O</w:t>
       </w:r>
     </w:p>
     <w:p>

</xml_diff>

<commit_message>
fix(template): rodapé em duas colunas e NUMPAGES no footer
- document.xml: tabela 2 colunas (Responsável+inspetor | Engenheiro+nome+CREA)
- footer1.xml: fldChar separate no campo NUMPAGES (total de páginas)
- script fix_footer_two_column_and_numpages.py

Made-with: Cursor
</commit_message>
<xml_diff>
--- a/template/template.docx
+++ b/template/template.docx
@@ -8737,217 +8737,177 @@
         </w:rPr>
       </w:pPr>
     </w:p>
-    <w:p>
-      <w:pPr>
-        <w:spacing w:after="20"/>
-        <w:ind w:left="60" w:right="6"/>
-        <w:rPr>
-          <w:rFonts w:ascii="Arial" w:hAnsi="Arial" w:cs="Arial"/>
-        </w:rPr>
-      </w:pPr>
-      <w:r>
-        <w:rPr>
-          <w:rFonts w:ascii="Arial" w:hAnsi="Arial" w:cs="Arial"/>
-        </w:rPr>
-        <w:t xml:space="preserve">  </w:t>
-      </w:r>
-      <w:r>
-        <w:rPr>
-          <w:rFonts w:ascii="Arial" w:hAnsi="Arial" w:cs="Arial"/>
-        </w:rPr>
-        <w:t xml:space="preserve">  </w:t>
-      </w:r>
-      <w:r>
-        <w:rPr>
-          <w:rFonts w:ascii="Arial" w:hAnsi="Arial" w:cs="Arial"/>
-        </w:rPr>
-        <w:t xml:space="preserve">Responsável pela Inspeção                       </w:t>
-      </w:r>
-      <w:r>
-        <w:rPr>
-          <w:rFonts w:ascii="Arial" w:hAnsi="Arial" w:cs="Arial"/>
-        </w:rPr>
-        <w:t xml:space="preserve">                 Engenheiro</w:t>
-      </w:r>
-      <w:r>
-        <w:rPr>
-          <w:rFonts w:ascii="Arial" w:hAnsi="Arial" w:cs="Arial"/>
-        </w:rPr>
-        <w:t xml:space="preserve"> </w:t>
-      </w:r>
-      <w:r>
-        <w:rPr>
-          <w:rFonts w:ascii="Arial" w:hAnsi="Arial" w:cs="Arial"/>
-        </w:rPr>
-        <w:t>Responsá</w:t>
-      </w:r>
-      <w:r>
-        <w:rPr>
-          <w:rFonts w:ascii="Arial" w:hAnsi="Arial" w:cs="Arial"/>
-        </w:rPr>
-        <w:t>vel</w:t>
-      </w:r>
-    </w:p>
-    <w:p>
-      <w:pPr>
-        <w:spacing w:after="0"/>
-        <w:rPr>
-          <w:rFonts w:ascii="Arial" w:hAnsi="Arial" w:cs="Arial"/>
-        </w:rPr>
-      </w:pPr>
-      <w:r>
-        <w:rPr>
-          <w:rFonts w:ascii="Arial" w:hAnsi="Arial" w:cs="Arial"/>
-        </w:rPr>
-        <w:t xml:space="preserve">{encarregado_nome}</w:t>
-      </w:r>
-      <w:r>
-        <w:rPr>
-          <w:rFonts w:ascii="Arial" w:hAnsi="Arial" w:cs="Arial"/>
-        </w:rPr>
-        <w:t xml:space="preserve"/>
-      </w:r>
-      <w:r>
-        <w:rPr>
-          <w:rFonts w:ascii="Arial" w:hAnsi="Arial" w:cs="Arial"/>
-        </w:rPr>
-        <w:t/>
-      </w:r>
-      <w:r>
-        <w:rPr>
-          <w:rFonts w:ascii="Arial" w:hAnsi="Arial" w:cs="Arial"/>
-        </w:rPr>
-        <w:t/>
-      </w:r>
-      <w:r>
-        <w:rPr>
-          <w:rFonts w:ascii="Arial" w:hAnsi="Arial" w:cs="Arial"/>
-        </w:rPr>
-        <w:t xml:space="preserve"/>
-      </w:r>
-      <w:r>
-        <w:rPr>
-          <w:rFonts w:ascii="Arial" w:hAnsi="Arial" w:cs="Arial"/>
-        </w:rPr>
-        <w:t xml:space="preserve"/>
-      </w:r>
-      <w:r>
-        <w:rPr>
-          <w:rFonts w:ascii="Arial" w:hAnsi="Arial" w:cs="Arial"/>
-        </w:rPr>
-        <w:t xml:space="preserve"/>
-      </w:r>
-    </w:p>
-    <w:p>
-      <w:pPr>
-        <w:spacing w:after="0"/>
-        <w:rPr>
-          <w:rFonts w:ascii="Arial" w:hAnsi="Arial" w:cs="Arial"/>
-        </w:rPr>
-      </w:pPr>
-      <w:r>
-        <w:rPr>
-          <w:rFonts w:ascii="Arial" w:hAnsi="Arial" w:cs="Arial"/>
-        </w:rPr>
-        <w:t xml:space="preserve">{engenheiro_nome}</w:t>
-      </w:r>
-    </w:p>
-    <w:p>
-      <w:pPr>
-        <w:rPr>
-          <w:rFonts w:ascii="Arial" w:hAnsi="Arial" w:cs="Arial"/>
-          <w:b/>
-          <w:bCs/>
-        </w:rPr>
-      </w:pPr>
-      <w:r>
-        <w:rPr>
-          <w:rFonts w:ascii="Arial" w:hAnsi="Arial" w:cs="Arial"/>
-        </w:rPr>
-        <w:t xml:space="preserve">{crea_info}</w:t>
-      </w:r>
-      <w:r>
-        <w:rPr>
-          <w:rFonts w:ascii="Arial" w:hAnsi="Arial" w:cs="Arial"/>
-        </w:rPr>
-        <w:t xml:space="preserve"/>
-      </w:r>
-      <w:r>
-        <w:rPr>
-          <w:rFonts w:ascii="Arial" w:hAnsi="Arial" w:cs="Arial"/>
-        </w:rPr>
-        <w:t xml:space="preserve"/>
-      </w:r>
-      <w:r>
-        <w:rPr>
-          <w:rFonts w:ascii="Arial" w:hAnsi="Arial" w:cs="Arial"/>
-        </w:rPr>
-        <w:t/>
-      </w:r>
-      <w:r>
-        <w:rPr>
-          <w:rFonts w:ascii="Arial" w:hAnsi="Arial" w:cs="Arial"/>
-        </w:rPr>
-        <w:t xml:space="preserve"/>
-      </w:r>
-      <w:r>
-        <w:rPr>
-          <w:rFonts w:ascii="Arial" w:hAnsi="Arial" w:cs="Arial"/>
-        </w:rPr>
-        <w:t xml:space="preserve"/>
-      </w:r>
-      <w:r>
-        <w:rPr>
-          <w:rFonts w:ascii="Arial" w:hAnsi="Arial" w:cs="Arial"/>
-        </w:rPr>
-        <w:t xml:space="preserve"/>
-      </w:r>
-      <w:r>
-        <w:rPr>
-          <w:rFonts w:ascii="Arial" w:hAnsi="Arial" w:cs="Arial"/>
-        </w:rPr>
-        <w:t xml:space="preserve"/>
-      </w:r>
-      <w:r>
-        <w:rPr>
-          <w:rFonts w:ascii="Arial" w:hAnsi="Arial" w:cs="Arial"/>
-        </w:rPr>
-        <w:t xml:space="preserve"/>
-      </w:r>
-      <w:r>
-        <w:rPr>
-          <w:rFonts w:ascii="Arial" w:hAnsi="Arial" w:cs="Arial"/>
-        </w:rPr>
-        <w:t xml:space="preserve"/>
-      </w:r>
-      <w:r>
-        <w:rPr>
-          <w:rFonts w:ascii="Arial" w:hAnsi="Arial" w:cs="Arial"/>
-        </w:rPr>
-        <w:t/>
-      </w:r>
-      <w:r>
-        <w:rPr>
-          <w:rFonts w:ascii="Arial" w:hAnsi="Arial" w:cs="Arial"/>
-        </w:rPr>
-        <w:t xml:space="preserve"/>
-      </w:r>
-      <w:r>
-        <w:rPr>
-          <w:rFonts w:ascii="Arial" w:hAnsi="Arial" w:cs="Arial"/>
-          <w:b/>
-          <w:bCs/>
-        </w:rPr>
-        <w:t/>
-      </w:r>
-    </w:p>
-    <w:p>
-      <w:pPr>
-        <w:rPr>
-          <w:rFonts w:ascii="Arial" w:hAnsi="Arial" w:cs="Arial"/>
-        </w:rPr>
-      </w:pPr>
-    </w:p>
+    <w:tbl>
+      <w:tblPr>
+        <w:tblW w:w="10315" w:type="dxa"/>
+        <w:tblBorders>
+          <w:top w:val="none" w:sz="0" w:space="0" w:color="auto"/>
+          <w:left w:val="none" w:sz="0" w:space="0" w:color="auto"/>
+          <w:bottom w:val="none" w:sz="0" w:space="0" w:color="auto"/>
+          <w:right w:val="none" w:sz="0" w:space="0" w:color="auto"/>
+          <w:insideH w:val="none" w:sz="0" w:space="0" w:color="auto"/>
+          <w:insideV w:val="none" w:sz="0" w:space="0" w:color="auto"/>
+        </w:tblBorders>
+        <w:tblLook w:val="04A0" w:firstRow="1" w:lastRow="0" w:firstColumn="1" w:lastColumn="0" w:noHBand="0" w:noVBand="1"/>
+      </w:tblPr>
+      <w:tblGrid>
+        <w:gridCol w:w="5157"/>
+        <w:gridCol w:w="5158"/>
+      </w:tblGrid>
+      <w:tr>
+        <w:trPr>
+          <w:trHeight w:val="340"/>
+        </w:trPr>
+        <w:tc>
+          <w:tcPr>
+            <w:tcW w:w="5157" w:type="dxa"/>
+            <w:vAlign w:val="top"/>
+          </w:tcPr>
+          <w:p>
+            <w:pPr>
+              <w:spacing w:after="0"/>
+              <w:rPr>
+                <w:rFonts w:ascii="Arial" w:hAnsi="Arial" w:cs="Arial"/>
+              </w:rPr>
+            </w:pPr>
+            <w:r>
+              <w:rPr>
+                <w:rFonts w:ascii="Arial" w:hAnsi="Arial" w:cs="Arial"/>
+                <w:b/>
+                <w:bCs/>
+                <w:sz w:val="20"/>
+                <w:szCs w:val="20"/>
+              </w:rPr>
+              <w:t>Responsável pela Inspeção</w:t>
+            </w:r>
+          </w:p>
+        </w:tc>
+        <w:tc>
+          <w:tcPr>
+            <w:tcW w:w="5158" w:type="dxa"/>
+            <w:vAlign w:val="top"/>
+          </w:tcPr>
+          <w:p>
+            <w:pPr>
+              <w:spacing w:after="0"/>
+              <w:rPr>
+                <w:rFonts w:ascii="Arial" w:hAnsi="Arial" w:cs="Arial"/>
+              </w:rPr>
+            </w:pPr>
+            <w:r>
+              <w:rPr>
+                <w:rFonts w:ascii="Arial" w:hAnsi="Arial" w:cs="Arial"/>
+                <w:b/>
+                <w:bCs/>
+                <w:sz w:val="20"/>
+                <w:szCs w:val="20"/>
+              </w:rPr>
+              <w:t>Engenheiro Responsável</w:t>
+            </w:r>
+          </w:p>
+        </w:tc>
+      </w:tr>
+      <w:tr>
+        <w:trPr>
+          <w:trHeight w:val="400"/>
+        </w:trPr>
+        <w:tc>
+          <w:tcPr>
+            <w:tcW w:w="5157" w:type="dxa"/>
+            <w:vAlign w:val="top"/>
+          </w:tcPr>
+          <w:p>
+            <w:pPr>
+              <w:spacing w:after="0"/>
+              <w:rPr>
+                <w:rFonts w:ascii="Arial" w:hAnsi="Arial" w:cs="Arial"/>
+              </w:rPr>
+            </w:pPr>
+            <w:r>
+              <w:rPr>
+                <w:rFonts w:ascii="Arial" w:hAnsi="Arial" w:cs="Arial"/>
+                <w:sz w:val="20"/>
+                <w:szCs w:val="20"/>
+              </w:rPr>
+              <w:t>{encarregado_nome}</w:t>
+            </w:r>
+          </w:p>
+        </w:tc>
+        <w:tc>
+          <w:tcPr>
+            <w:tcW w:w="5158" w:type="dxa"/>
+            <w:vAlign w:val="top"/>
+          </w:tcPr>
+          <w:p>
+            <w:pPr>
+              <w:spacing w:after="0"/>
+              <w:rPr>
+                <w:rFonts w:ascii="Arial" w:hAnsi="Arial" w:cs="Arial"/>
+              </w:rPr>
+            </w:pPr>
+            <w:r>
+              <w:rPr>
+                <w:rFonts w:ascii="Arial" w:hAnsi="Arial" w:cs="Arial"/>
+                <w:sz w:val="20"/>
+                <w:szCs w:val="20"/>
+              </w:rPr>
+              <w:t>{engenheiro_nome}</w:t>
+            </w:r>
+          </w:p>
+        </w:tc>
+      </w:tr>
+      <w:tr>
+        <w:trPr>
+          <w:trHeight w:val="360"/>
+        </w:trPr>
+        <w:tc>
+          <w:tcPr>
+            <w:tcW w:w="5157" w:type="dxa"/>
+            <w:vAlign w:val="top"/>
+          </w:tcPr>
+          <w:p>
+            <w:pPr>
+              <w:spacing w:after="0"/>
+              <w:rPr>
+                <w:rFonts w:ascii="Arial" w:hAnsi="Arial" w:cs="Arial"/>
+              </w:rPr>
+            </w:pPr>
+            <w:r>
+              <w:rPr>
+                <w:rFonts w:ascii="Arial" w:hAnsi="Arial" w:cs="Arial"/>
+                <w:sz w:val="20"/>
+                <w:szCs w:val="20"/>
+              </w:rPr>
+              <w:t/>
+            </w:r>
+          </w:p>
+        </w:tc>
+        <w:tc>
+          <w:tcPr>
+            <w:tcW w:w="5158" w:type="dxa"/>
+            <w:vAlign w:val="top"/>
+          </w:tcPr>
+          <w:p>
+            <w:pPr>
+              <w:spacing w:after="0"/>
+              <w:rPr>
+                <w:rFonts w:ascii="Arial" w:hAnsi="Arial" w:cs="Arial"/>
+              </w:rPr>
+            </w:pPr>
+            <w:r>
+              <w:rPr>
+                <w:rFonts w:ascii="Arial" w:hAnsi="Arial" w:cs="Arial"/>
+                <w:b/>
+                <w:bCs/>
+                <w:sz w:val="20"/>
+                <w:szCs w:val="20"/>
+              </w:rPr>
+              <w:t>{crea_info}</w:t>
+            </w:r>
+          </w:p>
+        </w:tc>
+      </w:tr>
+    </w:tbl>
     <w:p>
       <w:pPr>
         <w:ind w:right="-111"/>
@@ -9327,7 +9287,10 @@
               <w:instrText> NUMPAGES </w:instrText>
             </w:r>
             <w:r>
-              <w:t>5</w:t>
+              <w:fldChar w:fldCharType="separate"/>
+            </w:r>
+            <w:r>
+              <w:t>1</w:t>
             </w:r>
             <w:r>
               <w:fldChar w:fldCharType="end"/>

</xml_diff>

<commit_message>
fix(template): add noWrap na capa para evitar quebra de IDENTIFICAÇÃO; remove U+2060 paliativo
fix(generate): injectSignature detecta PNG/JPEG por magic bytes, atualiza
rels e Content_Types para assinaturas inspetor/engenheiro (corrige quadrado
cinza quando JPEG era gravado em .png).

Made-with: Cursor
</commit_message>
<xml_diff>
--- a/template/template.docx
+++ b/template/template.docx
@@ -284,6 +284,7 @@
         <w:tc>
           <w:tcPr>
             <w:tcW w:w="2529" w:type="dxa"/>
+            <w:noWrap/>
             <w:vAlign w:val="center"/>
           </w:tcPr>
           <w:p>
@@ -305,7 +306,7 @@
                 <w:sz w:val="32"/>
                 <w:szCs w:val="32"/>
               </w:rPr>
-              <w:t>IDENTIFICAÇÃ⁠O</w:t>
+              <w:t>IDENTIFICAÇÃO</w:t>
             </w:r>
           </w:p>
         </w:tc>
@@ -409,6 +410,7 @@
         <w:tc>
           <w:tcPr>
             <w:tcW w:w="2529" w:type="dxa"/>
+            <w:noWrap/>
             <w:vAlign w:val="center"/>
           </w:tcPr>
           <w:p>
@@ -494,6 +496,7 @@
         <w:tc>
           <w:tcPr>
             <w:tcW w:w="2529" w:type="dxa"/>
+            <w:noWrap/>
             <w:vAlign w:val="center"/>
           </w:tcPr>
           <w:p>
@@ -609,6 +612,7 @@
         <w:tc>
           <w:tcPr>
             <w:tcW w:w="2529" w:type="dxa"/>
+            <w:noWrap/>
             <w:vAlign w:val="center"/>
           </w:tcPr>
           <w:p>
@@ -8263,7 +8267,7 @@
         <w:t xml:space="preserve">                                   </w:t>
       </w:r>
       <w:r>
-        <w:t>PLACA DE IDENTIFICAÇÃ⁠O</w:t>
+        <w:t>PLACA DE IDENTIFICAÇÃO</w:t>
       </w:r>
     </w:p>
     <w:p>

</xml_diff>